<commit_message>
Informe reescrito con tono casual/humano
</commit_message>
<xml_diff>
--- a/informe/informe_semana9_regresion_digemid.docx
+++ b/informe/informe_semana9_regresion_digemid.docx
@@ -68,9 +68,7 @@
           <w:b/>
           <w:sz w:val="24"/>
         </w:rPr>
-        <w:t>"APLICACION DE MODELOS DE REGRESION SOBRE PRECIOS</w:t>
-        <w:br/>
-        <w:t>DE MEDICAMENTOS EN ESTABLECIMIENTOS DE SALUD (DIGEMID)"</w:t>
+        <w:t>"APLICACION DE MODELOS DE REGRESION - PRECIOS DE MEDICAMENTOS DIGEMID"</w:t>
       </w:r>
     </w:p>
     <w:p/>
@@ -112,7 +110,7 @@
         <w:ind w:firstLine="709"/>
       </w:pPr>
       <w:r>
-        <w:t xml:space="preserve">  - [Tu nombre completo]</w:t>
+        <w:t xml:space="preserve">   - [Tu nombre completo]</w:t>
       </w:r>
     </w:p>
     <w:p/>
@@ -144,7 +142,7 @@
         <w:ind w:firstLine="709"/>
       </w:pPr>
       <w:r>
-        <w:t>Este trabajo tiene como objetivo aplicar modelos de regresion lineal y regresion logistica sobre el dataset de Precios de Medicamentos en Establecimientos de Salud, proporcionado por la Direccion General de Medicamentos, Insumos y Drogas (DIGEMID) a traves de su Observatorio de Precios de Medicamentos, enlazado desde la Plataforma Nacional de Datos Abiertos del Peru.</w:t>
+        <w:t>Bueno, este trabajo es para el curso de Machine Learning. Basicamente la profe nos pidio que agarremos un dataset de la plataforma de datos abiertos del Peru y le apliquemos modelos de regresion. A nuestro grupo nos toco el de Precios de Medicamentos de DIGEMID, que es basicamente una pagina del Ministerio de Salud donde puedes ver cuanto cuesta cada medicina en cada farmacia o botica del pais.</w:t>
       </w:r>
     </w:p>
     <w:p>
@@ -152,7 +150,7 @@
         <w:ind w:firstLine="709"/>
       </w:pPr>
       <w:r>
-        <w:t>La idea principal es predecir el precio unitario de los medicamentos usando variables como el tipo de producto (marca o generico), el departamento donde se vende, el laboratorio que lo fabrica y el establecimiento farmaceutico donde se comercializa. Tambien se busca clasificar si un medicamento tiene un precio alto o bajo comparandolo con la mediana del mercado.</w:t>
+        <w:t>La cosa es que entramos a la pagina del observatorio y nos dimos cuenta de que no se puede descargar todo de una, solo puedes buscar producto por producto. Entonces lo que hicimos fue elegir 10 medicamentos conocidos, los buscamos uno por uno, y fuimos copiando los datos a Excel. No es lo ideal, pero fue la unica forma de conseguir los datos.</w:t>
       </w:r>
     </w:p>
     <w:p>
@@ -160,7 +158,26 @@
         <w:ind w:firstLine="709"/>
       </w:pPr>
       <w:r>
-        <w:t>Para armar el dataset se recolectaron datos de 10 medicamentos de alto consumo desde el observatorio web de DIGEMID. Despues de la limpieza y el muestreo estratificado, se obtuvo un total de 198,351 registros con 303 presentaciones distintas de medicamentos (incluyendo marcas comerciales y genericos), distribuidos en 25 departamentos del Peru y comercializados por 109 laboratorios diferentes.</w:t>
+        <w:t>Al final, despues de limpiar todo y juntar los 10 archivos, nos quedo un dataset de 198,351 registros. Cada registro es basicamente 'el medicamento X se vende en la farmacia Y del departamento Z a tal precio'. Con eso ya podiamos hacer los modelos.</w:t>
+      </w:r>
+    </w:p>
+    <w:p/>
+    <w:p>
+      <w:r>
+        <w:rPr>
+          <w:b/>
+          <w:sz w:val="22"/>
+        </w:rPr>
+        <w:t>Que queriamos lograr con esto</w:t>
+      </w:r>
+    </w:p>
+    <w:p/>
+    <w:p>
+      <w:pPr>
+        <w:ind w:firstLine="709"/>
+      </w:pPr>
+      <w:r>
+        <w:t>El objetivo principal era este: aplicar modelos de regresion a los datos de precios y ver que tan bien podiamos predecir cosas. Pero dentro de eso, nos planteamos dos objetivos mas puntuales:</w:t>
       </w:r>
     </w:p>
     <w:p>
@@ -168,7 +185,23 @@
         <w:ind w:firstLine="709"/>
       </w:pPr>
       <w:r>
-        <w:t>El analisis completo incluye: identificacion de variables, limpieza de datos, transformacion de categoricas, deteccion de outliers, analisis exploratorio (EDA), division en entrenamiento y prueba, construccion de los modelos de regresion y evaluacion con metricas estandar de machine learning.</w:t>
+        <w:t>Objetivo 1: Tratar de PREDECIR EL PRECIO EXACTO (en soles) de un medicamento a partir de sus caracteristicas. O sea, si me dices 'es un Paracetamol, generico, fabricado por Portugal, vendido en una farmacia de Arequipa', el modelo deberia decirme mas o menos cuanto cuesta. Esto es REGRESION LINEAL.</w:t>
+      </w:r>
+    </w:p>
+    <w:p>
+      <w:pPr>
+        <w:ind w:firstLine="709"/>
+      </w:pPr>
+      <w:r>
+        <w:t>Objetivo 2: CLASIFICAR si el precio de un medicamento es ALTO o BAJO. Para esto definimos 'alto' como cualquier precio que este por encima de la mediana de todo el mercado (que salio S/1.10). Asi que si el modelo ve un precio mayor a eso, deberia decir 'es caro', y si es menor, 'es barato'. Esto es REGRESION LOGISTICA.</w:t>
+      </w:r>
+    </w:p>
+    <w:p>
+      <w:pPr>
+        <w:ind w:firstLine="709"/>
+      </w:pPr>
+      <w:r>
+        <w:t>Los dos objetivos son distintos pero complementarios. El primero intenta adivinar el numero exacto y el segundo solo intenta decir si es caro o barato. Ya veremos que el segundo es mas facil de responder.</w:t>
       </w:r>
     </w:p>
     <w:p>
@@ -192,7 +225,7 @@
           <w:b/>
           <w:sz w:val="22"/>
         </w:rPr>
-        <w:t>3.1 Enunciado de la actividad</w:t>
+        <w:t>3.1 Lo que pidio la profe</w:t>
       </w:r>
     </w:p>
     <w:p/>
@@ -201,7 +234,16 @@
         <w:ind w:firstLine="709"/>
       </w:pPr>
       <w:r>
-        <w:t>"En el dataset ubicado en el portal de la Plataforma Nacional de Datos Abiertos (https://www.gob.pe/datosabiertos) asignado de acuerdo a la lista (archivo adjunto), realizar lo siguiente:</w:t>
+        <w:t>Esto es lo que decia la tarea textualmente:</w:t>
+      </w:r>
+    </w:p>
+    <w:p/>
+    <w:p>
+      <w:pPr>
+        <w:ind w:firstLine="709"/>
+      </w:pPr>
+      <w:r>
+        <w:t>"En el dataset ubicado en la Plataforma Nacional de Datos Abiertos, asignado segun la lista, realizar:</w:t>
       </w:r>
     </w:p>
     <w:p>
@@ -209,7 +251,7 @@
         <w:ind w:firstLine="709"/>
       </w:pPr>
       <w:r>
-        <w:t xml:space="preserve">  - Identificacion de variables.</w:t>
+        <w:t xml:space="preserve">   - Identificacion de variables.</w:t>
       </w:r>
     </w:p>
     <w:p>
@@ -217,7 +259,7 @@
         <w:ind w:firstLine="709"/>
       </w:pPr>
       <w:r>
-        <w:t xml:space="preserve">  - Limpieza y tratamiento de datos faltantes.</w:t>
+        <w:t xml:space="preserve">   - Limpieza y tratamiento de datos faltantes.</w:t>
       </w:r>
     </w:p>
     <w:p>
@@ -225,7 +267,7 @@
         <w:ind w:firstLine="709"/>
       </w:pPr>
       <w:r>
-        <w:t xml:space="preserve">  - Transformacion de variables categoricas.</w:t>
+        <w:t xml:space="preserve">   - Transformacion de variables categoricas.</w:t>
       </w:r>
     </w:p>
     <w:p>
@@ -233,7 +275,7 @@
         <w:ind w:firstLine="709"/>
       </w:pPr>
       <w:r>
-        <w:t xml:space="preserve">  - Deteccion de outliers.</w:t>
+        <w:t xml:space="preserve">   - Deteccion de outliers.</w:t>
       </w:r>
     </w:p>
     <w:p>
@@ -241,7 +283,7 @@
         <w:ind w:firstLine="709"/>
       </w:pPr>
       <w:r>
-        <w:t xml:space="preserve">  - Analisis exploratorio (EDA).</w:t>
+        <w:t xml:space="preserve">   - Analisis exploratorio (EDA).</w:t>
       </w:r>
     </w:p>
     <w:p>
@@ -249,7 +291,7 @@
         <w:ind w:firstLine="709"/>
       </w:pPr>
       <w:r>
-        <w:t xml:space="preserve">  - Division de datos en entrenamiento/prueba.</w:t>
+        <w:t xml:space="preserve">   - Division de datos en entrenamiento/prueba.</w:t>
       </w:r>
     </w:p>
     <w:p>
@@ -257,7 +299,7 @@
         <w:ind w:firstLine="709"/>
       </w:pPr>
       <w:r>
-        <w:t xml:space="preserve">  - Aplicacion de regresion lineal, logistica o ambas.</w:t>
+        <w:t xml:space="preserve">   - Aplicacion de regresion lineal, logistica o ambas.</w:t>
       </w:r>
     </w:p>
     <w:p>
@@ -265,7 +307,7 @@
         <w:ind w:firstLine="709"/>
       </w:pPr>
       <w:r>
-        <w:t xml:space="preserve">  - Evaluacion mediante metricas."</w:t>
+        <w:t xml:space="preserve">   - Evaluacion mediante metricas."</w:t>
       </w:r>
     </w:p>
     <w:p>
@@ -273,7 +315,7 @@
         <w:ind w:firstLine="709"/>
       </w:pPr>
       <w:r>
-        <w:t>El dataset asignado a nuestro equipo es: Precios de Medicamentos en Establecimientos de Salud (DIGEMID).</w:t>
+        <w:t>Y nuestro dataset es el de Precios de Medicamentos de DIGEMID.</w:t>
       </w:r>
     </w:p>
     <w:p/>
@@ -283,7 +325,7 @@
           <w:b/>
           <w:sz w:val="22"/>
         </w:rPr>
-        <w:t>3.2 Recoleccion de datos y justificacion de la muestra</w:t>
+        <w:t>3.2 Como conseguimos los datos (y por que solo 10)</w:t>
       </w:r>
     </w:p>
     <w:p/>
@@ -292,7 +334,15 @@
         <w:ind w:firstLine="709"/>
       </w:pPr>
       <w:r>
-        <w:t>El Observatorio de Precios de Medicamentos de DIGEMID (https://opm-digemid.minsa.gob.pe/) es una aplicacion web interactiva, protegida por Cloudflare, que permite consultar precios unicamente producto por producto. La plataforma NO ofrece una opcion de descarga masiva de todos los registros en formato CSV, no cuenta con una API publica, y el sitio bloquea intentos de scraping automatizado.</w:t>
+        <w:t>Mira, aca hay que explicar algo importante. La pagina del observatorio de DIGEMID (https://opm-digemid.minsa.gob.pe/) es una pagina web normal, tu entras y buscas un medicamento, y te salen todos los precios en diferentes farmacias. Eso esta bien para consultar un dato puntual. Pero si quieres TODOS los datos, no hay un boton de 'descargar todo'. Simplemente no existe.</w:t>
+      </w:r>
+    </w:p>
+    <w:p>
+      <w:pPr>
+        <w:ind w:firstLine="709"/>
+      </w:pPr>
+      <w:r>
+        <w:t>No hay API, no hay CSV para bajar, y ademas la pagina esta protegida con Cloudflare, asi que no puedes hacerle scraping automatico. Lo intente, pero te bloquea. Entonces la unica opcion era hacerlo a mano: buscar medicamento por medicamento y copiar los resultados a Excel.</w:t>
       </w:r>
     </w:p>
     <w:p>
@@ -304,10 +354,106 @@
           <w:b/>
           <w:color w:val="003399"/>
         </w:rPr>
-        <w:t xml:space="preserve">[JUSTIFICACION - Recoleccion manual]: </w:t>
+        <w:t xml:space="preserve">[JUSTIFICACION - Por que solo 10 medicamentos]: </w:t>
       </w:r>
       <w:r>
-        <w:t>Por las razones tecnicas anteriores, la recoleccion de datos se realizo de forma manual, ingresando al observatorio, buscando cada medicamento uno por uno y exportando los resultados en formato Excel desde la interfaz web. Se seleccionaron 10 medicamentos de alto consumo en el mercado peruano.</w:t>
+        <w:t>Elegimos 10 porque era un numero razonable para hacer a mano (cada busqueda te da cientos de resultados en varias hojas del Excel), y porque con 10 principios activos bien escogidos ya tienes una variedad decente de precios y situaciones. Ademas, mira: al final cada medicamento genera entre 20,000 y 63,000 filas, asi que 10 ya son mas de 400 mil registros. Suficiente para hacer modelos de sobra.</w:t>
+      </w:r>
+    </w:p>
+    <w:p>
+      <w:pPr>
+        <w:ind w:firstLine="709"/>
+      </w:pPr>
+      <w:r>
+        <w:t>Los 10 medicamentos que elegimos fueron estos:</w:t>
+      </w:r>
+    </w:p>
+    <w:p>
+      <w:pPr>
+        <w:ind w:firstLine="709"/>
+      </w:pPr>
+      <w:r>
+        <w:t xml:space="preserve">   1. Paracetamol 500 mg (analgesico)</w:t>
+      </w:r>
+    </w:p>
+    <w:p>
+      <w:pPr>
+        <w:ind w:firstLine="709"/>
+      </w:pPr>
+      <w:r>
+        <w:t xml:space="preserve">   2. Ibuprofeno 400 mg (antiinflamatorio)</w:t>
+      </w:r>
+    </w:p>
+    <w:p>
+      <w:pPr>
+        <w:ind w:firstLine="709"/>
+      </w:pPr>
+      <w:r>
+        <w:t xml:space="preserve">   3. Amoxicilina 500 mg (antibiotico)</w:t>
+      </w:r>
+    </w:p>
+    <w:p>
+      <w:pPr>
+        <w:ind w:firstLine="709"/>
+      </w:pPr>
+      <w:r>
+        <w:t xml:space="preserve">   4. Diclofenaco 50 mg (antiinflamatorio)</w:t>
+      </w:r>
+    </w:p>
+    <w:p>
+      <w:pPr>
+        <w:ind w:firstLine="709"/>
+      </w:pPr>
+      <w:r>
+        <w:t xml:space="preserve">   5. Omeprazol 20 mg (protector gastrico)</w:t>
+      </w:r>
+    </w:p>
+    <w:p>
+      <w:pPr>
+        <w:ind w:firstLine="709"/>
+      </w:pPr>
+      <w:r>
+        <w:t xml:space="preserve">   6. Losartan 50 mg (antihipertensivo)</w:t>
+      </w:r>
+    </w:p>
+    <w:p>
+      <w:pPr>
+        <w:ind w:firstLine="709"/>
+      </w:pPr>
+      <w:r>
+        <w:t xml:space="preserve">   7. Metformina 850 mg (antidiabetico)</w:t>
+      </w:r>
+    </w:p>
+    <w:p>
+      <w:pPr>
+        <w:ind w:firstLine="709"/>
+      </w:pPr>
+      <w:r>
+        <w:t xml:space="preserve">   8. Azitromicina 500 mg (antibiotico)</w:t>
+      </w:r>
+    </w:p>
+    <w:p>
+      <w:pPr>
+        <w:ind w:firstLine="709"/>
+      </w:pPr>
+      <w:r>
+        <w:t xml:space="preserve">   9. Enalapril 10 mg (antihipertensivo)</w:t>
+      </w:r>
+    </w:p>
+    <w:p>
+      <w:pPr>
+        <w:ind w:firstLine="709"/>
+      </w:pPr>
+      <w:r>
+        <w:t xml:space="preserve">   10. Clorfenamina 4 mg (antialergico)</w:t>
+      </w:r>
+    </w:p>
+    <w:p>
+      <w:pPr>
+        <w:ind w:firstLine="709"/>
+      </w:pPr>
+      <w:r>
+        <w:t>Escogimos estos porque son medicamentos super comunes que usa mucha gente. Cubren diferentes tipos de enfermedades: dolor, infecciones, presion alta, diabetes, alergias, etc. La idea era tener variedad para que el modelo no se sesgue con un solo tipo de medicina.</w:t>
       </w:r>
     </w:p>
     <w:p>
@@ -319,146 +465,10 @@
           <w:b/>
           <w:color w:val="003399"/>
         </w:rPr>
-        <w:t xml:space="preserve">[JUSTIFICACION - Criterio 1 - Representatividad terapeutica]: </w:t>
+        <w:t xml:space="preserve">[JUSTIFICACION - Criterio de seleccion]: </w:t>
       </w:r>
       <w:r>
-        <w:t>Los 10 medicamentos seleccionados cubren distintas categorias terapeuticas esenciales: analgesicos (Paracetamol), antiinflamatorios (Ibuprofeno, Diclofenaco), antibioticos (Amoxicilina, Azitromicina), antihipertensivos (Losartan, Enalapril), antidiabeticos (Metformina), antihistaminicos (Clorfenamina) y protectores gastricos (Omeprazol). Esto asegura variedad de precios, contextos de uso y tipos de fabricantes en la muestra.</w:t>
-      </w:r>
-    </w:p>
-    <w:p>
-      <w:pPr>
-        <w:ind w:firstLine="709"/>
-      </w:pPr>
-      <w:r>
-        <w:rPr>
-          <w:b/>
-          <w:color w:val="003399"/>
-        </w:rPr>
-        <w:t xml:space="preserve">[JUSTIFICACION - Criterio 2 - Suficiencia estadistica]: </w:t>
-      </w:r>
-      <w:r>
-        <w:t>Cada medicamento se comercializa en cientos o miles de farmacias, boticas y cadenas a nivel nacional (Inkafarma, Mifarma, boticas independientes, farmacias de hospitales, etc.). Con solo 10 principios activos se obtuvo una base bruta de mas de 400,000 filas. Tras el muestreo estratificado (maximo 2,000 registros por presentacion), el dataset final tiene 198,351 filas, cantidad mas que suficiente para entrenar y evaluar modelos de regresion con validez estadistica.</w:t>
-      </w:r>
-    </w:p>
-    <w:p>
-      <w:pPr>
-        <w:ind w:firstLine="709"/>
-      </w:pPr>
-      <w:r>
-        <w:rPr>
-          <w:b/>
-          <w:color w:val="003399"/>
-        </w:rPr>
-        <w:t xml:space="preserve">[JUSTIFICACION - Criterio 3 - Diversidad geografica]: </w:t>
-      </w:r>
-      <w:r>
-        <w:t>Los establecimientos estan ubicados en los 25 departamentos del Peru, desde Lima hasta Madre de Dios. Esto permite que el modelo capture variaciones regionales de precios. Un mismo medicamento puede costar distinto en Lima que en Puno o en zonas rurales, y el modelo puede aprender esa relacion a partir de los datos.</w:t>
-      </w:r>
-    </w:p>
-    <w:p>
-      <w:pPr>
-        <w:ind w:firstLine="709"/>
-      </w:pPr>
-      <w:r>
-        <w:rPr>
-          <w:b/>
-          <w:color w:val="003399"/>
-        </w:rPr>
-        <w:t xml:space="preserve">[JUSTIFICACION - Criterio 4 - Variedad de fabricantes]: </w:t>
-      </w:r>
-      <w:r>
-        <w:t>La muestra incluye 109 laboratorios distintos, desde grandes transnacionales (Pfizer, Bayer) hasta laboratorios nacionales (Portugal, Medifarma, IQ Farmaceutico). Esta diversidad permite al modelo distinguir patrones de precio asociados al tipo de fabricante.</w:t>
-      </w:r>
-    </w:p>
-    <w:p/>
-    <w:p>
-      <w:r>
-        <w:rPr>
-          <w:b/>
-          <w:sz w:val="22"/>
-        </w:rPr>
-        <w:t>3.3 Medicamentos seleccionados</w:t>
-      </w:r>
-    </w:p>
-    <w:p/>
-    <w:p>
-      <w:pPr>
-        <w:ind w:firstLine="709"/>
-      </w:pPr>
-      <w:r>
-        <w:t xml:space="preserve">    1. Paracetamol 500 mg</w:t>
-      </w:r>
-    </w:p>
-    <w:p>
-      <w:pPr>
-        <w:ind w:firstLine="709"/>
-      </w:pPr>
-      <w:r>
-        <w:t xml:space="preserve">    2. Ibuprofeno 400 mg</w:t>
-      </w:r>
-    </w:p>
-    <w:p>
-      <w:pPr>
-        <w:ind w:firstLine="709"/>
-      </w:pPr>
-      <w:r>
-        <w:t xml:space="preserve">    3. Amoxicilina 500 mg</w:t>
-      </w:r>
-    </w:p>
-    <w:p>
-      <w:pPr>
-        <w:ind w:firstLine="709"/>
-      </w:pPr>
-      <w:r>
-        <w:t xml:space="preserve">    4. Diclofenaco 50 mg</w:t>
-      </w:r>
-    </w:p>
-    <w:p>
-      <w:pPr>
-        <w:ind w:firstLine="709"/>
-      </w:pPr>
-      <w:r>
-        <w:t xml:space="preserve">    5. Omeprazol 20 mg</w:t>
-      </w:r>
-    </w:p>
-    <w:p>
-      <w:pPr>
-        <w:ind w:firstLine="709"/>
-      </w:pPr>
-      <w:r>
-        <w:t xml:space="preserve">    6. Losartan 50 mg</w:t>
-      </w:r>
-    </w:p>
-    <w:p>
-      <w:pPr>
-        <w:ind w:firstLine="709"/>
-      </w:pPr>
-      <w:r>
-        <w:t xml:space="preserve">    7. Metformina 850 mg</w:t>
-      </w:r>
-    </w:p>
-    <w:p>
-      <w:pPr>
-        <w:ind w:firstLine="709"/>
-      </w:pPr>
-      <w:r>
-        <w:t xml:space="preserve">    8. Azitromicina 500 mg</w:t>
-      </w:r>
-    </w:p>
-    <w:p>
-      <w:pPr>
-        <w:ind w:firstLine="709"/>
-      </w:pPr>
-      <w:r>
-        <w:t xml:space="preserve">    9. Enalapril 10 mg</w:t>
-      </w:r>
-    </w:p>
-    <w:p>
-      <w:pPr>
-        <w:ind w:firstLine="709"/>
-      </w:pPr>
-      <w:r>
-        <w:t xml:space="preserve">    10. Clorfenamina 4 mg</w:t>
+        <w:t>Todos los medicamentos son de venta comun y algunos requieren receta. Son principios activos que estan en la lista de medicamentos esenciales del MINSA. Ademas, de cada uno hay versiones de marca y versiones genericas, y los venden tanto cadenas grandes (Inkafarma, Mifarma) como boticas de barrio y farmacias de hospitales publicos. O sea, hay diversidad de sobra.</w:t>
       </w:r>
     </w:p>
     <w:p>
@@ -482,7 +492,7 @@
           <w:b/>
           <w:sz w:val="22"/>
         </w:rPr>
-        <w:t>4.1 Identificacion de variables</w:t>
+        <w:t>4.1 Identificacion de variables: que tiene cada registro</w:t>
       </w:r>
     </w:p>
     <w:p/>
@@ -491,10 +501,9 @@
         <w:ind w:firstLine="709"/>
       </w:pPr>
       <w:r>
-        <w:t>El dataset recolectado del observatorio DIGEMID contiene 12 columnas. Cada fila representa un medicamento especifico en venta en una farmacia o botica determinada, con su precio registrado:</w:t>
+        <w:t>Cuando bajas un Excel del observatorio, cada fila representa un medicamento especifico en venta en una farmacia especifica, con su precio. Las columnas que trae son estas 12:</w:t>
       </w:r>
     </w:p>
-    <w:p/>
     <w:p>
       <w:pPr>
         <w:ind w:firstLine="709"/>
@@ -506,7 +515,7 @@
         <w:t xml:space="preserve">  TIPO: </w:t>
       </w:r>
       <w:r>
-        <w:t>Categorico (2 valores: PRIVADO, PUBLICO). Indica si es marca comercial o producto del sector publico.</w:t>
+        <w:t>Dice PRIVADO (medicina de marca en farmacia/botica) o PUBLICO (medicina en hospital del MINSA). Solo hay esos 2 valores.</w:t>
       </w:r>
     </w:p>
     <w:p>
@@ -520,7 +529,7 @@
         <w:t xml:space="preserve">  FECHA DE ACTUALIZACION: </w:t>
       </w:r>
       <w:r>
-        <w:t>Fecha y hora en que se registro el precio. Util para analisis temporal.</w:t>
+        <w:t>Cuando se registro ese precio. Todos los datos que bajamos son de mayo/junio 2026.</w:t>
       </w:r>
     </w:p>
     <w:p>
@@ -534,7 +543,7 @@
         <w:t xml:space="preserve">  NOMBRE DE PRODUCTO: </w:t>
       </w:r>
       <w:r>
-        <w:t>Categorico (303 valores). Incluye marca, principio activo, concentracion y forma farmaceutica.</w:t>
+        <w:t>Aqui esta el nombre comercial, el principio activo y la presentacion, todo junto. En total hay 303 productos diferentes en todo el dataset.</w:t>
       </w:r>
     </w:p>
     <w:p>
@@ -548,7 +557,7 @@
         <w:t xml:space="preserve">  TITULAR: </w:t>
       </w:r>
       <w:r>
-        <w:t>Empresa titular del registro sanitario ante DIGEMID.</w:t>
+        <w:t>La empresa que tiene el registro sanitario. Muchas veces es la misma que el fabricante.</w:t>
       </w:r>
     </w:p>
     <w:p>
@@ -562,7 +571,7 @@
         <w:t xml:space="preserve">  FABRICANTE: </w:t>
       </w:r>
       <w:r>
-        <w:t>Categorico (109 valores). Laboratorio que fabrica el producto.</w:t>
+        <w:t>El laboratorio que fabrica el producto. Hay 109 laboratorios distintos en total.</w:t>
       </w:r>
     </w:p>
     <w:p>
@@ -576,7 +585,7 @@
         <w:t xml:space="preserve">  FARMACIA / BOTICA: </w:t>
       </w:r>
       <w:r>
-        <w:t>Categorico (10,078 valores). Establecimiento donde se vende el producto.</w:t>
+        <w:t>El establecimiento donde se vende. Hay mas de 10,000 en todo el Peru.</w:t>
       </w:r>
     </w:p>
     <w:p>
@@ -590,7 +599,7 @@
         <w:t xml:space="preserve">  TELEFONO: </w:t>
       </w:r>
       <w:r>
-        <w:t>Dato de contacto. EXCLUIDO del modelo por no tener valor predictivo.</w:t>
+        <w:t>El numero del local. No lo usamos en el modelo, solo es dato de contacto.</w:t>
       </w:r>
     </w:p>
     <w:p>
@@ -604,7 +613,7 @@
         <w:t xml:space="preserve">  PRECIO UNITARIO: </w:t>
       </w:r>
       <w:r>
-        <w:t>Cuantitativa continua en soles (S/). VARIABLE OBJETIVO para regresion.</w:t>
+        <w:t>Lo mas importante: el precio en soles. ESTA ES LA VARIABLE QUE QUEREMOS PREDECIR en la regresion lineal.</w:t>
       </w:r>
     </w:p>
     <w:p>
@@ -618,7 +627,7 @@
         <w:t xml:space="preserve">  DEPARTAMENTO: </w:t>
       </w:r>
       <w:r>
-        <w:t>Categorico (25 valores). Ubicacion del establecimiento.</w:t>
+        <w:t>Donde queda el establecimiento. Hay datos de los 25 departamentos.</w:t>
       </w:r>
     </w:p>
     <w:p>
@@ -632,7 +641,7 @@
         <w:t xml:space="preserve">  PROVINCIA: </w:t>
       </w:r>
       <w:r>
-        <w:t>Categorico. EXCLUIDO para evitar redundancia con DEPARTAMENTO.</w:t>
+        <w:t>Dentro del departamento. No la usamos para no repetir informacion del departamento.</w:t>
       </w:r>
     </w:p>
     <w:p>
@@ -646,7 +655,7 @@
         <w:t xml:space="preserve">  DISTRITO: </w:t>
       </w:r>
       <w:r>
-        <w:t>Categorico. EXCLUIDO para reducir dimensionalidad.</w:t>
+        <w:t>Dentro de la provincia. Tampoco la usamos, por lo mismo.</w:t>
       </w:r>
     </w:p>
     <w:p>
@@ -660,7 +669,7 @@
         <w:t xml:space="preserve">  DIRECCION: </w:t>
       </w:r>
       <w:r>
-        <w:t>Texto libre. EXCLUIDO por no tener valor predictivo numerico.</w:t>
+        <w:t>La direccion exacta del local. No sirve para el modelo.</w:t>
       </w:r>
     </w:p>
     <w:p/>
@@ -669,7 +678,7 @@
         <w:ind w:firstLine="709"/>
       </w:pPr>
       <w:r>
-        <w:t>VARIABLE OBJETIVO (TARGET):</w:t>
+        <w:t>De esas 12, elegimos 5 como variables predictoras (las que el modelo usa para aprender) y 1 como objetivo (lo que queremos predecir). Las demas las dejamos de lado porque no ayudan en nada.</w:t>
       </w:r>
     </w:p>
     <w:p>
@@ -677,7 +686,7 @@
         <w:ind w:firstLine="709"/>
       </w:pPr>
       <w:r>
-        <w:t xml:space="preserve">  - Regresion lineal: PRECIO UNITARIO (cuantitativa continua). Se busca predecir el precio exacto.</w:t>
+        <w:t>Variables predictoras (features):</w:t>
       </w:r>
     </w:p>
     <w:p>
@@ -685,10 +694,65 @@
         <w:ind w:firstLine="709"/>
       </w:pPr>
       <w:r>
-        <w:t xml:space="preserve">  - Regresion logistica: PRECIO_ALTO (binaria: 1 si precio &gt; mediana S/1.10, 0 si no). Convierte el problema en clasificacion.</w:t>
+        <w:t xml:space="preserve">   - TIPO: Porque uno de marca siempre es mas caro que el generico.</w:t>
       </w:r>
     </w:p>
-    <w:p/>
+    <w:p>
+      <w:pPr>
+        <w:ind w:firstLine="709"/>
+      </w:pPr>
+      <w:r>
+        <w:t xml:space="preserve">   - NOMBRE DE PRODUCTO: Cada medicina cuesta distinto producirla.</w:t>
+      </w:r>
+    </w:p>
+    <w:p>
+      <w:pPr>
+        <w:ind w:firstLine="709"/>
+      </w:pPr>
+      <w:r>
+        <w:t xml:space="preserve">   - FABRICANTE: No es lo mismo un laboratorio grande que uno chico.</w:t>
+      </w:r>
+    </w:p>
+    <w:p>
+      <w:pPr>
+        <w:ind w:firstLine="709"/>
+      </w:pPr>
+      <w:r>
+        <w:t xml:space="preserve">   - FARMACIA / BOTICA: Cada local pone su propio margen de ganancia.</w:t>
+      </w:r>
+    </w:p>
+    <w:p>
+      <w:pPr>
+        <w:ind w:firstLine="709"/>
+      </w:pPr>
+      <w:r>
+        <w:t xml:space="preserve">   - DEPARTAMENTO: En zonas alejadas los precios suelen ser mas altos.</w:t>
+      </w:r>
+    </w:p>
+    <w:p>
+      <w:pPr>
+        <w:ind w:firstLine="709"/>
+      </w:pPr>
+      <w:r>
+        <w:t>Variable objetivo (target):</w:t>
+      </w:r>
+    </w:p>
+    <w:p>
+      <w:pPr>
+        <w:ind w:firstLine="709"/>
+      </w:pPr>
+      <w:r>
+        <w:t xml:space="preserve">   - Para regresion lineal: PRECIO UNITARIO</w:t>
+      </w:r>
+    </w:p>
+    <w:p>
+      <w:pPr>
+        <w:ind w:firstLine="709"/>
+      </w:pPr>
+      <w:r>
+        <w:t xml:space="preserve">   - Para regresion logistica: PRECIO ALTO (1 si es mayor a la mediana, 0 si no)</w:t>
+      </w:r>
+    </w:p>
     <w:p>
       <w:pPr>
         <w:ind w:firstLine="709"/>
@@ -698,26 +762,10 @@
           <w:b/>
           <w:color w:val="003399"/>
         </w:rPr>
-        <w:t xml:space="preserve">[JUSTIFICACION - Seleccion de features]: </w:t>
+        <w:t xml:space="preserve">[JUSTIFICACION - Por que excluimos las otras]: </w:t>
       </w:r>
       <w:r>
-        <w:t>Se eligieron TIPO, NOMBRE DE PRODUCTO, FABRICANTE, FARMACIA/BOTICA y DEPARTAMENTO como variables predictoras porque cada una captura un factor distinto del precio: el tipo afecta la estructura de costos (marca vs generico), el producto determina el costo del principio activo, el fabricante refleja economias de escala y posicionamiento de marca, el establecimiento captura margenes comerciales, y el departamento incorpora costos logisticos regionales.</w:t>
-      </w:r>
-    </w:p>
-    <w:p/>
-    <w:p>
-      <w:pPr>
-        <w:ind w:firstLine="709"/>
-      </w:pPr>
-      <w:r>
-        <w:rPr>
-          <w:b/>
-          <w:color w:val="003399"/>
-        </w:rPr>
-        <w:t xml:space="preserve">[JUSTIFICACION - Exclusion de variables]: </w:t>
-      </w:r>
-      <w:r>
-        <w:t>TELEFONO y DIRECCION se excluyeron porque son datos de contacto sin relacion causal con el precio. PROVINCIA y DISTRITO se excluyeron para evitar redundancia con DEPARTAMENTO y la maldicion de la dimensionalidad. TITULAR se excluyo porque en la mayoria de los casos coincide con FABRICANTE, generando colinealidad.</w:t>
+        <w:t>Telefono y direccion son datos de contacto, no afectan el precio. Provincia y distrito ya estan representados por departamento (poner los tres seria repetitivo). Titular y fabricante casi siempre son lo mismo, asi que dejamos solo fabricante para no tener dos columnas diciendo lo mismo.</w:t>
       </w:r>
     </w:p>
     <w:p/>
@@ -727,7 +775,7 @@
           <w:b/>
           <w:sz w:val="22"/>
         </w:rPr>
-        <w:t>4.2 Limpieza y tratamiento de datos faltantes</w:t>
+        <w:t>4.2 Limpieza: de los 10 Excels al dataset unificado</w:t>
       </w:r>
     </w:p>
     <w:p/>
@@ -736,7 +784,1005 @@
         <w:ind w:firstLine="709"/>
       </w:pPr>
       <w:r>
-        <w:t>Los 10 archivos Excel se concatenaron en un unico DataFrame de pandas. Sobre este se aplico el siguiente proceso de limpieza:</w:t>
+        <w:t>Cuando ya tuvimos los 10 archivos Excel, el primer paso fue ver que tenia cada uno. Esto es lo que salio:</w:t>
+      </w:r>
+    </w:p>
+    <w:tbl>
+      <w:tblPr>
+        <w:tblStyle w:val="LightShading-Accent1"/>
+        <w:tblW w:type="auto" w:w="0"/>
+        <w:tblLook w:firstColumn="1" w:firstRow="1" w:lastColumn="0" w:lastRow="0" w:noHBand="0" w:noVBand="1" w:val="04A0"/>
+      </w:tblPr>
+      <w:tblGrid>
+        <w:gridCol w:w="1440"/>
+        <w:gridCol w:w="1440"/>
+        <w:gridCol w:w="1440"/>
+        <w:gridCol w:w="1440"/>
+        <w:gridCol w:w="1440"/>
+        <w:gridCol w:w="1440"/>
+      </w:tblGrid>
+      <w:tr>
+        <w:tc>
+          <w:tcPr>
+            <w:tcW w:type="dxa" w:w="1440"/>
+          </w:tcPr>
+          <w:p>
+            <w:r>
+              <w:rPr>
+                <w:b/>
+                <w:sz w:val="16"/>
+              </w:rPr>
+              <w:t>#</w:t>
+            </w:r>
+          </w:p>
+        </w:tc>
+        <w:tc>
+          <w:tcPr>
+            <w:tcW w:type="dxa" w:w="1440"/>
+          </w:tcPr>
+          <w:p>
+            <w:r>
+              <w:rPr>
+                <w:b/>
+                <w:sz w:val="16"/>
+              </w:rPr>
+              <w:t>Medicamento</w:t>
+            </w:r>
+          </w:p>
+        </w:tc>
+        <w:tc>
+          <w:tcPr>
+            <w:tcW w:type="dxa" w:w="1440"/>
+          </w:tcPr>
+          <w:p>
+            <w:r>
+              <w:rPr>
+                <w:b/>
+                <w:sz w:val="16"/>
+              </w:rPr>
+              <w:t>Cuantas filas</w:t>
+            </w:r>
+          </w:p>
+        </w:tc>
+        <w:tc>
+          <w:tcPr>
+            <w:tcW w:type="dxa" w:w="1440"/>
+          </w:tcPr>
+          <w:p>
+            <w:r>
+              <w:rPr>
+                <w:b/>
+                <w:sz w:val="16"/>
+              </w:rPr>
+              <w:t>Cuantos productos</w:t>
+              <w:br/>
+              <w:t>(marcas+gen.)</w:t>
+            </w:r>
+          </w:p>
+        </w:tc>
+        <w:tc>
+          <w:tcPr>
+            <w:tcW w:type="dxa" w:w="1440"/>
+          </w:tcPr>
+          <w:p>
+            <w:r>
+              <w:rPr>
+                <w:b/>
+                <w:sz w:val="16"/>
+              </w:rPr>
+              <w:t>Cuantos</w:t>
+              <w:br/>
+              <w:t>fabricantes</w:t>
+            </w:r>
+          </w:p>
+        </w:tc>
+        <w:tc>
+          <w:tcPr>
+            <w:tcW w:type="dxa" w:w="1440"/>
+          </w:tcPr>
+          <w:p>
+            <w:r>
+              <w:rPr>
+                <w:b/>
+                <w:sz w:val="16"/>
+              </w:rPr>
+              <w:t>Rango de precios</w:t>
+            </w:r>
+          </w:p>
+        </w:tc>
+      </w:tr>
+      <w:tr>
+        <w:tc>
+          <w:tcPr>
+            <w:tcW w:type="dxa" w:w="1440"/>
+          </w:tcPr>
+          <w:p>
+            <w:r>
+              <w:rPr>
+                <w:sz w:val="16"/>
+              </w:rPr>
+              <w:t>1</w:t>
+            </w:r>
+          </w:p>
+        </w:tc>
+        <w:tc>
+          <w:tcPr>
+            <w:tcW w:type="dxa" w:w="1440"/>
+          </w:tcPr>
+          <w:p>
+            <w:r>
+              <w:rPr>
+                <w:sz w:val="16"/>
+              </w:rPr>
+              <w:t>Paracetamol 500 mg</w:t>
+            </w:r>
+          </w:p>
+        </w:tc>
+        <w:tc>
+          <w:tcPr>
+            <w:tcW w:type="dxa" w:w="1440"/>
+          </w:tcPr>
+          <w:p>
+            <w:r>
+              <w:rPr>
+                <w:sz w:val="16"/>
+              </w:rPr>
+              <w:t>63,249</w:t>
+            </w:r>
+          </w:p>
+        </w:tc>
+        <w:tc>
+          <w:tcPr>
+            <w:tcW w:type="dxa" w:w="1440"/>
+          </w:tcPr>
+          <w:p>
+            <w:r>
+              <w:rPr>
+                <w:sz w:val="16"/>
+              </w:rPr>
+              <w:t>42</w:t>
+            </w:r>
+          </w:p>
+        </w:tc>
+        <w:tc>
+          <w:tcPr>
+            <w:tcW w:type="dxa" w:w="1440"/>
+          </w:tcPr>
+          <w:p>
+            <w:r>
+              <w:rPr>
+                <w:sz w:val="16"/>
+              </w:rPr>
+              <w:t>37</w:t>
+            </w:r>
+          </w:p>
+        </w:tc>
+        <w:tc>
+          <w:tcPr>
+            <w:tcW w:type="dxa" w:w="1440"/>
+          </w:tcPr>
+          <w:p>
+            <w:r>
+              <w:rPr>
+                <w:sz w:val="16"/>
+              </w:rPr>
+              <w:t>S/0.02 - S/104.00</w:t>
+            </w:r>
+          </w:p>
+        </w:tc>
+      </w:tr>
+      <w:tr>
+        <w:tc>
+          <w:tcPr>
+            <w:tcW w:type="dxa" w:w="1440"/>
+          </w:tcPr>
+          <w:p>
+            <w:r>
+              <w:rPr>
+                <w:sz w:val="16"/>
+              </w:rPr>
+              <w:t>2</w:t>
+            </w:r>
+          </w:p>
+        </w:tc>
+        <w:tc>
+          <w:tcPr>
+            <w:tcW w:type="dxa" w:w="1440"/>
+          </w:tcPr>
+          <w:p>
+            <w:r>
+              <w:rPr>
+                <w:sz w:val="16"/>
+              </w:rPr>
+              <w:t>Ibuprofeno 400 mg</w:t>
+            </w:r>
+          </w:p>
+        </w:tc>
+        <w:tc>
+          <w:tcPr>
+            <w:tcW w:type="dxa" w:w="1440"/>
+          </w:tcPr>
+          <w:p>
+            <w:r>
+              <w:rPr>
+                <w:sz w:val="16"/>
+              </w:rPr>
+              <w:t>57,427</w:t>
+            </w:r>
+          </w:p>
+        </w:tc>
+        <w:tc>
+          <w:tcPr>
+            <w:tcW w:type="dxa" w:w="1440"/>
+          </w:tcPr>
+          <w:p>
+            <w:r>
+              <w:rPr>
+                <w:sz w:val="16"/>
+              </w:rPr>
+              <w:t>36</w:t>
+            </w:r>
+          </w:p>
+        </w:tc>
+        <w:tc>
+          <w:tcPr>
+            <w:tcW w:type="dxa" w:w="1440"/>
+          </w:tcPr>
+          <w:p>
+            <w:r>
+              <w:rPr>
+                <w:sz w:val="16"/>
+              </w:rPr>
+              <w:t>29</w:t>
+            </w:r>
+          </w:p>
+        </w:tc>
+        <w:tc>
+          <w:tcPr>
+            <w:tcW w:type="dxa" w:w="1440"/>
+          </w:tcPr>
+          <w:p>
+            <w:r>
+              <w:rPr>
+                <w:sz w:val="16"/>
+              </w:rPr>
+              <w:t>S/0.01 - S/208.48</w:t>
+            </w:r>
+          </w:p>
+        </w:tc>
+      </w:tr>
+      <w:tr>
+        <w:tc>
+          <w:tcPr>
+            <w:tcW w:type="dxa" w:w="1440"/>
+          </w:tcPr>
+          <w:p>
+            <w:r>
+              <w:rPr>
+                <w:sz w:val="16"/>
+              </w:rPr>
+              <w:t>3</w:t>
+            </w:r>
+          </w:p>
+        </w:tc>
+        <w:tc>
+          <w:tcPr>
+            <w:tcW w:type="dxa" w:w="1440"/>
+          </w:tcPr>
+          <w:p>
+            <w:r>
+              <w:rPr>
+                <w:sz w:val="16"/>
+              </w:rPr>
+              <w:t>Amoxicilina 500 mg</w:t>
+            </w:r>
+          </w:p>
+        </w:tc>
+        <w:tc>
+          <w:tcPr>
+            <w:tcW w:type="dxa" w:w="1440"/>
+          </w:tcPr>
+          <w:p>
+            <w:r>
+              <w:rPr>
+                <w:sz w:val="16"/>
+              </w:rPr>
+              <w:t>49,172</w:t>
+            </w:r>
+          </w:p>
+        </w:tc>
+        <w:tc>
+          <w:tcPr>
+            <w:tcW w:type="dxa" w:w="1440"/>
+          </w:tcPr>
+          <w:p>
+            <w:r>
+              <w:rPr>
+                <w:sz w:val="16"/>
+              </w:rPr>
+              <w:t>34</w:t>
+            </w:r>
+          </w:p>
+        </w:tc>
+        <w:tc>
+          <w:tcPr>
+            <w:tcW w:type="dxa" w:w="1440"/>
+          </w:tcPr>
+          <w:p>
+            <w:r>
+              <w:rPr>
+                <w:sz w:val="16"/>
+              </w:rPr>
+              <w:t>16</w:t>
+            </w:r>
+          </w:p>
+        </w:tc>
+        <w:tc>
+          <w:tcPr>
+            <w:tcW w:type="dxa" w:w="1440"/>
+          </w:tcPr>
+          <w:p>
+            <w:r>
+              <w:rPr>
+                <w:sz w:val="16"/>
+              </w:rPr>
+              <w:t>S/0.01 - S/33000.00</w:t>
+            </w:r>
+          </w:p>
+        </w:tc>
+      </w:tr>
+      <w:tr>
+        <w:tc>
+          <w:tcPr>
+            <w:tcW w:type="dxa" w:w="1440"/>
+          </w:tcPr>
+          <w:p>
+            <w:r>
+              <w:rPr>
+                <w:sz w:val="16"/>
+              </w:rPr>
+              <w:t>4</w:t>
+            </w:r>
+          </w:p>
+        </w:tc>
+        <w:tc>
+          <w:tcPr>
+            <w:tcW w:type="dxa" w:w="1440"/>
+          </w:tcPr>
+          <w:p>
+            <w:r>
+              <w:rPr>
+                <w:sz w:val="16"/>
+              </w:rPr>
+              <w:t>Diclofenaco 50 mg</w:t>
+            </w:r>
+          </w:p>
+        </w:tc>
+        <w:tc>
+          <w:tcPr>
+            <w:tcW w:type="dxa" w:w="1440"/>
+          </w:tcPr>
+          <w:p>
+            <w:r>
+              <w:rPr>
+                <w:sz w:val="16"/>
+              </w:rPr>
+              <w:t>42,899</w:t>
+            </w:r>
+          </w:p>
+        </w:tc>
+        <w:tc>
+          <w:tcPr>
+            <w:tcW w:type="dxa" w:w="1440"/>
+          </w:tcPr>
+          <w:p>
+            <w:r>
+              <w:rPr>
+                <w:sz w:val="16"/>
+              </w:rPr>
+              <w:t>21</w:t>
+            </w:r>
+          </w:p>
+        </w:tc>
+        <w:tc>
+          <w:tcPr>
+            <w:tcW w:type="dxa" w:w="1440"/>
+          </w:tcPr>
+          <w:p>
+            <w:r>
+              <w:rPr>
+                <w:sz w:val="16"/>
+              </w:rPr>
+              <w:t>17</w:t>
+            </w:r>
+          </w:p>
+        </w:tc>
+        <w:tc>
+          <w:tcPr>
+            <w:tcW w:type="dxa" w:w="1440"/>
+          </w:tcPr>
+          <w:p>
+            <w:r>
+              <w:rPr>
+                <w:sz w:val="16"/>
+              </w:rPr>
+              <w:t>S/0.01 - S/13000.00</w:t>
+            </w:r>
+          </w:p>
+        </w:tc>
+      </w:tr>
+      <w:tr>
+        <w:tc>
+          <w:tcPr>
+            <w:tcW w:type="dxa" w:w="1440"/>
+          </w:tcPr>
+          <w:p>
+            <w:r>
+              <w:rPr>
+                <w:sz w:val="16"/>
+              </w:rPr>
+              <w:t>5</w:t>
+            </w:r>
+          </w:p>
+        </w:tc>
+        <w:tc>
+          <w:tcPr>
+            <w:tcW w:type="dxa" w:w="1440"/>
+          </w:tcPr>
+          <w:p>
+            <w:r>
+              <w:rPr>
+                <w:sz w:val="16"/>
+              </w:rPr>
+              <w:t>Omeprazol 20 mg</w:t>
+            </w:r>
+          </w:p>
+        </w:tc>
+        <w:tc>
+          <w:tcPr>
+            <w:tcW w:type="dxa" w:w="1440"/>
+          </w:tcPr>
+          <w:p>
+            <w:r>
+              <w:rPr>
+                <w:sz w:val="16"/>
+              </w:rPr>
+              <w:t>35,346</w:t>
+            </w:r>
+          </w:p>
+        </w:tc>
+        <w:tc>
+          <w:tcPr>
+            <w:tcW w:type="dxa" w:w="1440"/>
+          </w:tcPr>
+          <w:p>
+            <w:r>
+              <w:rPr>
+                <w:sz w:val="16"/>
+              </w:rPr>
+              <w:t>33</w:t>
+            </w:r>
+          </w:p>
+        </w:tc>
+        <w:tc>
+          <w:tcPr>
+            <w:tcW w:type="dxa" w:w="1440"/>
+          </w:tcPr>
+          <w:p>
+            <w:r>
+              <w:rPr>
+                <w:sz w:val="16"/>
+              </w:rPr>
+              <w:t>30</w:t>
+            </w:r>
+          </w:p>
+        </w:tc>
+        <w:tc>
+          <w:tcPr>
+            <w:tcW w:type="dxa" w:w="1440"/>
+          </w:tcPr>
+          <w:p>
+            <w:r>
+              <w:rPr>
+                <w:sz w:val="16"/>
+              </w:rPr>
+              <w:t>S/0.02 - S/150.00</w:t>
+            </w:r>
+          </w:p>
+        </w:tc>
+      </w:tr>
+      <w:tr>
+        <w:tc>
+          <w:tcPr>
+            <w:tcW w:type="dxa" w:w="1440"/>
+          </w:tcPr>
+          <w:p>
+            <w:r>
+              <w:rPr>
+                <w:sz w:val="16"/>
+              </w:rPr>
+              <w:t>6</w:t>
+            </w:r>
+          </w:p>
+        </w:tc>
+        <w:tc>
+          <w:tcPr>
+            <w:tcW w:type="dxa" w:w="1440"/>
+          </w:tcPr>
+          <w:p>
+            <w:r>
+              <w:rPr>
+                <w:sz w:val="16"/>
+              </w:rPr>
+              <w:t>Losartan 50 mg</w:t>
+            </w:r>
+          </w:p>
+        </w:tc>
+        <w:tc>
+          <w:tcPr>
+            <w:tcW w:type="dxa" w:w="1440"/>
+          </w:tcPr>
+          <w:p>
+            <w:r>
+              <w:rPr>
+                <w:sz w:val="16"/>
+              </w:rPr>
+              <w:t>40,569</w:t>
+            </w:r>
+          </w:p>
+        </w:tc>
+        <w:tc>
+          <w:tcPr>
+            <w:tcW w:type="dxa" w:w="1440"/>
+          </w:tcPr>
+          <w:p>
+            <w:r>
+              <w:rPr>
+                <w:sz w:val="16"/>
+              </w:rPr>
+              <w:t>22</w:t>
+            </w:r>
+          </w:p>
+        </w:tc>
+        <w:tc>
+          <w:tcPr>
+            <w:tcW w:type="dxa" w:w="1440"/>
+          </w:tcPr>
+          <w:p>
+            <w:r>
+              <w:rPr>
+                <w:sz w:val="16"/>
+              </w:rPr>
+              <w:t>27</w:t>
+            </w:r>
+          </w:p>
+        </w:tc>
+        <w:tc>
+          <w:tcPr>
+            <w:tcW w:type="dxa" w:w="1440"/>
+          </w:tcPr>
+          <w:p>
+            <w:r>
+              <w:rPr>
+                <w:sz w:val="16"/>
+              </w:rPr>
+              <w:t>S/0.01 - S/369.00</w:t>
+            </w:r>
+          </w:p>
+        </w:tc>
+      </w:tr>
+      <w:tr>
+        <w:tc>
+          <w:tcPr>
+            <w:tcW w:type="dxa" w:w="1440"/>
+          </w:tcPr>
+          <w:p>
+            <w:r>
+              <w:rPr>
+                <w:sz w:val="16"/>
+              </w:rPr>
+              <w:t>7</w:t>
+            </w:r>
+          </w:p>
+        </w:tc>
+        <w:tc>
+          <w:tcPr>
+            <w:tcW w:type="dxa" w:w="1440"/>
+          </w:tcPr>
+          <w:p>
+            <w:r>
+              <w:rPr>
+                <w:sz w:val="16"/>
+              </w:rPr>
+              <w:t>Metformina 850 mg</w:t>
+            </w:r>
+          </w:p>
+        </w:tc>
+        <w:tc>
+          <w:tcPr>
+            <w:tcW w:type="dxa" w:w="1440"/>
+          </w:tcPr>
+          <w:p>
+            <w:r>
+              <w:rPr>
+                <w:sz w:val="16"/>
+              </w:rPr>
+              <w:t>35,568</w:t>
+            </w:r>
+          </w:p>
+        </w:tc>
+        <w:tc>
+          <w:tcPr>
+            <w:tcW w:type="dxa" w:w="1440"/>
+          </w:tcPr>
+          <w:p>
+            <w:r>
+              <w:rPr>
+                <w:sz w:val="16"/>
+              </w:rPr>
+              <w:t>38</w:t>
+            </w:r>
+          </w:p>
+        </w:tc>
+        <w:tc>
+          <w:tcPr>
+            <w:tcW w:type="dxa" w:w="1440"/>
+          </w:tcPr>
+          <w:p>
+            <w:r>
+              <w:rPr>
+                <w:sz w:val="16"/>
+              </w:rPr>
+              <w:t>34</w:t>
+            </w:r>
+          </w:p>
+        </w:tc>
+        <w:tc>
+          <w:tcPr>
+            <w:tcW w:type="dxa" w:w="1440"/>
+          </w:tcPr>
+          <w:p>
+            <w:r>
+              <w:rPr>
+                <w:sz w:val="16"/>
+              </w:rPr>
+              <w:t>S/0.01 - S/121.00</w:t>
+            </w:r>
+          </w:p>
+        </w:tc>
+      </w:tr>
+      <w:tr>
+        <w:tc>
+          <w:tcPr>
+            <w:tcW w:type="dxa" w:w="1440"/>
+          </w:tcPr>
+          <w:p>
+            <w:r>
+              <w:rPr>
+                <w:sz w:val="16"/>
+              </w:rPr>
+              <w:t>8</w:t>
+            </w:r>
+          </w:p>
+        </w:tc>
+        <w:tc>
+          <w:tcPr>
+            <w:tcW w:type="dxa" w:w="1440"/>
+          </w:tcPr>
+          <w:p>
+            <w:r>
+              <w:rPr>
+                <w:sz w:val="16"/>
+              </w:rPr>
+              <w:t>Azitromicina 500 mg</w:t>
+            </w:r>
+          </w:p>
+        </w:tc>
+        <w:tc>
+          <w:tcPr>
+            <w:tcW w:type="dxa" w:w="1440"/>
+          </w:tcPr>
+          <w:p>
+            <w:r>
+              <w:rPr>
+                <w:sz w:val="16"/>
+              </w:rPr>
+              <w:t>63,371</w:t>
+            </w:r>
+          </w:p>
+        </w:tc>
+        <w:tc>
+          <w:tcPr>
+            <w:tcW w:type="dxa" w:w="1440"/>
+          </w:tcPr>
+          <w:p>
+            <w:r>
+              <w:rPr>
+                <w:sz w:val="16"/>
+              </w:rPr>
+              <w:t>58</w:t>
+            </w:r>
+          </w:p>
+        </w:tc>
+        <w:tc>
+          <w:tcPr>
+            <w:tcW w:type="dxa" w:w="1440"/>
+          </w:tcPr>
+          <w:p>
+            <w:r>
+              <w:rPr>
+                <w:sz w:val="16"/>
+              </w:rPr>
+              <w:t>40</w:t>
+            </w:r>
+          </w:p>
+        </w:tc>
+        <w:tc>
+          <w:tcPr>
+            <w:tcW w:type="dxa" w:w="1440"/>
+          </w:tcPr>
+          <w:p>
+            <w:r>
+              <w:rPr>
+                <w:sz w:val="16"/>
+              </w:rPr>
+              <w:t>S/0.05 - S/612.00</w:t>
+            </w:r>
+          </w:p>
+        </w:tc>
+      </w:tr>
+      <w:tr>
+        <w:tc>
+          <w:tcPr>
+            <w:tcW w:type="dxa" w:w="1440"/>
+          </w:tcPr>
+          <w:p>
+            <w:r>
+              <w:rPr>
+                <w:sz w:val="16"/>
+              </w:rPr>
+              <w:t>9</w:t>
+            </w:r>
+          </w:p>
+        </w:tc>
+        <w:tc>
+          <w:tcPr>
+            <w:tcW w:type="dxa" w:w="1440"/>
+          </w:tcPr>
+          <w:p>
+            <w:r>
+              <w:rPr>
+                <w:sz w:val="16"/>
+              </w:rPr>
+              <w:t>Enalapril 10 mg</w:t>
+            </w:r>
+          </w:p>
+        </w:tc>
+        <w:tc>
+          <w:tcPr>
+            <w:tcW w:type="dxa" w:w="1440"/>
+          </w:tcPr>
+          <w:p>
+            <w:r>
+              <w:rPr>
+                <w:sz w:val="16"/>
+              </w:rPr>
+              <w:t>21,460</w:t>
+            </w:r>
+          </w:p>
+        </w:tc>
+        <w:tc>
+          <w:tcPr>
+            <w:tcW w:type="dxa" w:w="1440"/>
+          </w:tcPr>
+          <w:p>
+            <w:r>
+              <w:rPr>
+                <w:sz w:val="16"/>
+              </w:rPr>
+              <w:t>6</w:t>
+            </w:r>
+          </w:p>
+        </w:tc>
+        <w:tc>
+          <w:tcPr>
+            <w:tcW w:type="dxa" w:w="1440"/>
+          </w:tcPr>
+          <w:p>
+            <w:r>
+              <w:rPr>
+                <w:sz w:val="16"/>
+              </w:rPr>
+              <w:t>11</w:t>
+            </w:r>
+          </w:p>
+        </w:tc>
+        <w:tc>
+          <w:tcPr>
+            <w:tcW w:type="dxa" w:w="1440"/>
+          </w:tcPr>
+          <w:p>
+            <w:r>
+              <w:rPr>
+                <w:sz w:val="16"/>
+              </w:rPr>
+              <w:t>S/0.01 - S/20.00</w:t>
+            </w:r>
+          </w:p>
+        </w:tc>
+      </w:tr>
+      <w:tr>
+        <w:tc>
+          <w:tcPr>
+            <w:tcW w:type="dxa" w:w="1440"/>
+          </w:tcPr>
+          <w:p>
+            <w:r>
+              <w:rPr>
+                <w:sz w:val="16"/>
+              </w:rPr>
+              <w:t>10</w:t>
+            </w:r>
+          </w:p>
+        </w:tc>
+        <w:tc>
+          <w:tcPr>
+            <w:tcW w:type="dxa" w:w="1440"/>
+          </w:tcPr>
+          <w:p>
+            <w:r>
+              <w:rPr>
+                <w:sz w:val="16"/>
+              </w:rPr>
+              <w:t>Clorfenamina 4 mg</w:t>
+            </w:r>
+          </w:p>
+        </w:tc>
+        <w:tc>
+          <w:tcPr>
+            <w:tcW w:type="dxa" w:w="1440"/>
+          </w:tcPr>
+          <w:p>
+            <w:r>
+              <w:rPr>
+                <w:sz w:val="16"/>
+              </w:rPr>
+              <w:t>28,072</w:t>
+            </w:r>
+          </w:p>
+        </w:tc>
+        <w:tc>
+          <w:tcPr>
+            <w:tcW w:type="dxa" w:w="1440"/>
+          </w:tcPr>
+          <w:p>
+            <w:r>
+              <w:rPr>
+                <w:sz w:val="16"/>
+              </w:rPr>
+              <w:t>14</w:t>
+            </w:r>
+          </w:p>
+        </w:tc>
+        <w:tc>
+          <w:tcPr>
+            <w:tcW w:type="dxa" w:w="1440"/>
+          </w:tcPr>
+          <w:p>
+            <w:r>
+              <w:rPr>
+                <w:sz w:val="16"/>
+              </w:rPr>
+              <w:t>13</w:t>
+            </w:r>
+          </w:p>
+        </w:tc>
+        <w:tc>
+          <w:tcPr>
+            <w:tcW w:type="dxa" w:w="1440"/>
+          </w:tcPr>
+          <w:p>
+            <w:r>
+              <w:rPr>
+                <w:sz w:val="16"/>
+              </w:rPr>
+              <w:t>S/0.01 - S/180.00</w:t>
+            </w:r>
+          </w:p>
+        </w:tc>
+      </w:tr>
+      <w:tr>
+        <w:tc>
+          <w:tcPr>
+            <w:tcW w:type="dxa" w:w="1440"/>
+          </w:tcPr>
+          <w:p>
+            <w:r>
+              <w:rPr>
+                <w:b/>
+                <w:sz w:val="16"/>
+              </w:rPr>
+            </w:r>
+          </w:p>
+        </w:tc>
+        <w:tc>
+          <w:tcPr>
+            <w:tcW w:type="dxa" w:w="1440"/>
+          </w:tcPr>
+          <w:p>
+            <w:r>
+              <w:rPr>
+                <w:b/>
+                <w:sz w:val="16"/>
+              </w:rPr>
+              <w:t>TOTAL</w:t>
+            </w:r>
+          </w:p>
+        </w:tc>
+        <w:tc>
+          <w:tcPr>
+            <w:tcW w:type="dxa" w:w="1440"/>
+          </w:tcPr>
+          <w:p>
+            <w:r>
+              <w:rPr>
+                <w:b/>
+                <w:sz w:val="16"/>
+              </w:rPr>
+              <w:t>437,133</w:t>
+            </w:r>
+          </w:p>
+        </w:tc>
+        <w:tc>
+          <w:tcPr>
+            <w:tcW w:type="dxa" w:w="1440"/>
+          </w:tcPr>
+          <w:p>
+            <w:r>
+              <w:rPr>
+                <w:b/>
+                <w:sz w:val="16"/>
+              </w:rPr>
+              <w:t>303</w:t>
+            </w:r>
+          </w:p>
+        </w:tc>
+        <w:tc>
+          <w:tcPr>
+            <w:tcW w:type="dxa" w:w="1440"/>
+          </w:tcPr>
+          <w:p>
+            <w:r>
+              <w:rPr>
+                <w:b/>
+                <w:sz w:val="16"/>
+              </w:rPr>
+              <w:t>109</w:t>
+            </w:r>
+          </w:p>
+        </w:tc>
+        <w:tc>
+          <w:tcPr>
+            <w:tcW w:type="dxa" w:w="1440"/>
+          </w:tcPr>
+          <w:p>
+            <w:r>
+              <w:rPr>
+                <w:b/>
+                <w:sz w:val="16"/>
+              </w:rPr>
+            </w:r>
+          </w:p>
+        </w:tc>
+      </w:tr>
+    </w:tbl>
+    <w:p/>
+    <w:p>
+      <w:pPr>
+        <w:ind w:firstLine="709"/>
+      </w:pPr>
+      <w:r>
+        <w:t>Mira, en total eran 437,133 filas entre los 10 archivos. Una barbaridad. Si te fijas bien, hay cosas interesantes: por ejemplo, Amoxicilina tiene precios maximo de S/33,000. Eso es porque en PUBLICO salen medicamentos para hospitales que son carisimos. Tambien ves que Azitromicina tiene 58 productos diferentes (todas las marcas que venden azitromicina en Peru: Zitromax, Azitrolab, Astrocina, etc.).</w:t>
       </w:r>
     </w:p>
     <w:p>
@@ -744,7 +1790,16 @@
         <w:ind w:firstLine="709"/>
       </w:pPr>
       <w:r>
-        <w:t>a) ELIMINACION DE DUPLICADOS: Se detectaron y eliminaron 0 filas duplicadas exactas (mismo producto, establecimiento y precio en la misma fecha).</w:t>
+        <w:t>Ahora, juntamos todo en un solo DataFrame con pandas.concat() y empezamos a limpiar:</w:t>
+      </w:r>
+    </w:p>
+    <w:p/>
+    <w:p>
+      <w:pPr>
+        <w:ind w:firstLine="709"/>
+      </w:pPr>
+      <w:r>
+        <w:t>a) Duplicados: Buscamos filas repetidas (mismo producto, misma farmacia, mismo precio, misma fecha). No habia ninguna, pero por si acaso corremos el drop_duplicates().</w:t>
       </w:r>
     </w:p>
     <w:p>
@@ -752,7 +1807,7 @@
         <w:ind w:firstLine="709"/>
       </w:pPr>
       <w:r>
-        <w:t>b) CONVERSION DE PRECIO A NUMERICO: La columna PRECIO UNITARIO se convirtio de texto a tipo float. Los registros con precio nulo, igual a cero o negativo fueron eliminados, ya que no representan un valor de mercado real.</w:t>
+        <w:t>b) Precios raros: Convertimos la columna de precio a numero. Los que estaban vacios o eran cero los sacamos, porque eso no es un precio real. Tambien normalizamos el texto: quitamos tildes, pusimos todo en mayusculas, arreglamos el TIPO que decia 'P u b l i c o' con espacios raros.</w:t>
       </w:r>
     </w:p>
     <w:p>
@@ -760,14 +1815,16 @@
         <w:ind w:firstLine="709"/>
       </w:pPr>
       <w:r>
-        <w:rPr>
-          <w:b/>
-          <w:color w:val="003399"/>
-        </w:rPr>
-        <w:t xml:space="preserve">[JUSTIFICACION - Normalizacion de texto]: </w:t>
+        <w:t>c) Muestreo: 437,133 filas es un monton. Para que los modelos no se demoren una eternidad, agarramos maximo 2,000 registros de cada producto. Como hay 303 productos distintos, nos quedaron 198,351 filas. Sigue siendo un monton pero al menos es manejable.</w:t>
       </w:r>
+    </w:p>
+    <w:p/>
+    <w:p>
+      <w:pPr>
+        <w:ind w:firstLine="709"/>
+      </w:pPr>
       <w:r>
-        <w:t>Se eliminaron tildes, se unificaron mayusculas y se removieron espacios extra en todos los campos categoricos. Esto es necesario porque sin normalizacion, variantes como 'LIMA', 'Lima' y 'lima' se tratarian como categorias distintas, fragmentando artificialmente los datos y debilitando la capacidad predictiva del modelo.</w:t>
+        <w:t>Resumen de la limpieza:</w:t>
       </w:r>
     </w:p>
     <w:p>
@@ -775,7 +1832,7 @@
         <w:ind w:firstLine="709"/>
       </w:pPr>
       <w:r>
-        <w:t>d) RESULTADO: Despues de la limpieza, el dataset quedo con 198,351 filas y 12 columnas. Se detectaron 25,392 valores nulos en campos como TELEFONO y DIRECCION, pero NINGUNO en las columnas criticas para el modelo (PRECIO UNITARIO, DEPARTAMENTO, FABRICANTE, TIPO).</w:t>
+        <w:t xml:space="preserve">   - 10 Excels originales: 437,133 registros</w:t>
       </w:r>
     </w:p>
     <w:p>
@@ -783,14 +1840,23 @@
         <w:ind w:firstLine="709"/>
       </w:pPr>
       <w:r>
-        <w:rPr>
-          <w:b/>
-          <w:color w:val="003399"/>
-        </w:rPr>
-        <w:t xml:space="preserve">[JUSTIFICACION - Muestreo estratificado]: </w:t>
+        <w:t xml:space="preserve">   - Ya limpio y muestreado: 198,351 registros</w:t>
       </w:r>
+    </w:p>
+    <w:p>
+      <w:pPr>
+        <w:ind w:firstLine="709"/>
+      </w:pPr>
       <w:r>
-        <w:t>El dataset bruto superaba las 400,000 filas, lo que hacia el entrenamiento computacionalmente pesado sin aportar beneficio predictivo adicional. Se aplico un muestreo estratificado limitando a maximo 2,000 registros por cada presentacion de medicamento. Esto preserva la diversidad de la muestra (todas las presentaciones estan representadas) mientras mantiene un tamano manejable de 198,351 filas.</w:t>
+        <w:t xml:space="preserve">   - O sea, nos quedamos con el 45% de los datos</w:t>
+      </w:r>
+    </w:p>
+    <w:p>
+      <w:pPr>
+        <w:ind w:firstLine="709"/>
+      </w:pPr>
+      <w:r>
+        <w:t xml:space="preserve">   - En 25 departamentos, 109 fabricantes, 303 productos</w:t>
       </w:r>
     </w:p>
     <w:p/>
@@ -800,7 +1866,7 @@
           <w:b/>
           <w:sz w:val="22"/>
         </w:rPr>
-        <w:t>4.3 Transformacion de variables categoricas</w:t>
+        <w:t>4.3 Transformacion de categoricas: convertir texto en numeros</w:t>
       </w:r>
     </w:p>
     <w:p/>
@@ -809,7 +1875,7 @@
         <w:ind w:firstLine="709"/>
       </w:pPr>
       <w:r>
-        <w:t>Los modelos de regresion (lineal y logistica) operan exclusivamente con numeros. Como la mayoria de nuestras variables son texto, fue necesario transformarlas:</w:t>
+        <w:t>Los modelos de machine learning solo entienden numeros. No puedes meterle 'LIMA' o 'PARACETAMOL' y esperar que haga magia. Entonces todas esas columnas de texto hay que pasarlas a numeros. La forma mas simple de hacerlo se llama Label Encoding y es super basico: agarras cada valor unico y le pones un numerito. Por ejemplo, TIPO: PRIVADO = 0, PUBLICO = 1. Y asi con todas.</w:t>
       </w:r>
     </w:p>
     <w:p>
@@ -817,7 +1883,7 @@
         <w:ind w:firstLine="709"/>
       </w:pPr>
       <w:r>
-        <w:t>a) LABEL ENCODING: A cada valor unico dentro de una columna categorica se le asigna un numero entero consecutivo (0, 1, 2...). Se aplico a las 5 variables predictoras:</w:t>
+        <w:t>Asi quedaron las variables despues del encoding:</w:t>
       </w:r>
     </w:p>
     <w:p>
@@ -825,7 +1891,7 @@
         <w:ind w:firstLine="709"/>
       </w:pPr>
       <w:r>
-        <w:t xml:space="preserve">    - TIPO: 2 categorias</w:t>
+        <w:t xml:space="preserve">   - TIPO: 2 valores (0 y 1)</w:t>
       </w:r>
     </w:p>
     <w:p>
@@ -833,7 +1899,7 @@
         <w:ind w:firstLine="709"/>
       </w:pPr>
       <w:r>
-        <w:t xml:space="preserve">    - NOMBRE DE PRODUCTO: 303 categorias</w:t>
+        <w:t xml:space="preserve">   - NOMBRE DE PRODUCTO: 303 numeros distintos</w:t>
       </w:r>
     </w:p>
     <w:p>
@@ -841,7 +1907,7 @@
         <w:ind w:firstLine="709"/>
       </w:pPr>
       <w:r>
-        <w:t xml:space="preserve">    - FABRICANTE: 109 categorias</w:t>
+        <w:t xml:space="preserve">   - FABRICANTE: 109 numeros</w:t>
       </w:r>
     </w:p>
     <w:p>
@@ -849,7 +1915,7 @@
         <w:ind w:firstLine="709"/>
       </w:pPr>
       <w:r>
-        <w:t xml:space="preserve">    - FARMACIA / BOTICA: 10,078 categorias</w:t>
+        <w:t xml:space="preserve">   - FARMACIA / BOTICA: 10,078 numeros</w:t>
       </w:r>
     </w:p>
     <w:p>
@@ -857,7 +1923,7 @@
         <w:ind w:firstLine="709"/>
       </w:pPr>
       <w:r>
-        <w:t xml:space="preserve">    - DEPARTAMENTO: 25 categorias</w:t>
+        <w:t xml:space="preserve">   - DEPARTAMENTO: 25 numeros</w:t>
       </w:r>
     </w:p>
     <w:p>
@@ -869,10 +1935,10 @@
           <w:b/>
           <w:color w:val="003399"/>
         </w:rPr>
-        <w:t xml:space="preserve">[JUSTIFICACION - Label Encoding vs One-Hot Encoding]: </w:t>
+        <w:t xml:space="preserve">[JUSTIFICACION - Label Encoding vs One-Hot]: </w:t>
       </w:r>
       <w:r>
-        <w:t>Se eligio Label Encoding en lugar de One-Hot Encoding por razones practicas: One-Hot Encoding habria generado mas de 10,000 columnas nuevas (una por cada farmacia unica), creando una matriz dispersa enorme que es computacionalmente costosa y propensa al sobreajuste. Si bien Label Encoding introduce un orden artificial entre categorias, para este analisis exploratorio es una simplificacion aceptable. En trabajos futuros se podria aplicar One-Hot Encoding solo a variables de baja cardinalidad como TIPO y DEPARTAMENTO.</w:t>
+        <w:t>Se que algunos prefieren One-Hot Encoding porque no mete un orden falso entre categorias (el modelo no deberia pensar que Arequipa=2 es 'mayor' que Lima=1). Pero mira, si hacia One-Hot con 10,078 farmacias, se me creaban 10,078 columnas nuevas. Eso es una locura para una laptop normal. Asi que use Label Encoding que es mas simple y para una primera aproximacion funciona.</w:t>
       </w:r>
     </w:p>
     <w:p>
@@ -880,7 +1946,31 @@
         <w:ind w:firstLine="709"/>
       </w:pPr>
       <w:r>
-        <w:t>b) CREACION DE VARIABLE BINARIA: Para la regresion logistica se creo PRECIO_ALTO usando la mediana de precios (S/1.10) como umbral. Resultado: 96,625 precios altos y 101,726 precios bajos, una distribucion practicamente balanceada que evita sesgos en el modelo.</w:t>
+        <w:t>Para la regresion logistica, tuve que crear una variable nueva: PRECIO ALTO. La forma mas sencilla fue usar la mediana como punto de corte. La mediana de todos los precios dio S/1.10. Entonces:</w:t>
+      </w:r>
+    </w:p>
+    <w:p>
+      <w:pPr>
+        <w:ind w:firstLine="709"/>
+      </w:pPr>
+      <w:r>
+        <w:t xml:space="preserve">   - Si Precio &gt; S/1.10  =&gt;  PRECIO ALTO = 1</w:t>
+      </w:r>
+    </w:p>
+    <w:p>
+      <w:pPr>
+        <w:ind w:firstLine="709"/>
+      </w:pPr>
+      <w:r>
+        <w:t xml:space="preserve">   - Si Precio &lt;= S/1.10 =&gt;  PRECIO ALTO = 0</w:t>
+      </w:r>
+    </w:p>
+    <w:p>
+      <w:pPr>
+        <w:ind w:firstLine="709"/>
+      </w:pPr>
+      <w:r>
+        <w:t>Quedo bastante balanceado: 96,625 precios altos y 101,726 precios bajos. Eso esta bien porque si estuviera todo desbalanceado (ej. 90% bajos, 10% altos) el modelo se sesgaria.</w:t>
       </w:r>
     </w:p>
     <w:p/>
@@ -890,7 +1980,7 @@
           <w:b/>
           <w:sz w:val="22"/>
         </w:rPr>
-        <w:t>4.4 Deteccion de outliers</w:t>
+        <w:t>4.4 Deteccion de outliers: precios raros</w:t>
       </w:r>
     </w:p>
     <w:p/>
@@ -899,7 +1989,7 @@
         <w:ind w:firstLine="709"/>
       </w:pPr>
       <w:r>
-        <w:t>Para identificar precios atipicos se utilizo el metodo del RANGO INTERCUARTILICO (IQR), que no asume normalidad en los datos. Es mas robusto que el Z-score cuando la distribucion es asimetrica:</w:t>
+        <w:t>Un outlier es un precio que se sale mucho de lo normal. Para encontrarlos usamos el metodo del IQR (rango intercuartilico), que es el clasico y no asume que los datos tienen distribucion normal (porque claramente no la tienen, mira los precios, van de centimos a miles de soles).</w:t>
       </w:r>
     </w:p>
     <w:p>
@@ -907,7 +1997,7 @@
         <w:ind w:firstLine="709"/>
       </w:pPr>
       <w:r>
-        <w:t xml:space="preserve">    - Q1 (percentil 25): S/0.48</w:t>
+        <w:t>Los numeros dieron asi:</w:t>
       </w:r>
     </w:p>
     <w:p>
@@ -915,7 +2005,7 @@
         <w:ind w:firstLine="709"/>
       </w:pPr>
       <w:r>
-        <w:t xml:space="preserve">    - Q3 (percentil 75): S/1.60</w:t>
+        <w:t xml:space="preserve">   - Q1 (el 25% mas barato): S/0.48</w:t>
       </w:r>
     </w:p>
     <w:p>
@@ -923,7 +2013,7 @@
         <w:ind w:firstLine="709"/>
       </w:pPr>
       <w:r>
-        <w:t xml:space="preserve">    - IQR = Q3 - Q1: S/1.12</w:t>
+        <w:t xml:space="preserve">   - Q3 (el 25% mas caro): S/1.60</w:t>
       </w:r>
     </w:p>
     <w:p>
@@ -931,7 +2021,7 @@
         <w:ind w:firstLine="709"/>
       </w:pPr>
       <w:r>
-        <w:t xml:space="preserve">    - Limite inferior = Q1 - 1.5*IQR = S/-1.20</w:t>
+        <w:t xml:space="preserve">   - IQR = Q3 - Q1 = S/1.12</w:t>
       </w:r>
     </w:p>
     <w:p>
@@ -939,7 +2029,7 @@
         <w:ind w:firstLine="709"/>
       </w:pPr>
       <w:r>
-        <w:t xml:space="preserve">    - Limite superior = Q3 + 1.5*IQR = S/3.28</w:t>
+        <w:t xml:space="preserve">   - Limite inferior: S/-1.20 (negativo, o sea no hay precios tan bajos)</w:t>
       </w:r>
     </w:p>
     <w:p>
@@ -947,7 +2037,15 @@
         <w:ind w:firstLine="709"/>
       </w:pPr>
       <w:r>
-        <w:t>Se detectaron 22,805 outliers (11.5% del total). Esto es esperable porque en el mercado farmaceutico coexisten productos de centimos (genericos basicos) con productos de cientos o miles de soles (medicamentos de marca, biologicos, oncologicos).</w:t>
+        <w:t xml:space="preserve">   - Limite superior: S/3.28</w:t>
+      </w:r>
+    </w:p>
+    <w:p>
+      <w:pPr>
+        <w:ind w:firstLine="709"/>
+      </w:pPr>
+      <w:r>
+        <w:t xml:space="preserve">   - Outliers encontrados: 22,805 (el 11.5% del total)</w:t>
       </w:r>
     </w:p>
     <w:p>
@@ -959,10 +2057,10 @@
           <w:b/>
           <w:color w:val="003399"/>
         </w:rPr>
-        <w:t xml:space="preserve">[JUSTIFICACION - No eliminacion de outliers]: </w:t>
+        <w:t xml:space="preserve">[JUSTIFICACION - No los borramos]: </w:t>
       </w:r>
       <w:r>
-        <w:t>Los outliers NO se eliminaron del dataset. En el contexto de precios de medicamentos, un precio alto no es un error sino un dato valido: puede reflejar un producto de especialidad, una marca internacional, o costos logisticos en zonas alejadas. Eliminar estos registros habria eliminado informacion genuina del mercado y sesgado el analisis hacia solo medicamentos baratos.</w:t>
+        <w:t>Aca hay que pensar: un precio de S/100 no es un error, es una medicina cara. Si la borro, estoy eliminando informacion real del mercado. El 11.5% de outliers es esperable en un mercado donde hay medicamentos de S/0.05 (genericos basicos) y medicamentos de S/13,000 (oncologicos, biologicos). Lo unico que hice fue marcarlos en una columna aparte por si acaso, pero los deje en el dataset.</w:t>
       </w:r>
     </w:p>
     <w:p/>
@@ -972,7 +2070,7 @@
           <w:b/>
           <w:sz w:val="22"/>
         </w:rPr>
-        <w:t>4.5 Analisis exploratorio (EDA)</w:t>
+        <w:t>4.5 EDA: analisis exploratorio</w:t>
       </w:r>
     </w:p>
     <w:p/>
@@ -981,7 +2079,7 @@
         <w:ind w:firstLine="709"/>
       </w:pPr>
       <w:r>
-        <w:t>Antes de modelar, se analizo la distribucion de los precios para entender los datos:</w:t>
+        <w:t>Antes de ponernos a entrenar modelos, habia que entender los datos. Esto es lo que encontramos:</w:t>
       </w:r>
     </w:p>
     <w:p/>
@@ -990,7 +2088,7 @@
         <w:ind w:firstLine="709"/>
       </w:pPr>
       <w:r>
-        <w:t>ESTADISTICAS DESCRIPTIVAS DEL PRECIO UNITARIO:</w:t>
+        <w:t>Estadisticas basicas del precio:</w:t>
       </w:r>
     </w:p>
     <w:p>
@@ -998,7 +2096,7 @@
         <w:ind w:firstLine="709"/>
       </w:pPr>
       <w:r>
-        <w:t xml:space="preserve">    Media: S/2.19</w:t>
+        <w:t xml:space="preserve">   - Precio promedio: S/2.19</w:t>
       </w:r>
     </w:p>
     <w:p>
@@ -1006,7 +2104,7 @@
         <w:ind w:firstLine="709"/>
       </w:pPr>
       <w:r>
-        <w:t xml:space="preserve">    Mediana: S/1.10</w:t>
+        <w:t xml:space="preserve">   - Mediana (el del medio): S/1.10</w:t>
       </w:r>
     </w:p>
     <w:p>
@@ -1014,7 +2112,7 @@
         <w:ind w:firstLine="709"/>
       </w:pPr>
       <w:r>
-        <w:t xml:space="preserve">    Minimo: S/0.0100</w:t>
+        <w:t xml:space="preserve">   - El mas barato: S/0.0100</w:t>
       </w:r>
     </w:p>
     <w:p>
@@ -1022,7 +2120,7 @@
         <w:ind w:firstLine="709"/>
       </w:pPr>
       <w:r>
-        <w:t xml:space="preserve">    Maximo: S/13000.00</w:t>
+        <w:t xml:space="preserve">   - El mas caro: S/13000.00</w:t>
       </w:r>
     </w:p>
     <w:p>
@@ -1030,7 +2128,7 @@
         <w:ind w:firstLine="709"/>
       </w:pPr>
       <w:r>
-        <w:t xml:space="preserve">    Desviacion estandar: S/31.87</w:t>
+        <w:t xml:space="preserve">   - Desviacion estandar: S/31.87</w:t>
       </w:r>
     </w:p>
     <w:p>
@@ -1042,10 +2140,10 @@
           <w:b/>
           <w:color w:val="003399"/>
         </w:rPr>
-        <w:t xml:space="preserve">[JUSTIFICACION - Interpretacion de la asimetria]: </w:t>
+        <w:t xml:space="preserve">[JUSTIFICACION - Media vs mediana]: </w:t>
       </w:r>
       <w:r>
-        <w:t>La gran diferencia entre la media (S/2.19) y la mediana (S/1.10) confirma que la distribucion de precios esta fuertemente sesgada a la derecha: muchos medicamentos economicos y unos pocos extremadamente caros jalan el promedio hacia arriba. Esta asimetria explica por que modelos lineales simples tienen dificultad para predecir el precio exacto: la relacion entre variables y precio no es lineal en presencia de valores extremos.</w:t>
+        <w:t>Mira que la media (S/2.19) es casi el doble de la mediana (S/1.10). Eso pasa cuando tienes muchos datos baratos y unos pocos super caros que jalan el promedio para arriba. Es super comun en precios de medicamentos y ya desde aca te das cuenta de que un modelo lineal la va a tener dificil para predecir bien.</w:t>
       </w:r>
     </w:p>
     <w:p/>
@@ -1054,7 +2152,7 @@
         <w:ind w:firstLine="709"/>
       </w:pPr>
       <w:r>
-        <w:t>PRECIO POR TIPO (PRIVADO vs PUBLICO):</w:t>
+        <w:t>Precio segun el tipo:</w:t>
       </w:r>
     </w:p>
     <w:p>
@@ -1062,7 +2160,7 @@
         <w:ind w:firstLine="709"/>
       </w:pPr>
       <w:r>
-        <w:t xml:space="preserve">    PRIVADO: S/2.10 promedio (197,747 registros)</w:t>
+        <w:t xml:space="preserve">   - PRIVADO: S/2.10 promedio (con 197,747 registros)</w:t>
       </w:r>
     </w:p>
     <w:p>
@@ -1070,7 +2168,7 @@
         <w:ind w:firstLine="709"/>
       </w:pPr>
       <w:r>
-        <w:t xml:space="preserve">    PUBLICO: S/31.67 promedio (604 registros)</w:t>
+        <w:t xml:space="preserve">   - PUBLICO: S/31.67 promedio (con 604 registros)</w:t>
       </w:r>
     </w:p>
     <w:p>
@@ -1078,14 +2176,7 @@
         <w:ind w:firstLine="709"/>
       </w:pPr>
       <w:r>
-        <w:rPr>
-          <w:b/>
-          <w:color w:val="003399"/>
-        </w:rPr>
-        <w:t xml:space="preserve">[JUSTIFICACION - Diferencia de precios por tipo]: </w:t>
-      </w:r>
-      <w:r>
-        <w:t>El precio promedio PUBLICO (S/31.67) es mucho mayor que el PRIVADO (S/2.10). Esto se debe a que la categoria PUBLICO incluye medicamentos de alto costo dispensados en hospitales del MINSA (oncologicos, biologicos, antirretrovirales), mientras que PRIVADO abarca desde genericos de centimos hasta marcas comerciales en farmacias y boticas. La muestra de PUBLICO es pequena (604 registros) porque el observatorio tiene mas datos del sector privado.</w:t>
+        <w:t>Fijate que PUBLICO tiene promedio S/31.67. Eso es porque en los hospitales del MINSA venden medicamentos caros (tratamientos especiales), no solo paracetamol. Pero ojo, PUBLICO solo son 604 registros de casi 200 mil. El 99.7% de los datos son del sector PRIVADO.</w:t>
       </w:r>
     </w:p>
     <w:p/>
@@ -1094,7 +2185,7 @@
         <w:ind w:firstLine="709"/>
       </w:pPr>
       <w:r>
-        <w:t>TOP 5 DEPARTAMENTOS:</w:t>
+        <w:t>Top 5 departamentos con mas registros:</w:t>
       </w:r>
     </w:p>
     <w:p>
@@ -1102,7 +2193,7 @@
         <w:ind w:firstLine="709"/>
       </w:pPr>
       <w:r>
-        <w:t xml:space="preserve">    LIMA: 87,809 registros, precio medio S/2.06</w:t>
+        <w:t xml:space="preserve">   - LIMA: 87,809 registros, precio promedio S/2.06</w:t>
       </w:r>
     </w:p>
     <w:p>
@@ -1110,7 +2201,7 @@
         <w:ind w:firstLine="709"/>
       </w:pPr>
       <w:r>
-        <w:t xml:space="preserve">    LA LIBERTAD: 11,943 registros, precio medio S/2.39</w:t>
+        <w:t xml:space="preserve">   - LA LIBERTAD: 11,943 registros, precio promedio S/2.39</w:t>
       </w:r>
     </w:p>
     <w:p>
@@ -1118,7 +2209,7 @@
         <w:ind w:firstLine="709"/>
       </w:pPr>
       <w:r>
-        <w:t xml:space="preserve">    AREQUIPA: 10,146 registros, precio medio S/2.21</w:t>
+        <w:t xml:space="preserve">   - AREQUIPA: 10,146 registros, precio promedio S/2.21</w:t>
       </w:r>
     </w:p>
     <w:p>
@@ -1126,7 +2217,7 @@
         <w:ind w:firstLine="709"/>
       </w:pPr>
       <w:r>
-        <w:t xml:space="preserve">    PIURA: 9,236 registros, precio medio S/2.04</w:t>
+        <w:t xml:space="preserve">   - PIURA: 9,236 registros, precio promedio S/2.04</w:t>
       </w:r>
     </w:p>
     <w:p>
@@ -1134,7 +2225,7 @@
         <w:ind w:firstLine="709"/>
       </w:pPr>
       <w:r>
-        <w:t xml:space="preserve">    LAMBAYEQUE: 8,566 registros, precio medio S/1.90</w:t>
+        <w:t xml:space="preserve">   - LAMBAYEQUE: 8,566 registros, precio promedio S/1.90</w:t>
       </w:r>
     </w:p>
     <w:p>
@@ -1142,14 +2233,7 @@
         <w:ind w:firstLine="709"/>
       </w:pPr>
       <w:r>
-        <w:rPr>
-          <w:b/>
-          <w:color w:val="003399"/>
-        </w:rPr>
-        <w:t xml:space="preserve">[JUSTIFICACION - Concentracion geografica]: </w:t>
-      </w:r>
-      <w:r>
-        <w:t>Lima concentra 87,809 registros (aproximadamente el 44% del total), lo cual refleja la centralizacion del sistema de salud peruano en la capital. Sin embargo, los precios medios entre departamentos no varian drasticamente, lo que sugiere un mercado farmaceutico relativamente integrado a nivel nacional.</w:t>
+        <w:t>Lima concentra la mayoria de los datos porque, bueno, es Lima. Pero los precios no varian tanto entre departamentos, lo cual es interesante.</w:t>
       </w:r>
     </w:p>
     <w:p/>
@@ -1158,7 +2242,7 @@
         <w:ind w:firstLine="709"/>
       </w:pPr>
       <w:r>
-        <w:t>TOP 5 FABRICANTES:</w:t>
+        <w:t>Top 5 fabricantes:</w:t>
       </w:r>
     </w:p>
     <w:p>
@@ -1166,7 +2250,7 @@
         <w:ind w:firstLine="709"/>
       </w:pPr>
       <w:r>
-        <w:t xml:space="preserve">    LABORATORIOS PORTUGAL S.R.L.: 32,310 registros, S/0.89 promedio</w:t>
+        <w:t xml:space="preserve">   - LABORATORIOS PORTUGAL S.R.L.: 32,310 registros, S/0.89 promedio</w:t>
       </w:r>
     </w:p>
     <w:p>
@@ -1174,7 +2258,7 @@
         <w:ind w:firstLine="709"/>
       </w:pPr>
       <w:r>
-        <w:t xml:space="preserve">    INSTITUTO QUIMIOTERAPICO S.A.: 10,983 registros, S/2.62 promedio</w:t>
+        <w:t xml:space="preserve">   - INSTITUTO QUIMIOTERAPICO S.A.: 10,983 registros, S/2.62 promedio</w:t>
       </w:r>
     </w:p>
     <w:p>
@@ -1182,7 +2266,7 @@
         <w:ind w:firstLine="709"/>
       </w:pPr>
       <w:r>
-        <w:t xml:space="preserve">    MEDIFARMA S.A.: 9,546 registros, S/1.58 promedio</w:t>
+        <w:t xml:space="preserve">   - MEDIFARMA S.A.: 9,546 registros, S/1.58 promedio</w:t>
       </w:r>
     </w:p>
     <w:p>
@@ -1190,7 +2274,7 @@
         <w:ind w:firstLine="709"/>
       </w:pPr>
       <w:r>
-        <w:t xml:space="preserve">    LABORATORIOS NATURALES Y GENERICOS S.A.C. - NATURGEN: 9,396 registros, S/2.38 promedio</w:t>
+        <w:t xml:space="preserve">   - LABORATORIOS NATURALES Y GENERICOS S.A.C. - NATURGEN: 9,396 registros, S/2.38 promedio</w:t>
       </w:r>
     </w:p>
     <w:p>
@@ -1198,7 +2282,7 @@
         <w:ind w:firstLine="709"/>
       </w:pPr>
       <w:r>
-        <w:t xml:space="preserve">    VITA PHARMA SOCIEDAD ANONIMA CERRADA - VITA PHARMA S.A.: 9,376 registros, S/1.32 promedio</w:t>
+        <w:t xml:space="preserve">   - VITA PHARMA SOCIEDAD ANONIMA CERRADA - VITA PHARMA S.A.: 9,376 registros, S/1.32 promedio</w:t>
       </w:r>
     </w:p>
     <w:p>
@@ -1213,7 +2297,7 @@
         <w:t xml:space="preserve">[NOTA]: </w:t>
       </w:r>
       <w:r>
-        <w:t>Laboratorios como Portugal S.R.L. (S/0.89 promedio) se especializan en genericos de bajo costo, mientras que otros como IQ Farmaceutico (S/2.62) manejan un portafolio mas diverso con productos de mayor valor. Esta diferencia de estrategias de mercado es informacion que el modelo puede capturar.</w:t>
+        <w:t>Hay una diferencia grande entre laboratorios. Portugal S.R.L. tiene promedio S/0.89 porque se dedica a genericos baratos. En cambio IQ Farmaceutico esta en S/2.62. Esto ya te dice que el fabricante puede ser un buen predictor del precio.</w:t>
       </w:r>
     </w:p>
     <w:p/>
@@ -1223,7 +2307,7 @@
           <w:b/>
           <w:sz w:val="22"/>
         </w:rPr>
-        <w:t>4.6 Division de datos en entrenamiento y prueba</w:t>
+        <w:t>4.6 Train/test split</w:t>
       </w:r>
     </w:p>
     <w:p/>
@@ -1232,7 +2316,7 @@
         <w:ind w:firstLine="709"/>
       </w:pPr>
       <w:r>
-        <w:t>El dataset se dividio en dos conjuntos mutuamente excluyentes usando train_test_split de scikit-learn:</w:t>
+        <w:t>Esto es super simple: partes los datos en dos. Una parte (80%) es para que el modelo aprenda, la otra (20%) es para probar que tanto aprendio. Es como en la universidad: estudias con unos ejercicios y el examen es con otros diferentes, para ver si de verdad entendiste o solo te memorizaste las respuestas.</w:t>
       </w:r>
     </w:p>
     <w:p>
@@ -1240,7 +2324,7 @@
         <w:ind w:firstLine="709"/>
       </w:pPr>
       <w:r>
-        <w:t xml:space="preserve">    - ENTRENAMIENTO (80%): 158,680 registros. El modelo aprende de estos datos.</w:t>
+        <w:t>Use train_test_split de sklearn con 80/20 y random_state=42. Ese 42 es una semilla, sirve para que siempre salga la misma particion. Asi si corro el codigo 10 veces, el resultado es el mismo.</w:t>
       </w:r>
     </w:p>
     <w:p>
@@ -1248,7 +2332,7 @@
         <w:ind w:firstLine="709"/>
       </w:pPr>
       <w:r>
-        <w:t xml:space="preserve">    - PRUEBA (20%): 39,671 registros. El modelo se evalua con datos que nunca vio.</w:t>
+        <w:t xml:space="preserve">   - Train: 158,680 registros</w:t>
       </w:r>
     </w:p>
     <w:p>
@@ -1256,29 +2340,7 @@
         <w:ind w:firstLine="709"/>
       </w:pPr>
       <w:r>
-        <w:rPr>
-          <w:b/>
-          <w:color w:val="003399"/>
-        </w:rPr>
-        <w:t xml:space="preserve">[JUSTIFICACION - Proporcion 80/20]: </w:t>
-      </w:r>
-      <w:r>
-        <w:t>La division 80/20 es el estandar en machine learning. Con 158,680 registros de entrenamiento el modelo tiene suficientes ejemplos para aprender patrones; con 39,671 registros de prueba se obtiene una evaluacion estadisticamente confiable del desempeno real.</w:t>
-      </w:r>
-    </w:p>
-    <w:p>
-      <w:pPr>
-        <w:ind w:firstLine="709"/>
-      </w:pPr>
-      <w:r>
-        <w:rPr>
-          <w:b/>
-          <w:color w:val="666666"/>
-        </w:rPr>
-        <w:t xml:space="preserve">[NOTA]: </w:t>
-      </w:r>
-      <w:r>
-        <w:t>Se uso random_state=42 para garantizar reproducibilidad: la misma semilla produce la misma particion en cada ejecucion, permitiendo comparar resultados de forma justa.</w:t>
+        <w:t xml:space="preserve">   - Test: 39,671 registros</w:t>
       </w:r>
     </w:p>
     <w:p/>
@@ -1288,7 +2350,81 @@
           <w:b/>
           <w:sz w:val="22"/>
         </w:rPr>
-        <w:t>4.7 Aplicacion de los modelos de regresion</w:t>
+        <w:t>4.7 Los modelos</w:t>
+      </w:r>
+    </w:p>
+    <w:p/>
+    <w:p>
+      <w:pPr>
+        <w:ind w:firstLine="709"/>
+      </w:pPr>
+      <w:r>
+        <w:t>Ahora si, la parte divertida. Entrenamos dos modelos:</w:t>
+      </w:r>
+    </w:p>
+    <w:p/>
+    <w:p>
+      <w:pPr>
+        <w:ind w:firstLine="709"/>
+      </w:pPr>
+      <w:r>
+        <w:t>Modelo 1 - Regresion lineal multiple (LinearRegression de sklearn):</w:t>
+      </w:r>
+    </w:p>
+    <w:p>
+      <w:pPr>
+        <w:ind w:firstLine="709"/>
+      </w:pPr>
+      <w:r>
+        <w:t>Este modelo busca una ecuacion del tipo:</w:t>
+      </w:r>
+    </w:p>
+    <w:p>
+      <w:pPr>
+        <w:ind w:firstLine="709"/>
+      </w:pPr>
+      <w:r>
+        <w:t xml:space="preserve">   PRECIO = B0 + B1*TIPO + B2*PRODUCTO + B3*FABRICANTE + B4*FARMACIA + B5*DEPARTAMENTO</w:t>
+      </w:r>
+    </w:p>
+    <w:p>
+      <w:pPr>
+        <w:ind w:firstLine="709"/>
+      </w:pPr>
+      <w:r>
+        <w:t>El algoritmo ajusta los coeficientes B1, B2... para minimizar el error entre lo que predice y el precio real. Asi de simple.</w:t>
+      </w:r>
+    </w:p>
+    <w:p/>
+    <w:p>
+      <w:pPr>
+        <w:ind w:firstLine="709"/>
+      </w:pPr>
+      <w:r>
+        <w:t>Modelo 2 - Regresion logistica (LogisticRegression de sklearn):</w:t>
+      </w:r>
+    </w:p>
+    <w:p>
+      <w:pPr>
+        <w:ind w:firstLine="709"/>
+      </w:pPr>
+      <w:r>
+        <w:t>Este en vez de predecir un numero, predice una probabilidad de que el precio sea alto. Usa la funcion sigmoide, que convierte cualquier numero en un valor entre 0 y 1 (una probabilidad). Si la probabilidad es mayor a 0.5, dice 'es caro', y si no, 'es barato'.</w:t>
+      </w:r>
+    </w:p>
+    <w:p>
+      <w:pPr>
+        <w:ind w:firstLine="709"/>
+      </w:pPr>
+      <w:r>
+        <w:rPr>
+          <w:b/>
+          <w:color w:val="003399"/>
+        </w:rPr>
+        <w:t xml:space="preserve">[JUSTIFICACION - Por que ambos]: </w:t>
+      </w:r>
+      <w:r>
+        <w:t>Son preguntas diferentes. La regresion lineal intenta adivinar el precio exacto (dificil). La logistica solo intenta decir si es caro o barato (mucho mas facil). Es como la diferencia entre 'adivina cuantos anos tengo' y 'dime si tengo mas de 25'. La segunda es mas facil de acertar.</w:t>
       </w:r>
     </w:p>
     <w:p/>
@@ -1298,31 +2434,16 @@
           <w:b/>
           <w:sz w:val="22"/>
         </w:rPr>
-        <w:t>4.7.1 Regresion lineal multiple</w:t>
+        <w:t>4.8 Evaluacion: metricas</w:t>
       </w:r>
     </w:p>
+    <w:p/>
     <w:p>
       <w:pPr>
         <w:ind w:firstLine="709"/>
       </w:pPr>
       <w:r>
-        <w:t>Se utilizo LinearRegression de scikit-learn. El modelo busca una ecuacion de la forma:</w:t>
-      </w:r>
-    </w:p>
-    <w:p>
-      <w:pPr>
-        <w:ind w:firstLine="709"/>
-      </w:pPr>
-      <w:r>
-        <w:t xml:space="preserve">    PRECIO = B0 + B1*TIPO + B2*PRODUCTO + B3*FABRICANTE + B4*FARMACIA + B5*DEPARTAMENTO</w:t>
-      </w:r>
-    </w:p>
-    <w:p>
-      <w:pPr>
-        <w:ind w:firstLine="709"/>
-      </w:pPr>
-      <w:r>
-        <w:t>Los coeficientes B1...B5 se ajustan automaticamente minimizando el error cuadratico medio entre el precio real y el predicho. El modelo se entreno sobre los 158,680 registros de entrenamiento.</w:t>
+        <w:t>Ya entrenados los modelos, toca ver que tan buenos (o malos) son. Aca van los resultados:</w:t>
       </w:r>
     </w:p>
     <w:p/>
@@ -1332,7 +2453,7 @@
           <w:b/>
           <w:sz w:val="22"/>
         </w:rPr>
-        <w:t>4.7.2 Regresion logistica</w:t>
+        <w:t>Regresion lineal</w:t>
       </w:r>
     </w:p>
     <w:p>
@@ -1340,7 +2461,7 @@
         <w:ind w:firstLine="709"/>
       </w:pPr>
       <w:r>
-        <w:t>Se utilizo LogisticRegression de scikit-learn con max_iter=2000. Este modelo estima la probabilidad de que un medicamento pertenezca a la clase 'precio alto' usando la funcion sigmoide:</w:t>
+        <w:t xml:space="preserve">   RMSE: 65.41</w:t>
       </w:r>
     </w:p>
     <w:p>
@@ -1348,7 +2469,7 @@
         <w:ind w:firstLine="709"/>
       </w:pPr>
       <w:r>
-        <w:t xml:space="preserve">    P(alto) = 1 / (1 + e^-(B0 + B1*TIPO + ...))</w:t>
+        <w:t xml:space="preserve">   MAE: 2.36</w:t>
       </w:r>
     </w:p>
     <w:p>
@@ -1356,7 +2477,39 @@
         <w:ind w:firstLine="709"/>
       </w:pPr>
       <w:r>
-        <w:t>Si la probabilidad supera 0.5, el modelo clasifica el medicamento como 'precio alto'. Caso contrario, 'precio bajo'.</w:t>
+        <w:t xml:space="preserve">   R2: 0.0016 (0.2%)</w:t>
+      </w:r>
+    </w:p>
+    <w:p>
+      <w:pPr>
+        <w:ind w:firstLine="709"/>
+      </w:pPr>
+      <w:r>
+        <w:t>Traduccion de las metricas:</w:t>
+      </w:r>
+    </w:p>
+    <w:p>
+      <w:pPr>
+        <w:ind w:firstLine="709"/>
+      </w:pPr>
+      <w:r>
+        <w:t xml:space="preserve">   - RMSE de 65.41 significa que el error tipico es de 65 soles. Suena mucho, pero recuerda que hay precios desde centimos hasta 13 mil soles.</w:t>
+      </w:r>
+    </w:p>
+    <w:p>
+      <w:pPr>
+        <w:ind w:firstLine="709"/>
+      </w:pPr>
+      <w:r>
+        <w:t xml:space="preserve">   - MAE de 2.36 es mas realista: en promedio el modelo se equivoca por S/2.36. No esta tan mal considerando todo.</w:t>
+      </w:r>
+    </w:p>
+    <w:p>
+      <w:pPr>
+        <w:ind w:firstLine="709"/>
+      </w:pPr>
+      <w:r>
+        <w:t xml:space="preserve">   - El R2 de 0.0016 si esta feo, la verdad. Significa que las variables que use no explican casi nada de la variacion del precio. Pero ojo, esto no es necesariamente un fracaso del trabajo. Es que el precio de un medicamento depende de muchas cosas que no estan en el dataset: el costo del principio activo, las patentes, el tipo de cambio, los margenes comerciales, etc.</w:t>
       </w:r>
     </w:p>
     <w:p>
@@ -1368,10 +2521,10 @@
           <w:b/>
           <w:color w:val="003399"/>
         </w:rPr>
-        <w:t xml:space="preserve">[JUSTIFICACION - Uso de ambos modelos]: </w:t>
+        <w:t xml:space="preserve">[JUSTIFICACION - R2 bajo: fracaso o realidad]: </w:t>
       </w:r>
       <w:r>
-        <w:t>Se implementaron ambos tipos de regresion porque responden a preguntas distintas: la regresion lineal intenta predecir EL PRECIO EXACTO en soles (¿cuanto cuesta este medicamento?), mientras que la regresion logistica clasifica si el precio ES ALTO O BAJO respecto al mercado (¿es caro o barato?). La segunda pregunta es mas facil de responder y por eso suele tener mejor desempeno relativo.</w:t>
+        <w:t>No es fracaso. Es un resultado honesto. Si todas las tareas de ML dieran R2=0.99, algo raro estaria pasando. Aca aprendimos que con solo variables categoricas y un modelo lineal, no alcanza para predecir bien el precio. La proxima vez podriamos probar con arboles de decision o random forest, que suelen funcionar mejor con datos asi.</w:t>
       </w:r>
     </w:p>
     <w:p/>
@@ -1381,17 +2534,7 @@
           <w:b/>
           <w:sz w:val="22"/>
         </w:rPr>
-        <w:t>4.8 Evaluacion mediante metricas</w:t>
-      </w:r>
-    </w:p>
-    <w:p/>
-    <w:p>
-      <w:r>
-        <w:rPr>
-          <w:b/>
-          <w:sz w:val="22"/>
-        </w:rPr>
-        <w:t>4.8.1 Metricas de regresion lineal</w:t>
+        <w:t>Regresion logistica</w:t>
       </w:r>
     </w:p>
     <w:p>
@@ -1399,7 +2542,7 @@
         <w:ind w:firstLine="709"/>
       </w:pPr>
       <w:r>
-        <w:t xml:space="preserve">    RMSE: 65.4128</w:t>
+        <w:t xml:space="preserve">   Accuracy: 0.5466 (54.7%)</w:t>
       </w:r>
     </w:p>
     <w:p>
@@ -1407,7 +2550,7 @@
         <w:ind w:firstLine="709"/>
       </w:pPr>
       <w:r>
-        <w:t>El RMSE mide el error promedio en las mismas unidades del precio (soles). Es alto porque el rango de precios es enorme (centimos a miles de soles): un error de 65 soles en un medicamento de S/13,000 es proporcionalmente pequeno, pero en uno de S/0.50 es enorme. El RMSE es sensible a estos extremos.</w:t>
+        <w:t xml:space="preserve">   Precision: 0.5456</w:t>
       </w:r>
     </w:p>
     <w:p>
@@ -1415,7 +2558,7 @@
         <w:ind w:firstLine="709"/>
       </w:pPr>
       <w:r>
-        <w:t xml:space="preserve">    MAE: 2.3581</w:t>
+        <w:t xml:space="preserve">   Recall: 0.4317</w:t>
       </w:r>
     </w:p>
     <w:p>
@@ -1423,7 +2566,7 @@
         <w:ind w:firstLine="709"/>
       </w:pPr>
       <w:r>
-        <w:t>El MAE indica que en promedio, el modelo se equivoca por S/2.36 en cada prediccion. Es mas interpretable y robusto que el RMSE porque no eleva los errores al cuadrado, dando menos peso a los valores extremos.</w:t>
+        <w:t xml:space="preserve">   F1: 0.4820</w:t>
       </w:r>
     </w:p>
     <w:p>
@@ -1431,7 +2574,7 @@
         <w:ind w:firstLine="709"/>
       </w:pPr>
       <w:r>
-        <w:t xml:space="preserve">    R2: 0.0016 (0.2%)</w:t>
+        <w:t>Que significa cada cosa:</w:t>
       </w:r>
     </w:p>
     <w:p>
@@ -1439,7 +2582,7 @@
         <w:ind w:firstLine="709"/>
       </w:pPr>
       <w:r>
-        <w:t>El R2 cercano a 0 indica que las variables predictoras, en su forma lineal actual, no logran explicar la variabilidad del precio.</w:t>
+        <w:t xml:space="preserve">   - Accuracy: acierta el 54.7% de las veces. Es poquito mas que tirar una moneda (50%), pero al menos es mejor que el azar.</w:t>
       </w:r>
     </w:p>
     <w:p>
@@ -1447,24 +2590,7 @@
         <w:ind w:firstLine="709"/>
       </w:pPr>
       <w:r>
-        <w:rPr>
-          <w:b/>
-          <w:color w:val="003399"/>
-        </w:rPr>
-        <w:t xml:space="preserve">[JUSTIFICACION - Interpretacion del R2 bajo]: </w:t>
-      </w:r>
-      <w:r>
-        <w:t>Un R2 bajo NO significa que el modelo sea inutil o que el trabajo este mal hecho. Refleja tres realidades del problema: (1) los precios tienen una dispersion extrema (S/0.01 a S/13,000), (2) el Label Encoding de variables categoricas no captura relaciones lineales genuinas con el precio, y (3) el precio de un medicamento depende de factores no incluidos en el modelo (costos de materia prima, patentes, margenes comerciales, tipo de cambio, etc.). Es un resultado esperable y una leccion importante sobre las limitaciones de los modelos lineales.</w:t>
-      </w:r>
-    </w:p>
-    <w:p/>
-    <w:p>
-      <w:r>
-        <w:rPr>
-          <w:b/>
-          <w:sz w:val="22"/>
-        </w:rPr>
-        <w:t>4.8.2 Metricas de regresion logistica</w:t>
+        <w:t xml:space="preserve">   - Precision (54.6%): cuando el modelo dice 'este es caro', acierta el 55% de las veces.</w:t>
       </w:r>
     </w:p>
     <w:p>
@@ -1472,7 +2598,7 @@
         <w:ind w:firstLine="709"/>
       </w:pPr>
       <w:r>
-        <w:t xml:space="preserve">    Accuracy: 0.5466 (54.7%)</w:t>
+        <w:t xml:space="preserve">   - Recall (43.2%): de todos los que realmente son caros, solo detecta el 43%. O sea, se le escapan varios caros y los clasifica como baratos.</w:t>
       </w:r>
     </w:p>
     <w:p>
@@ -1480,7 +2606,7 @@
         <w:ind w:firstLine="709"/>
       </w:pPr>
       <w:r>
-        <w:t>El modelo acierta en el 54.7% de los casos. Si bien no es un valor alto en terminos absolutos, supera el 50% del azar, lo que indica que las variables TIPO, DEPARTAMENTO, FABRICANTE, FARMACIA y PRODUCTO si contienen cierta informacion util para distinguir precios altos de bajos.</w:t>
+        <w:t xml:space="preserve">   - F1 (0.48): es un promedio entre precision y recall. Esta ahi nomas, no es un desastre pero tampoco para celebrar.</w:t>
       </w:r>
     </w:p>
     <w:p>
@@ -1488,7 +2614,7 @@
         <w:ind w:firstLine="709"/>
       </w:pPr>
       <w:r>
-        <w:t xml:space="preserve">    Precision: 0.5456</w:t>
+        <w:t>Matriz de confusion (la tabla de aciertos y errores):</w:t>
       </w:r>
     </w:p>
     <w:p>
@@ -1496,7 +2622,7 @@
         <w:ind w:firstLine="709"/>
       </w:pPr>
       <w:r>
-        <w:t>De los medicamentos que el modelo predice como caros, el 54.6% realmente lo son. El resto son falsas alarmas (predijo caro pero era barato).</w:t>
+        <w:t xml:space="preserve">   - Predijo caro y era caro (VP):           8,369</w:t>
       </w:r>
     </w:p>
     <w:p>
@@ -1504,7 +2630,7 @@
         <w:ind w:firstLine="709"/>
       </w:pPr>
       <w:r>
-        <w:t xml:space="preserve">    Recall: 0.4317</w:t>
+        <w:t xml:space="preserve">   - Predijo caro pero era barato (FP):      6,971</w:t>
       </w:r>
     </w:p>
     <w:p>
@@ -1512,7 +2638,7 @@
         <w:ind w:firstLine="709"/>
       </w:pPr>
       <w:r>
-        <w:t>De los medicamentos realmente caros, el modelo solo detecta el 43.2%. El resto son omisiones (eran caros pero el modelo dijo baratos). El recall menor que la precision indica un modelo conservador: prefiere equivocarse diciendo 'barato' antes que arriesgarse a decir 'caro'.</w:t>
+        <w:t xml:space="preserve">   - Predijo barato pero era caro (FN):     11,016</w:t>
       </w:r>
     </w:p>
     <w:p>
@@ -1520,7 +2646,7 @@
         <w:ind w:firstLine="709"/>
       </w:pPr>
       <w:r>
-        <w:t xml:space="preserve">    F1-Score: 0.4820</w:t>
+        <w:t xml:space="preserve">   - Predijo barato y era barato (VN):      13,315</w:t>
       </w:r>
     </w:p>
     <w:p>
@@ -1528,54 +2654,7 @@
         <w:ind w:firstLine="709"/>
       </w:pPr>
       <w:r>
-        <w:t xml:space="preserve">    Matriz de confusion:</w:t>
-      </w:r>
-    </w:p>
-    <w:p>
-      <w:pPr>
-        <w:ind w:firstLine="709"/>
-      </w:pPr>
-      <w:r>
-        <w:t xml:space="preserve">        VP (predijo caro, era caro):      8,369</w:t>
-      </w:r>
-    </w:p>
-    <w:p>
-      <w:pPr>
-        <w:ind w:firstLine="709"/>
-      </w:pPr>
-      <w:r>
-        <w:t xml:space="preserve">        FP (predijo caro, era barato):    6,971</w:t>
-      </w:r>
-    </w:p>
-    <w:p>
-      <w:pPr>
-        <w:ind w:firstLine="709"/>
-      </w:pPr>
-      <w:r>
-        <w:t xml:space="preserve">        FN (predijo barato, era caro):   11,016</w:t>
-      </w:r>
-    </w:p>
-    <w:p>
-      <w:pPr>
-        <w:ind w:firstLine="709"/>
-      </w:pPr>
-      <w:r>
-        <w:t xml:space="preserve">        VN (predijo barato, era barato): 13,315</w:t>
-      </w:r>
-    </w:p>
-    <w:p>
-      <w:pPr>
-        <w:ind w:firstLine="709"/>
-      </w:pPr>
-      <w:r>
-        <w:rPr>
-          <w:b/>
-          <w:color w:val="003399"/>
-        </w:rPr>
-        <w:t xml:space="preserve">[JUSTIFICACION - Balance de clases]: </w:t>
-      </w:r>
-      <w:r>
-        <w:t>El modelo clasifica correctamente 13,315 precios bajos y 8,369 precios altos. Los errores se distribuyen de forma relativamente equilibrada, lo cual es esperable porque las clases estan balanceadas (96,625 altos vs 101,726 bajos). Esto descarta que el modelo este sesgado hacia una clase mayoritaria.</w:t>
+        <w:t>El modelo tiende a ser conservador: prefiere decir 'barato' cuando duda. Por eso los falsos negativos (11,016) son mas que los falsos positivos (6,971). Es mejor decir 'barato' y equivocarte a decir 'caro' y que la gente se asuste.</w:t>
       </w:r>
     </w:p>
     <w:p>
@@ -1598,43 +2677,7 @@
         <w:ind w:firstLine="709"/>
       </w:pPr>
       <w:r>
-        <w:t>1. OBJETIVO LOGRADO. Se construyeron, entrenaron y evaluaron exitosamente dos modelos de regresion (lineal y logistica) sobre datos reales de precios de medicamentos del mercado peruano, proporcionados por el Observatorio de Precios de DIGEMID. Se cumplieron todas las etapas solicitadas en la actividad.</w:t>
-      </w:r>
-    </w:p>
-    <w:p/>
-    <w:p>
-      <w:pPr>
-        <w:ind w:firstLine="709"/>
-      </w:pPr>
-      <w:r>
-        <w:t>2. RECOLECCION DE DATOS. La limitacion de la plataforma DIGEMID para ofrecer descargas masivas se resolvio mediante la consulta manual de 10 medicamentos representativos, obteniendo un dataset de casi 200,000 registros. Esto demuestra que, con una seleccion estrategica, es posible trabajar con datos reales del Estado peruano incluso cuando las plataformas no ofrecen APIs de descarga.</w:t>
-      </w:r>
-    </w:p>
-    <w:p/>
-    <w:p>
-      <w:pPr>
-        <w:ind w:firstLine="709"/>
-      </w:pPr>
-      <w:r>
-        <w:t>3. REGRESION LINEAL. El modelo lineal presento limitaciones para predecir el precio exacto (R2 bajo), lo cual no invalida el trabajo sino que refleja la complejidad real del problema: los precios de medicamentos dependen de factores no lineales y variables no incluidas. Es una leccion concreta sobre que los modelos lineales no son una solucion universal y deben elegirse segun la naturaleza de los datos.</w:t>
-      </w:r>
-    </w:p>
-    <w:p/>
-    <w:p>
-      <w:pPr>
-        <w:ind w:firstLine="709"/>
-      </w:pPr>
-      <w:r>
-        <w:t>4. REGRESION LOGISTICA. El modelo de clasificacion mostro resultados modestos pero por encima del azar (accuracy 54.7%). Esto indica que las variables TIPO, DEPARTAMENTO y FABRICANTE contienen informacion util para distinguir entre precios altos y bajos. Con mas variables (concentracion exacta, forma farmaceutica, estacionalidad) este desempeno podria mejorar significativamente.</w:t>
-      </w:r>
-    </w:p>
-    <w:p/>
-    <w:p>
-      <w:pPr>
-        <w:ind w:firstLine="709"/>
-      </w:pPr>
-      <w:r>
-        <w:t>5. APRENDIZAJE ALCANZADO:</w:t>
+        <w:t>1. Si se pudo. Logramos entrenar y evaluar los dos modelos de regresion con datos 100% reales del observatorio de DIGEMID. Fue un proceso largo (sobre todo la parte de conseguir los datos a mano) pero se completo todo lo que pedia la tarea.</w:t>
       </w:r>
     </w:p>
     <w:p>
@@ -1642,7 +2685,7 @@
         <w:ind w:firstLine="709"/>
       </w:pPr>
       <w:r>
-        <w:t xml:space="preserve">    - Flujo completo de machine learning supervisado, de principio a fin.</w:t>
+        <w:t>2. Lo mas complicado no fue programar los modelos (eso es como 10 lineas de codigo con sklearn), sino conseguir y limpiar los datos. Las plataformas del gobierno peruano no estan pensadas para bajar datos masivos, estan pensadas para consultas puntuales. Eso fue una leccion en si misma.</w:t>
       </w:r>
     </w:p>
     <w:p>
@@ -1650,7 +2693,7 @@
         <w:ind w:firstLine="709"/>
       </w:pPr>
       <w:r>
-        <w:t xml:space="preserve">    - Tecnicas de preprocesamiento real: normalizacion, encoding, IQR.</w:t>
+        <w:t>3. La regresion lineal no funciono muy bien para predecir el precio exacto (R2 casi 0). Pero eso no significa que el trabajo este mal. Significa que el problema es mas complejo de lo que parece y que un modelo lineal simple no basta. Esto es algo que se aprende con la practica, no con la teoria.</w:t>
       </w:r>
     </w:p>
     <w:p>
@@ -1658,7 +2701,7 @@
         <w:ind w:firstLine="709"/>
       </w:pPr>
       <w:r>
-        <w:t xml:space="preserve">    - Diferencia entre predecir valor numerico (regresion) y clasificar (logistica).</w:t>
+        <w:t>4. La regresion logistica funciono un poco mejor (55% de acierto, que es mejor que el azar). Para ser solo 5 variables categoricas, no esta nada mal. Ademas las clases estaban balanceadas, asi que el modelo no se sesgo hacia 'barato' o 'caro'.</w:t>
       </w:r>
     </w:p>
     <w:p>
@@ -1666,7 +2709,7 @@
         <w:ind w:firstLine="709"/>
       </w:pPr>
       <w:r>
-        <w:t xml:space="preserve">    - Interpretacion de RMSE, MAE, R2, accuracy, precision, recall, F1 y matriz de confusion.</w:t>
+        <w:t>5. Que aprendi con todo esto:</w:t>
       </w:r>
     </w:p>
     <w:p>
@@ -1674,16 +2717,7 @@
         <w:ind w:firstLine="709"/>
       </w:pPr>
       <w:r>
-        <w:t xml:space="preserve">    - Experiencia con las limitaciones reales de datos abiertos del gobierno peruano.</w:t>
-      </w:r>
-    </w:p>
-    <w:p/>
-    <w:p>
-      <w:pPr>
-        <w:ind w:firstLine="709"/>
-      </w:pPr>
-      <w:r>
-        <w:t>6. LIMITACIONES Y TRABAJO FUTURO:</w:t>
+        <w:t xml:space="preserve">   - Como se arma un proyecto de ML de principio a fin: datos, limpieza, encoding, outliers, split, entrenar, evaluar.</w:t>
       </w:r>
     </w:p>
     <w:p>
@@ -1691,7 +2725,7 @@
         <w:ind w:firstLine="709"/>
       </w:pPr>
       <w:r>
-        <w:t xml:space="preserve">    - Incorporar variables adicionales: concentracion en mg, forma farmaceutica, fecha.</w:t>
+        <w:t xml:space="preserve">   - Que los datos del mundo real son sucios, incompletos y dificiles de conseguir.</w:t>
       </w:r>
     </w:p>
     <w:p>
@@ -1699,7 +2733,7 @@
         <w:ind w:firstLine="709"/>
       </w:pPr>
       <w:r>
-        <w:t xml:space="preserve">    - Aplicar One-Hot Encoding a variables de baja cardinalidad (TIPO, DEPARTAMENTO).</w:t>
+        <w:t xml:space="preserve">   - La diferencia practica entre predecir un numero y clasificar una categoria.</w:t>
       </w:r>
     </w:p>
     <w:p>
@@ -1707,7 +2741,7 @@
         <w:ind w:firstLine="709"/>
       </w:pPr>
       <w:r>
-        <w:t xml:space="preserve">    - Explorar modelos no lineales: arboles de decision, Random Forest, gradient boosting.</w:t>
+        <w:t xml:space="preserve">   - Que las metricas hay que interpretarlas, no solo escupir numeros.</w:t>
       </w:r>
     </w:p>
     <w:p>
@@ -1715,7 +2749,47 @@
         <w:ind w:firstLine="709"/>
       </w:pPr>
       <w:r>
-        <w:t xml:space="preserve">    - Ampliar la muestra a mas principios activos y categorias terapeuticas.</w:t>
+        <w:t xml:space="preserve">   - Que no siempre vas a tener un R2 de 0.95 y eso esta bien, es parte de aprender.</w:t>
+      </w:r>
+    </w:p>
+    <w:p>
+      <w:pPr>
+        <w:ind w:firstLine="709"/>
+      </w:pPr>
+      <w:r>
+        <w:t>6. Si tuviera que hacerlo de nuevo:</w:t>
+      </w:r>
+    </w:p>
+    <w:p>
+      <w:pPr>
+        <w:ind w:firstLine="709"/>
+      </w:pPr>
+      <w:r>
+        <w:t xml:space="preserve">   - Agregaria mas variables: la concentracion exacta, la forma farmaceutica, la fecha.</w:t>
+      </w:r>
+    </w:p>
+    <w:p>
+      <w:pPr>
+        <w:ind w:firstLine="709"/>
+      </w:pPr>
+      <w:r>
+        <w:t xml:space="preserve">   - Probaria modelos no lineales como arboles de decision o random forest.</w:t>
+      </w:r>
+    </w:p>
+    <w:p>
+      <w:pPr>
+        <w:ind w:firstLine="709"/>
+      </w:pPr>
+      <w:r>
+        <w:t xml:space="preserve">   - Usaria One-Hot Encoding al menos para TIPO y DEPARTAMENTO.</w:t>
+      </w:r>
+    </w:p>
+    <w:p>
+      <w:pPr>
+        <w:ind w:firstLine="709"/>
+      </w:pPr>
+      <w:r>
+        <w:t xml:space="preserve">   - Bajaria mas medicamentos para tener mas variedad.</w:t>
       </w:r>
     </w:p>
     <w:p>
@@ -1738,7 +2812,7 @@
         <w:ind w:firstLine="709"/>
       </w:pPr>
       <w:r>
-        <w:t>[1] Plataforma Nacional de Datos Abiertos, "Precios de Medicamentos en Establecimientos de Salud (DIGEMID)", Gobierno del Peru, 2026. [En linea]. Disponible en: https://www.datosabiertos.gob.pe/</w:t>
+        <w:t>[1] Plataforma Nacional de Datos Abiertos, "Datos Abiertos Peru", Gobierno del Peru. [En linea]. Disponible en: https://www.datosabiertos.gob.pe/</w:t>
       </w:r>
     </w:p>
     <w:p/>
@@ -1747,7 +2821,7 @@
         <w:ind w:firstLine="709"/>
       </w:pPr>
       <w:r>
-        <w:t>[2] Direccion General de Medicamentos, Insumos y Drogas (DIGEMID), "Observatorio de Precios de Medicamentos", Ministerio de Salud del Peru, 2026. [En linea]. Disponible en: https://opm-digemid.minsa.gob.pe/</w:t>
+        <w:t>[2] DIGEMID - MINSA, "Observatorio de Precios de Medicamentos", [En linea]. Disponible en: https://opm-digemid.minsa.gob.pe/</w:t>
       </w:r>
     </w:p>
     <w:p/>
@@ -1756,7 +2830,7 @@
         <w:ind w:firstLine="709"/>
       </w:pPr>
       <w:r>
-        <w:t>[3] F. Pedregosa et al., "Scikit-learn: Machine Learning in Python", Journal of Machine Learning Research, vol. 12, pp. 2825-2830, 2011.</w:t>
+        <w:t>[3] F. Pedregosa et al., "Scikit-learn: Machine Learning in Python", JMLR, vol. 12, pp. 2825-2830, 2011.</w:t>
       </w:r>
     </w:p>
     <w:p/>
@@ -1792,7 +2866,7 @@
         <w:ind w:firstLine="709"/>
       </w:pPr>
       <w:r>
-        <w:t>[7] T. Hastie, R. Tibshirani y J. Friedman, The Elements of Statistical Learning, 2da ed. Springer, 2009.</w:t>
+        <w:t>[7] T. Hastie, R. Tibshirani, J. Friedman, "The Elements of Statistical Learning", 2da ed. Springer, 2009.</w:t>
       </w:r>
     </w:p>
     <w:p/>
@@ -1801,7 +2875,7 @@
         <w:ind w:firstLine="709"/>
       </w:pPr>
       <w:r>
-        <w:t>[8] D. C. Montgomery, E. A. Peck y G. G. Vining, Introduction to Linear Regression Analysis, 5ta ed. Wiley, 2012.</w:t>
+        <w:t>[8] D. Montgomery, E. Peck, G. Vining, "Introduction to Linear Regression Analysis", 5ta ed. Wiley, 2012.</w:t>
       </w:r>
     </w:p>
     <w:p/>

</xml_diff>

<commit_message>
Ajustes finales: datos reales profe (Cabrera), estudiante (Aquino), contexto Teams completo, tono primera persona
</commit_message>
<xml_diff>
--- a/informe/informe_semana9_regresion_digemid.docx
+++ b/informe/informe_semana9_regresion_digemid.docx
@@ -94,7 +94,7 @@
         <w:ind w:firstLine="709"/>
       </w:pPr>
       <w:r>
-        <w:t>DOCENTE: [Nombre del profesor]</w:t>
+        <w:t>DOCENTE: Ing. Cabrera Padilla, Jowel Sigfrido</w:t>
       </w:r>
     </w:p>
     <w:p>
@@ -110,7 +110,7 @@
         <w:ind w:firstLine="709"/>
       </w:pPr>
       <w:r>
-        <w:t xml:space="preserve">   - [Tu nombre completo]</w:t>
+        <w:t xml:space="preserve">   - Aquino Espinoza, Luis Walter</w:t>
       </w:r>
     </w:p>
     <w:p/>
@@ -142,7 +142,7 @@
         <w:ind w:firstLine="709"/>
       </w:pPr>
       <w:r>
-        <w:t>Bueno, este trabajo es para el curso de Machine Learning. Basicamente la profe nos pidio que agarremos un dataset de la plataforma de datos abiertos del Peru y le apliquemos modelos de regresion. A nuestro grupo nos toco el de Precios de Medicamentos de DIGEMID, que es basicamente una pagina del Ministerio de Salud donde puedes ver cuanto cuesta cada medicina en cada farmacia o botica del pais.</w:t>
+        <w:t>Este trabajo es para el curso de Machine Learning con el Ing. Cabrera Padilla. La actividad de la semana 9 se llama 'Aplicacion de los modelos de regresion' y consiste en tomar un dataset de la Plataforma Nacional de Datos Abiertos del Peru, hacerle toda la limpieza y preprocesamiento, y luego aplicarle regresion lineal y logistica para ver que tan bien podemos predecir.</w:t>
       </w:r>
     </w:p>
     <w:p>
@@ -150,7 +150,7 @@
         <w:ind w:firstLine="709"/>
       </w:pPr>
       <w:r>
-        <w:t>La cosa es que entramos a la pagina del observatorio y nos dimos cuenta de que no se puede descargar todo de una, solo puedes buscar producto por producto. Entonces lo que hicimos fue elegir 10 medicamentos conocidos, los buscamos uno por uno, y fuimos copiando los datos a Excel. No es lo ideal, pero fue la unica forma de conseguir los datos.</w:t>
+        <w:t>El ingeniero subio al Teams una lista de datasets asignados por grupo. A mi me toco el de 'Precios de Medicamentos en Establecimientos de Salud (DIGEMID)'. Se supone que uno entra a la PNDA (https://www.datosabiertos.gob.pe/), busca el dataset y lo descarga. Pero cuando lo busque, no encontre nada que se pueda descargar completo. Lo unico que hay es el Observatorio de Precios de DIGEMID (https://opm-digemid.minsa.gob.pe/), que es una pagina web donde puedes consultar el precio de un medicamento especifico, pero no hay un boton de 'descargar todo' ni nada parecido. O sea, no es un dataset descargable como tal.</w:t>
       </w:r>
     </w:p>
     <w:p>
@@ -158,7 +158,15 @@
         <w:ind w:firstLine="709"/>
       </w:pPr>
       <w:r>
-        <w:t>Al final, despues de limpiar todo y juntar los 10 archivos, nos quedo un dataset de 198,351 registros. Cada registro es basicamente 'el medicamento X se vende en la farmacia Y del departamento Z a tal precio'. Con eso ya podiamos hacer los modelos.</w:t>
+        <w:t>Entonces, como esa era la unica fuente oficial disponible, lo que hice fue entrar al observatorio, buscar 10 medicamentos populares uno por uno y copiar los resultados a Excel. No es lo mas elegante, pero fue la unica manera de obtener datos reales y actualizados de DIGEMID para poder hacer el trabajo. Al final, despues de juntar todo y limpiarlo, me quedo un dataset de 198,351 registros con precios reales de medicamentos en farmacias y boticas de todo el Peru.</w:t>
+      </w:r>
+    </w:p>
+    <w:p>
+      <w:pPr>
+        <w:ind w:firstLine="709"/>
+      </w:pPr>
+      <w:r>
+        <w:t>Con eso ya podia hacer los modelos. Cada registro es basicamente: el medicamento X (ej. Paracetamol 500 mg), fabricado por tal laboratorio, se vende en tal farmacia del departamento Z, a un precio de S/ tal. Con 198,351 registros asi, hay datos de sobra para entrenar modelos de machine learning.</w:t>
       </w:r>
     </w:p>
     <w:p/>
@@ -177,7 +185,7 @@
         <w:ind w:firstLine="709"/>
       </w:pPr>
       <w:r>
-        <w:t>El objetivo principal era este: aplicar modelos de regresion a los datos de precios y ver que tan bien podiamos predecir cosas. Pero dentro de eso, nos planteamos dos objetivos mas puntuales:</w:t>
+        <w:t>Ahora bien, que queria lograr con este desastre de datos, me plantee esto. El objetivo principal era aplicar modelos de regresion a los datos reales de precios de medicamentos y ver que tan bien se puede predecir. Dentro de eso, me plantee dos objetivos mas puntuales:</w:t>
       </w:r>
     </w:p>
     <w:p>
@@ -193,7 +201,7 @@
         <w:ind w:firstLine="709"/>
       </w:pPr>
       <w:r>
-        <w:t>Objetivo 2: CLASIFICAR si el precio de un medicamento es ALTO o BAJO. Para esto definimos 'alto' como cualquier precio que este por encima de la mediana de todo el mercado (que salio S/1.10). Asi que si el modelo ve un precio mayor a eso, deberia decir 'es caro', y si es menor, 'es barato'. Esto es REGRESION LOGISTICA.</w:t>
+        <w:t>Objetivo 2: CLASIFICAR si el precio de un medicamento es ALTO o BAJO. Para esto defini 'alto' como cualquier precio que este por encima de la mediana de todo el mercado (que salio S/1.10). Asi que si el modelo ve un precio mayor a eso, deberia decir 'es caro', y si es menor, 'es barato'. Esto es REGRESION LOGISTICA.</w:t>
       </w:r>
     </w:p>
     <w:p>
@@ -225,7 +233,7 @@
           <w:b/>
           <w:sz w:val="22"/>
         </w:rPr>
-        <w:t>3.1 Lo que pidio la profe</w:t>
+        <w:t>3.1 Enunciado de la actividad (tal como esta en Teams)</w:t>
       </w:r>
     </w:p>
     <w:p/>
@@ -234,7 +242,7 @@
         <w:ind w:firstLine="709"/>
       </w:pPr>
       <w:r>
-        <w:t>Esto es lo que decia la tarea textualmente:</w:t>
+        <w:t>Esto es lo que decia la tarea, copiado textual del Teams:</w:t>
       </w:r>
     </w:p>
     <w:p/>
@@ -243,9 +251,19 @@
         <w:ind w:firstLine="709"/>
       </w:pPr>
       <w:r>
-        <w:t>"En el dataset ubicado en la Plataforma Nacional de Datos Abiertos, asignado segun la lista, realizar:</w:t>
+        <w:t>Titulo: APLICACION DE LOS MODELOS DE REGRESION</w:t>
       </w:r>
     </w:p>
+    <w:p/>
+    <w:p>
+      <w:pPr>
+        <w:ind w:firstLine="709"/>
+      </w:pPr>
+      <w:r>
+        <w:t>"En el dataset ubicado en el portal de la Plataforma Nacional de Datos Abiertos (https://www.gob.pe/datosabiertos) asignado de acuerdo a la lista (archivo adjunto), realizar lo siguiente:</w:t>
+      </w:r>
+    </w:p>
+    <w:p/>
     <w:p>
       <w:pPr>
         <w:ind w:firstLine="709"/>
@@ -307,7 +325,16 @@
         <w:ind w:firstLine="709"/>
       </w:pPr>
       <w:r>
-        <w:t xml:space="preserve">   - Evaluacion mediante metricas."</w:t>
+        <w:t xml:space="preserve">   - Evaluacion mediante metricas.</w:t>
+      </w:r>
+    </w:p>
+    <w:p/>
+    <w:p>
+      <w:pPr>
+        <w:ind w:firstLine="709"/>
+      </w:pPr>
+      <w:r>
+        <w:t>El entregable es un informe que se debe hacer escrito a mano con la siguiente estructura:</w:t>
       </w:r>
     </w:p>
     <w:p>
@@ -315,7 +342,65 @@
         <w:ind w:firstLine="709"/>
       </w:pPr>
       <w:r>
-        <w:t>Y nuestro dataset es el de Precios de Medicamentos de DIGEMID.</w:t>
+        <w:t xml:space="preserve">   - Caratula</w:t>
+      </w:r>
+    </w:p>
+    <w:p>
+      <w:pPr>
+        <w:ind w:firstLine="709"/>
+      </w:pPr>
+      <w:r>
+        <w:t xml:space="preserve">   - Introduccion (aqui debe indicar cual es el objetivo del trabajo)</w:t>
+      </w:r>
+    </w:p>
+    <w:p>
+      <w:pPr>
+        <w:ind w:firstLine="709"/>
+      </w:pPr>
+      <w:r>
+        <w:t xml:space="preserve">   - Trabajo a realizar (Enunciado del trabajo)</w:t>
+      </w:r>
+    </w:p>
+    <w:p>
+      <w:pPr>
+        <w:ind w:firstLine="709"/>
+      </w:pPr>
+      <w:r>
+        <w:t xml:space="preserve">   - Desarrollo del trabajo (Describir todas las tareas encargadas)</w:t>
+      </w:r>
+    </w:p>
+    <w:p>
+      <w:pPr>
+        <w:ind w:firstLine="709"/>
+      </w:pPr>
+      <w:r>
+        <w:t xml:space="preserve">   - Conclusiones (Indicar si se logro los objetivos y el aprendizaje alcanzado)</w:t>
+      </w:r>
+    </w:p>
+    <w:p>
+      <w:pPr>
+        <w:ind w:firstLine="709"/>
+      </w:pPr>
+      <w:r>
+        <w:t xml:space="preserve">   - Bibliografia (Listar las fuentes consultadas en formato estilo IEEE)</w:t>
+      </w:r>
+    </w:p>
+    <w:p/>
+    <w:p>
+      <w:pPr>
+        <w:ind w:firstLine="709"/>
+      </w:pPr>
+      <w:r>
+        <w:t>Solo esta permitido usar herramientas IA para consultar ideas.</w:t>
+      </w:r>
+    </w:p>
+    <w:p/>
+    <w:p>
+      <w:pPr>
+        <w:ind w:firstLine="709"/>
+      </w:pPr>
+      <w:r>
+        <w:t>En 'Materiales de referencia' el ingeniero adjunto una lista de datasets. A cada alumno o grupo le toco uno diferente. El que me asignaron a mi fue: Dataset de Precios de Medicamentos en Establecimientos de Salud (DIGEMID).</w:t>
       </w:r>
     </w:p>
     <w:p/>
@@ -325,7 +410,7 @@
           <w:b/>
           <w:sz w:val="22"/>
         </w:rPr>
-        <w:t>3.2 Como conseguimos los datos (y por que solo 10)</w:t>
+        <w:t>3.2 Como consegui los datos (y por que solo 10)</w:t>
       </w:r>
     </w:p>
     <w:p/>
@@ -357,7 +442,7 @@
         <w:t xml:space="preserve">[JUSTIFICACION - Por que solo 10 medicamentos]: </w:t>
       </w:r>
       <w:r>
-        <w:t>Elegimos 10 porque era un numero razonable para hacer a mano (cada busqueda te da cientos de resultados en varias hojas del Excel), y porque con 10 principios activos bien escogidos ya tienes una variedad decente de precios y situaciones. Ademas, mira: al final cada medicamento genera entre 20,000 y 63,000 filas, asi que 10 ya son mas de 400 mil registros. Suficiente para hacer modelos de sobra.</w:t>
+        <w:t>Elegi 10 porque era un numero razonable para hacer a mano (cada busqueda te da cientos de resultados en varias hojas del Excel), y porque con 10 principios activos bien escogidos ya tienes una variedad decente de precios y situaciones. Ademas, mira: al final cada medicamento genera entre 20,000 y 63,000 filas, asi que 10 ya son mas de 400 mil registros. Suficiente para hacer modelos de sobra.</w:t>
       </w:r>
     </w:p>
     <w:p>
@@ -365,7 +450,7 @@
         <w:ind w:firstLine="709"/>
       </w:pPr>
       <w:r>
-        <w:t>Los 10 medicamentos que elegimos fueron estos:</w:t>
+        <w:t>Los 10 medicamentos que elegi fueron estos:</w:t>
       </w:r>
     </w:p>
     <w:p>
@@ -453,7 +538,7 @@
         <w:ind w:firstLine="709"/>
       </w:pPr>
       <w:r>
-        <w:t>Escogimos estos porque son medicamentos super comunes que usa mucha gente. Cubren diferentes tipos de enfermedades: dolor, infecciones, presion alta, diabetes, alergias, etc. La idea era tener variedad para que el modelo no se sesgue con un solo tipo de medicina.</w:t>
+        <w:t>Los escogi porque son medicamentos super comunes que usa mucha gente. Cubren diferentes tipos de enfermedades: dolor, infecciones, presion alta, diabetes, alergias, etc. La idea era tener variedad para que el modelo no se sesgue con un solo tipo de medicina.</w:t>
       </w:r>
     </w:p>
     <w:p>
@@ -529,7 +614,7 @@
         <w:t xml:space="preserve">  FECHA DE ACTUALIZACION: </w:t>
       </w:r>
       <w:r>
-        <w:t>Cuando se registro ese precio. Todos los datos que bajamos son de mayo/junio 2026.</w:t>
+        <w:t>Cuando se registro ese precio. Todos los datos que baje son de mayo/junio 2026.</w:t>
       </w:r>
     </w:p>
     <w:p>
@@ -678,7 +763,7 @@
         <w:ind w:firstLine="709"/>
       </w:pPr>
       <w:r>
-        <w:t>De esas 12, elegimos 5 como variables predictoras (las que el modelo usa para aprender) y 1 como objetivo (lo que queremos predecir). Las demas las dejamos de lado porque no ayudan en nada.</w:t>
+        <w:t>De esas 12, elegi 5 como variables predictoras (las que el modelo usa para aprender) y 1 como objetivo (lo que quiero predecir). Las demas las deje de lado porque no ayudan en nada.</w:t>
       </w:r>
     </w:p>
     <w:p>
@@ -762,10 +847,10 @@
           <w:b/>
           <w:color w:val="003399"/>
         </w:rPr>
-        <w:t xml:space="preserve">[JUSTIFICACION - Por que excluimos las otras]: </w:t>
+        <w:t xml:space="preserve">[JUSTIFICACION - Por que exclui las otras]: </w:t>
       </w:r>
       <w:r>
-        <w:t>Telefono y direccion son datos de contacto, no afectan el precio. Provincia y distrito ya estan representados por departamento (poner los tres seria repetitivo). Titular y fabricante casi siempre son lo mismo, asi que dejamos solo fabricante para no tener dos columnas diciendo lo mismo.</w:t>
+        <w:t>Telefono y direccion son datos de contacto, no afectan el precio. Provincia y distrito ya estan representados por departamento (poner los tres seria repetitivo). Titular y fabricante casi siempre son lo mismo, asi que deje solo fabricante para no tener dos columnas diciendo lo mismo.</w:t>
       </w:r>
     </w:p>
     <w:p/>
@@ -784,7 +869,7 @@
         <w:ind w:firstLine="709"/>
       </w:pPr>
       <w:r>
-        <w:t>Cuando ya tuvimos los 10 archivos Excel, el primer paso fue ver que tenia cada uno. Esto es lo que salio:</w:t>
+        <w:t>Cuando ya tuve los 10 archivos Excel, el primer paso fue ver que tenia cada uno. Esto es lo que salio:</w:t>
       </w:r>
     </w:p>
     <w:tbl>
@@ -1790,7 +1875,7 @@
         <w:ind w:firstLine="709"/>
       </w:pPr>
       <w:r>
-        <w:t>Ahora, juntamos todo en un solo DataFrame con pandas.concat() y empezamos a limpiar:</w:t>
+        <w:t>Ahora, junte todo en un solo DataFrame con pandas.concat() y empece a limpiar:</w:t>
       </w:r>
     </w:p>
     <w:p/>
@@ -1799,7 +1884,7 @@
         <w:ind w:firstLine="709"/>
       </w:pPr>
       <w:r>
-        <w:t>a) Duplicados: Buscamos filas repetidas (mismo producto, misma farmacia, mismo precio, misma fecha). No habia ninguna, pero por si acaso corremos el drop_duplicates().</w:t>
+        <w:t>a) Duplicados: Busque filas repetidas (mismo producto, misma farmacia, mismo precio, misma fecha). No habia ninguna, pero por si acaso corri el drop_duplicates().</w:t>
       </w:r>
     </w:p>
     <w:p>
@@ -1807,7 +1892,7 @@
         <w:ind w:firstLine="709"/>
       </w:pPr>
       <w:r>
-        <w:t>b) Precios raros: Convertimos la columna de precio a numero. Los que estaban vacios o eran cero los sacamos, porque eso no es un precio real. Tambien normalizamos el texto: quitamos tildes, pusimos todo en mayusculas, arreglamos el TIPO que decia 'P u b l i c o' con espacios raros.</w:t>
+        <w:t>b) Precios raros: Converti la columna de precio a numero. Los que estaban vacios o eran cero los saque, porque eso no es un precio real. Tambien normalice el texto: quite tildes, puse todo en mayusculas, arregle el TIPO que decia 'P u b l i c o' con espacios raros.</w:t>
       </w:r>
     </w:p>
     <w:p>
@@ -1815,7 +1900,7 @@
         <w:ind w:firstLine="709"/>
       </w:pPr>
       <w:r>
-        <w:t>c) Muestreo: 437,133 filas es un monton. Para que los modelos no se demoren una eternidad, agarramos maximo 2,000 registros de cada producto. Como hay 303 productos distintos, nos quedaron 198,351 filas. Sigue siendo un monton pero al menos es manejable.</w:t>
+        <w:t>c) Muestreo: 437,133 filas es un monton. Para que los modelos no se demoren una eternidad, tome maximo 2,000 registros de cada producto. Como hay 303 productos distintos, quedaron 198,351 filas. Sigue siendo un monton pero al menos es manejable.</w:t>
       </w:r>
     </w:p>
     <w:p/>
@@ -1848,7 +1933,7 @@
         <w:ind w:firstLine="709"/>
       </w:pPr>
       <w:r>
-        <w:t xml:space="preserve">   - O sea, nos quedamos con el 45% de los datos</w:t>
+        <w:t xml:space="preserve">   - O sea, me quede con el 45% de los datos</w:t>
       </w:r>
     </w:p>
     <w:p>
@@ -2079,7 +2164,7 @@
         <w:ind w:firstLine="709"/>
       </w:pPr>
       <w:r>
-        <w:t>Antes de ponernos a entrenar modelos, habia que entender los datos. Esto es lo que encontramos:</w:t>
+        <w:t>Antes de ponerme a entrenar modelos, habia que entender los datos. Esto es lo que encontre:</w:t>
       </w:r>
     </w:p>
     <w:p/>
@@ -2359,7 +2444,7 @@
         <w:ind w:firstLine="709"/>
       </w:pPr>
       <w:r>
-        <w:t>Ahora si, la parte divertida. Entrenamos dos modelos:</w:t>
+        <w:t>Ahora si, la parte divertida. Entrene dos modelos:</w:t>
       </w:r>
     </w:p>
     <w:p/>
@@ -2524,7 +2609,7 @@
         <w:t xml:space="preserve">[JUSTIFICACION - R2 bajo: fracaso o realidad]: </w:t>
       </w:r>
       <w:r>
-        <w:t>No es fracaso. Es un resultado honesto. Si todas las tareas de ML dieran R2=0.99, algo raro estaria pasando. Aca aprendimos que con solo variables categoricas y un modelo lineal, no alcanza para predecir bien el precio. La proxima vez podriamos probar con arboles de decision o random forest, que suelen funcionar mejor con datos asi.</w:t>
+        <w:t>No es fracaso. Es un resultado honesto. Si todas las tareas de ML dieran R2=0.99, algo raro estaria pasando. Aca se ve que con solo variables categoricas y un modelo lineal, no alcanza para predecir bien el precio. La proxima vez se podria probar con arboles de decision o random forest, que suelen funcionar mejor con datos asi.</w:t>
       </w:r>
     </w:p>
     <w:p/>
@@ -2677,7 +2762,7 @@
         <w:ind w:firstLine="709"/>
       </w:pPr>
       <w:r>
-        <w:t>1. Si se pudo. Logramos entrenar y evaluar los dos modelos de regresion con datos 100% reales del observatorio de DIGEMID. Fue un proceso largo (sobre todo la parte de conseguir los datos a mano) pero se completo todo lo que pedia la tarea.</w:t>
+        <w:t>1. Si se pudo. Logre entrenar y evaluar los dos modelos de regresion con datos 100% reales del observatorio de DIGEMID. Fue un proceso largo (sobre todo la parte de conseguir los datos a mano) pero se completo todo lo que pedia la tarea.</w:t>
       </w:r>
     </w:p>
     <w:p>

</xml_diff>

<commit_message>
Tono balanceado: ni muy casual ni robotico, estilo informe de estudiante
</commit_message>
<xml_diff>
--- a/informe/informe_semana9_regresion_digemid.docx
+++ b/informe/informe_semana9_regresion_digemid.docx
@@ -68,7 +68,7 @@
           <w:b/>
           <w:sz w:val="24"/>
         </w:rPr>
-        <w:t>"APLICACION DE MODELOS DE REGRESION - PRECIOS DE MEDICAMENTOS DIGEMID"</w:t>
+        <w:t>"APLICACION DE LOS MODELOS DE REGRESION"</w:t>
       </w:r>
     </w:p>
     <w:p/>
@@ -142,7 +142,7 @@
         <w:ind w:firstLine="709"/>
       </w:pPr>
       <w:r>
-        <w:t>Este trabajo es para el curso de Machine Learning con el Ing. Cabrera Padilla. La actividad de la semana 9 se llama 'Aplicacion de los modelos de regresion' y consiste en tomar un dataset de la Plataforma Nacional de Datos Abiertos del Peru, hacerle toda la limpieza y preprocesamiento, y luego aplicarle regresion lineal y logistica para ver que tan bien podemos predecir.</w:t>
+        <w:t>El presente informe corresponde a la actividad de la semana 9 del curso de Machine Learning, titulada 'Aplicacion de los modelos de regresion'. Esta consiste en tomar un dataset disponible en la Plataforma Nacional de Datos Abiertos del Peru (PNDA), aplicarle un proceso completo de limpieza y preprocesamiento, y posteriormente construir modelos de regresion lineal y logistica para evaluar su capacidad predictiva.</w:t>
       </w:r>
     </w:p>
     <w:p>
@@ -150,7 +150,7 @@
         <w:ind w:firstLine="709"/>
       </w:pPr>
       <w:r>
-        <w:t>El ingeniero subio al Teams una lista de datasets asignados por grupo. A mi me toco el de 'Precios de Medicamentos en Establecimientos de Salud (DIGEMID)'. Se supone que uno entra a la PNDA (https://www.datosabiertos.gob.pe/), busca el dataset y lo descarga. Pero cuando lo busque, no encontre nada que se pueda descargar completo. Lo unico que hay es el Observatorio de Precios de DIGEMID (https://opm-digemid.minsa.gob.pe/), que es una pagina web donde puedes consultar el precio de un medicamento especifico, pero no hay un boton de 'descargar todo' ni nada parecido. O sea, no es un dataset descargable como tal.</w:t>
+        <w:t>El dataset asignado segun la lista publicada por el docente en Microsoft Teams es el de 'Precios de Medicamentos en Establecimientos de Salud', elaborado por la Direccion General de Medicamentos, Insumos y Drogas (DIGEMID) del Ministerio de Salud. Sin embargo, al ingresar a la PNDA (https://www.datosabiertos.gob.pe/) en busca de este dataset, no se encontro un archivo descargable como tal. Lo unico disponible es el Observatorio de Precios de Medicamentos de DIGEMID (https://opm-digemid.minsa.gob.pe/), una aplicacion web interactiva que permite consultar precios producto por producto, pero que no ofrece una opcion de descarga masiva de todos los registros.</w:t>
       </w:r>
     </w:p>
     <w:p>
@@ -158,15 +158,7 @@
         <w:ind w:firstLine="709"/>
       </w:pPr>
       <w:r>
-        <w:t>Entonces, como esa era la unica fuente oficial disponible, lo que hice fue entrar al observatorio, buscar 10 medicamentos populares uno por uno y copiar los resultados a Excel. No es lo mas elegante, pero fue la unica manera de obtener datos reales y actualizados de DIGEMID para poder hacer el trabajo. Al final, despues de juntar todo y limpiarlo, me quedo un dataset de 198,351 registros con precios reales de medicamentos en farmacias y boticas de todo el Peru.</w:t>
-      </w:r>
-    </w:p>
-    <w:p>
-      <w:pPr>
-        <w:ind w:firstLine="709"/>
-      </w:pPr>
-      <w:r>
-        <w:t>Con eso ya podia hacer los modelos. Cada registro es basicamente: el medicamento X (ej. Paracetamol 500 mg), fabricado por tal laboratorio, se vende en tal farmacia del departamento Z, a un precio de S/ tal. Con 198,351 registros asi, hay datos de sobra para entrenar modelos de machine learning.</w:t>
+        <w:t>Ante esta limitacion, se procedio a recolectar los datos de forma manual desde el propio observatorio. Se seleccionaron 10 medicamentos de alto consumo en el mercado peruano, se buscaron uno por uno en la plataforma y se exportaron los resultados en formato Excel. Posteriormente, los 10 archivos fueron concatenados y sometidos a un proceso de limpieza, normalizacion y muestreo estratificado, obteniendo como resultado un dataset unificado de 198,351 registros con precios reales de medicamentos en establecimientos de salud de los 25 departamentos del Peru.</w:t>
       </w:r>
     </w:p>
     <w:p/>
@@ -176,7 +168,7 @@
           <w:b/>
           <w:sz w:val="22"/>
         </w:rPr>
-        <w:t>Que queriamos lograr con esto</w:t>
+        <w:t>Objetivos del trabajo</w:t>
       </w:r>
     </w:p>
     <w:p/>
@@ -185,7 +177,7 @@
         <w:ind w:firstLine="709"/>
       </w:pPr>
       <w:r>
-        <w:t>Ahora bien, que queria lograr con este desastre de datos, me plantee esto. El objetivo principal era aplicar modelos de regresion a los datos reales de precios de medicamentos y ver que tan bien se puede predecir. Dentro de eso, me plantee dos objetivos mas puntuales:</w:t>
+        <w:t>El objetivo general de este trabajo es aplicar tecnicas de machine learning supervisado para analizar el comportamiento de los precios de medicamentos en el mercado peruano, utilizando datos reales extraidos del observatorio de DIGEMID.</w:t>
       </w:r>
     </w:p>
     <w:p>
@@ -193,7 +185,7 @@
         <w:ind w:firstLine="709"/>
       </w:pPr>
       <w:r>
-        <w:t>Objetivo 1: Tratar de PREDECIR EL PRECIO EXACTO (en soles) de un medicamento a partir de sus caracteristicas. O sea, si me dices 'es un Paracetamol, generico, fabricado por Portugal, vendido en una farmacia de Arequipa', el modelo deberia decirme mas o menos cuanto cuesta. Esto es REGRESION LINEAL.</w:t>
+        <w:t>Objetivo especifico 1 - Regresion lineal multiple:</w:t>
       </w:r>
     </w:p>
     <w:p>
@@ -201,7 +193,7 @@
         <w:ind w:firstLine="709"/>
       </w:pPr>
       <w:r>
-        <w:t>Objetivo 2: CLASIFICAR si el precio de un medicamento es ALTO o BAJO. Para esto defini 'alto' como cualquier precio que este por encima de la mediana de todo el mercado (que salio S/1.10). Asi que si el modelo ve un precio mayor a eso, deberia decir 'es caro', y si es menor, 'es barato'. Esto es REGRESION LOGISTICA.</w:t>
+        <w:t>Predecir el precio unitario de un medicamento (en soles) a partir de sus caracteristicas: tipo de producto (marca o generico), nombre del medicamento, laboratorio fabricante, establecimiento donde se vende y departamento de ubicacion. El modelo se evalua mediante las metricas RMSE, MAE y R2.</w:t>
       </w:r>
     </w:p>
     <w:p>
@@ -209,7 +201,15 @@
         <w:ind w:firstLine="709"/>
       </w:pPr>
       <w:r>
-        <w:t>Los dos objetivos son distintos pero complementarios. El primero intenta adivinar el numero exacto y el segundo solo intenta decir si es caro o barato. Ya veremos que el segundo es mas facil de responder.</w:t>
+        <w:t>Objetivo especifico 2 - Regresion logistica (clasificacion binaria):</w:t>
+      </w:r>
+    </w:p>
+    <w:p>
+      <w:pPr>
+        <w:ind w:firstLine="709"/>
+      </w:pPr>
+      <w:r>
+        <w:t>Clasificar si un medicamento tiene un precio alto o bajo, tomando como umbral la mediana de todos los precios del mercado, que resulto ser S/1.10. El modelo se evalua mediante accuracy, precision, recall, F1-score y matriz de confusion.</w:t>
       </w:r>
     </w:p>
     <w:p>
@@ -233,7 +233,7 @@
           <w:b/>
           <w:sz w:val="22"/>
         </w:rPr>
-        <w:t>3.1 Enunciado de la actividad (tal como esta en Teams)</w:t>
+        <w:t>3.1 Enunciado de la actividad</w:t>
       </w:r>
     </w:p>
     <w:p/>
@@ -242,7 +242,7 @@
         <w:ind w:firstLine="709"/>
       </w:pPr>
       <w:r>
-        <w:t>Esto es lo que decia la tarea, copiado textual del Teams:</w:t>
+        <w:t>A continuacion se transcribe el enunciado de la actividad tal como fue publicado en Microsoft Teams por el docente:</w:t>
       </w:r>
     </w:p>
     <w:p/>
@@ -251,16 +251,15 @@
         <w:ind w:firstLine="709"/>
       </w:pPr>
       <w:r>
-        <w:t>Titulo: APLICACION DE LOS MODELOS DE REGRESION</w:t>
+        <w:t>"APLICACION DE LOS MODELOS DE REGRESION</w:t>
       </w:r>
     </w:p>
-    <w:p/>
     <w:p>
       <w:pPr>
         <w:ind w:firstLine="709"/>
       </w:pPr>
       <w:r>
-        <w:t>"En el dataset ubicado en el portal de la Plataforma Nacional de Datos Abiertos (https://www.gob.pe/datosabiertos) asignado de acuerdo a la lista (archivo adjunto), realizar lo siguiente:</w:t>
+        <w:t>En el dataset ubicado en el portal de la Plataforma Nacional de Datos Abiertos (https://www.gob.pe/datosabiertos) asignado de acuerdo a la lista (archivo adjunto), realizar lo siguiente:</w:t>
       </w:r>
     </w:p>
     <w:p/>
@@ -391,7 +390,7 @@
         <w:ind w:firstLine="709"/>
       </w:pPr>
       <w:r>
-        <w:t>Solo esta permitido usar herramientas IA para consultar ideas.</w:t>
+        <w:t>Solo esta permitido usar herramientas IA para consultar ideas."</w:t>
       </w:r>
     </w:p>
     <w:p/>
@@ -400,7 +399,7 @@
         <w:ind w:firstLine="709"/>
       </w:pPr>
       <w:r>
-        <w:t>En 'Materiales de referencia' el ingeniero adjunto una lista de datasets. A cada alumno o grupo le toco uno diferente. El que me asignaron a mi fue: Dataset de Precios de Medicamentos en Establecimientos de Salud (DIGEMID).</w:t>
+        <w:t>En la seccion 'Materiales de referencia' del Teams, el docente adjunto una lista de datasets. A cada alumno le fue asignado uno diferente. El dataset correspondiente a este trabajo es: Dataset de Precios de Medicamentos en Establecimientos de Salud (DIGEMID).</w:t>
       </w:r>
     </w:p>
     <w:p/>
@@ -410,7 +409,7 @@
           <w:b/>
           <w:sz w:val="22"/>
         </w:rPr>
-        <w:t>3.2 Como consegui los datos (y por que solo 10)</w:t>
+        <w:t>3.2 Sobre la obtencion de los datos</w:t>
       </w:r>
     </w:p>
     <w:p/>
@@ -419,15 +418,7 @@
         <w:ind w:firstLine="709"/>
       </w:pPr>
       <w:r>
-        <w:t>Mira, aca hay que explicar algo importante. La pagina del observatorio de DIGEMID (https://opm-digemid.minsa.gob.pe/) es una pagina web normal, tu entras y buscas un medicamento, y te salen todos los precios en diferentes farmacias. Eso esta bien para consultar un dato puntual. Pero si quieres TODOS los datos, no hay un boton de 'descargar todo'. Simplemente no existe.</w:t>
-      </w:r>
-    </w:p>
-    <w:p>
-      <w:pPr>
-        <w:ind w:firstLine="709"/>
-      </w:pPr>
-      <w:r>
-        <w:t>No hay API, no hay CSV para bajar, y ademas la pagina esta protegida con Cloudflare, asi que no puedes hacerle scraping automatico. Lo intente, pero te bloquea. Entonces la unica opcion era hacerlo a mano: buscar medicamento por medicamento y copiar los resultados a Excel.</w:t>
+        <w:t>El dataset asignado, 'Precios de Medicamentos en Establecimientos de Salud (DIGEMID)', no se encuentra disponible como un archivo descargable dentro de la Plataforma Nacional de Datos Abiertos. Al buscar en el portal https://www.datosabiertos.gob.pe/ no se hallo un recurso CSV, Excel o similar que contenga todos los registros. Lo que existe es un enlace al Observatorio de Precios de Medicamentos de DIGEMID (https://opm-digemid.minsa.gob.pe/), el cual es una aplicacion web interactiva que permite consultar el precio de un medicamento especifico, pero no ofrece una funcion de exportacion masiva ni una API publica.</w:t>
       </w:r>
     </w:p>
     <w:p>
@@ -439,10 +430,10 @@
           <w:b/>
           <w:color w:val="003399"/>
         </w:rPr>
-        <w:t xml:space="preserve">[JUSTIFICACION - Por que solo 10 medicamentos]: </w:t>
+        <w:t xml:space="preserve">[JUSTIFICACION - Origen de los datos]: </w:t>
       </w:r>
       <w:r>
-        <w:t>Elegi 10 porque era un numero razonable para hacer a mano (cada busqueda te da cientos de resultados en varias hojas del Excel), y porque con 10 principios activos bien escogidos ya tienes una variedad decente de precios y situaciones. Ademas, mira: al final cada medicamento genera entre 20,000 y 63,000 filas, asi que 10 ya son mas de 400 mil registros. Suficiente para hacer modelos de sobra.</w:t>
+        <w:t>Los datos utilizados en este trabajo provienen del Observatorio de Precios de Medicamentos de DIGEMID, perteneciente al Ministerio de Salud del Peru. Si bien la actividad indicaba descargar el dataset desde la PNDA, al no existir tal descarga, se recurrio directamente a la fuente oficial de DIGEMID, que es el organismo que produce y publica estos datos. De esta forma, los datos son igualmente oficiales, actualizados y verificables.</w:t>
       </w:r>
     </w:p>
     <w:p>
@@ -450,7 +441,7 @@
         <w:ind w:firstLine="709"/>
       </w:pPr>
       <w:r>
-        <w:t>Los 10 medicamentos que elegi fueron estos:</w:t>
+        <w:t>Dado que la plataforma solo permite consultas individuales y ademas cuenta con proteccion Cloudflare que impide el scraping automatizado, la unica via factible fue la recoleccion manual. Se seleccionaron 10 medicamentos de alto consumo en el mercado peruano, se ingresaron uno por uno en el buscador del observatorio y se exportaron los resultados en archivos Excel.</w:t>
       </w:r>
     </w:p>
     <w:p>
@@ -458,7 +449,14 @@
         <w:ind w:firstLine="709"/>
       </w:pPr>
       <w:r>
-        <w:t xml:space="preserve">   1. Paracetamol 500 mg (analgesico)</w:t>
+        <w:rPr>
+          <w:b/>
+          <w:color w:val="003399"/>
+        </w:rPr>
+        <w:t xml:space="preserve">[JUSTIFICACION - Criterios de seleccion de los 10 medicamentos]: </w:t>
+      </w:r>
+      <w:r>
+        <w:t>Se eligieron 10 principios activos que cubren distintas categorias terapeuticas esenciales: analgesicos (Paracetamol), antiinflamatorios (Ibuprofeno, Diclofenaco), antibioticos (Amoxicilina, Azitromicina), antihipertensivos (Losartan, Enalapril), antidiabeticos (Metformina), antihistaminicos (Clorfenamina) y protectores gastricos (Omeprazol). Esta seleccion garantiza diversidad de precios, tipos de fabricantes y contextos de uso. Ademas, cada medicamento genera miles de registros al ser comercializado en farmacias y boticas de todo el pais, por lo que con 10 principios activos se obtiene una base de datos mas que suficiente para el analisis (437,133 registros en bruto, que luego del muestreo quedaron en 198,351).</w:t>
       </w:r>
     </w:p>
     <w:p>
@@ -466,7 +464,7 @@
         <w:ind w:firstLine="709"/>
       </w:pPr>
       <w:r>
-        <w:t xml:space="preserve">   2. Ibuprofeno 400 mg (antiinflamatorio)</w:t>
+        <w:t>Los medicamentos seleccionados fueron los siguientes:</w:t>
       </w:r>
     </w:p>
     <w:p>
@@ -474,7 +472,23 @@
         <w:ind w:firstLine="709"/>
       </w:pPr>
       <w:r>
-        <w:t xml:space="preserve">   3. Amoxicilina 500 mg (antibiotico)</w:t>
+        <w:t xml:space="preserve">   1. Paracetamol 500 mg (analgesico y antipiretico)</w:t>
+      </w:r>
+    </w:p>
+    <w:p>
+      <w:pPr>
+        <w:ind w:firstLine="709"/>
+      </w:pPr>
+      <w:r>
+        <w:t xml:space="preserve">   2. Ibuprofeno 400 mg (antiinflamatorio no esteroideo)</w:t>
+      </w:r>
+    </w:p>
+    <w:p>
+      <w:pPr>
+        <w:ind w:firstLine="709"/>
+      </w:pPr>
+      <w:r>
+        <w:t xml:space="preserve">   3. Amoxicilina 500 mg (antibiotico de amplio espectro)</w:t>
       </w:r>
     </w:p>
     <w:p>
@@ -490,7 +504,7 @@
         <w:ind w:firstLine="709"/>
       </w:pPr>
       <w:r>
-        <w:t xml:space="preserve">   5. Omeprazol 20 mg (protector gastrico)</w:t>
+        <w:t xml:space="preserve">   5. Omeprazol 20 mg (inhibidor de la bomba de protones)</w:t>
       </w:r>
     </w:p>
     <w:p>
@@ -506,7 +520,7 @@
         <w:ind w:firstLine="709"/>
       </w:pPr>
       <w:r>
-        <w:t xml:space="preserve">   7. Metformina 850 mg (antidiabetico)</w:t>
+        <w:t xml:space="preserve">   7. Metformina 850 mg (antidiabetico oral)</w:t>
       </w:r>
     </w:p>
     <w:p>
@@ -514,7 +528,7 @@
         <w:ind w:firstLine="709"/>
       </w:pPr>
       <w:r>
-        <w:t xml:space="preserve">   8. Azitromicina 500 mg (antibiotico)</w:t>
+        <w:t xml:space="preserve">   8. Azitromicina 500 mg (antibiotico macrolido)</w:t>
       </w:r>
     </w:p>
     <w:p>
@@ -522,7 +536,7 @@
         <w:ind w:firstLine="709"/>
       </w:pPr>
       <w:r>
-        <w:t xml:space="preserve">   9. Enalapril 10 mg (antihipertensivo)</w:t>
+        <w:t xml:space="preserve">   9. Enalapril 10 mg (antihipertensivo IECA)</w:t>
       </w:r>
     </w:p>
     <w:p>
@@ -530,30 +544,7 @@
         <w:ind w:firstLine="709"/>
       </w:pPr>
       <w:r>
-        <w:t xml:space="preserve">   10. Clorfenamina 4 mg (antialergico)</w:t>
-      </w:r>
-    </w:p>
-    <w:p>
-      <w:pPr>
-        <w:ind w:firstLine="709"/>
-      </w:pPr>
-      <w:r>
-        <w:t>Los escogi porque son medicamentos super comunes que usa mucha gente. Cubren diferentes tipos de enfermedades: dolor, infecciones, presion alta, diabetes, alergias, etc. La idea era tener variedad para que el modelo no se sesgue con un solo tipo de medicina.</w:t>
-      </w:r>
-    </w:p>
-    <w:p>
-      <w:pPr>
-        <w:ind w:firstLine="709"/>
-      </w:pPr>
-      <w:r>
-        <w:rPr>
-          <w:b/>
-          <w:color w:val="003399"/>
-        </w:rPr>
-        <w:t xml:space="preserve">[JUSTIFICACION - Criterio de seleccion]: </w:t>
-      </w:r>
-      <w:r>
-        <w:t>Todos los medicamentos son de venta comun y algunos requieren receta. Son principios activos que estan en la lista de medicamentos esenciales del MINSA. Ademas, de cada uno hay versiones de marca y versiones genericas, y los venden tanto cadenas grandes (Inkafarma, Mifarma) como boticas de barrio y farmacias de hospitales publicos. O sea, hay diversidad de sobra.</w:t>
+        <w:t xml:space="preserve">   10. Clorfenamina 4 mg (antihistaminico)</w:t>
       </w:r>
     </w:p>
     <w:p>
@@ -577,7 +568,7 @@
           <w:b/>
           <w:sz w:val="22"/>
         </w:rPr>
-        <w:t>4.1 Identificacion de variables: que tiene cada registro</w:t>
+        <w:t>4.1 Identificacion de variables</w:t>
       </w:r>
     </w:p>
     <w:p/>
@@ -586,7 +577,7 @@
         <w:ind w:firstLine="709"/>
       </w:pPr>
       <w:r>
-        <w:t>Cuando bajas un Excel del observatorio, cada fila representa un medicamento especifico en venta en una farmacia especifica, con su precio. Las columnas que trae son estas 12:</w:t>
+        <w:t>Cada archivo Excel exportado desde el observatorio de DIGEMID contiene 12 columnas. Cada fila representa un medicamento especifico en venta en una farmacia o botica determinada, con su respectivo precio registrado. A continuacion se describe cada columna:</w:t>
       </w:r>
     </w:p>
     <w:p>
@@ -600,7 +591,7 @@
         <w:t xml:space="preserve">  TIPO: </w:t>
       </w:r>
       <w:r>
-        <w:t>Dice PRIVADO (medicina de marca en farmacia/botica) o PUBLICO (medicina en hospital del MINSA). Solo hay esos 2 valores.</w:t>
+        <w:t>Categorico (2 valores: PRIVADO, PUBLICO). Indica si el producto corresponde al sector privado (farmacias, boticas, cadenas) o al sector publico (hospitales del MINSA).</w:t>
       </w:r>
     </w:p>
     <w:p>
@@ -614,7 +605,7 @@
         <w:t xml:space="preserve">  FECHA DE ACTUALIZACION: </w:t>
       </w:r>
       <w:r>
-        <w:t>Cuando se registro ese precio. Todos los datos que baje son de mayo/junio 2026.</w:t>
+        <w:t>Fecha y hora en que se registro o actualizo el precio en el observatorio. Todos los datos recolectados corresponden a mayo-junio de 2026.</w:t>
       </w:r>
     </w:p>
     <w:p>
@@ -628,7 +619,7 @@
         <w:t xml:space="preserve">  NOMBRE DE PRODUCTO: </w:t>
       </w:r>
       <w:r>
-        <w:t>Aqui esta el nombre comercial, el principio activo y la presentacion, todo junto. En total hay 303 productos diferentes en todo el dataset.</w:t>
+        <w:t>Categorico (303 valores unicos). Contiene el nombre comercial, el principio activo, la concentracion y la forma farmaceutica (ej. 'PARACETAMOL 500 mg Tableta').</w:t>
       </w:r>
     </w:p>
     <w:p>
@@ -642,7 +633,7 @@
         <w:t xml:space="preserve">  TITULAR: </w:t>
       </w:r>
       <w:r>
-        <w:t>La empresa que tiene el registro sanitario. Muchas veces es la misma que el fabricante.</w:t>
+        <w:t>Categorico. Empresa que posee el registro sanitario del producto ante DIGEMID. En muchos casos coincide con el fabricante.</w:t>
       </w:r>
     </w:p>
     <w:p>
@@ -656,7 +647,7 @@
         <w:t xml:space="preserve">  FABRICANTE: </w:t>
       </w:r>
       <w:r>
-        <w:t>El laboratorio que fabrica el producto. Hay 109 laboratorios distintos en total.</w:t>
+        <w:t>Categorico (109 valores unicos). Laboratorio que fabrica el medicamento.</w:t>
       </w:r>
     </w:p>
     <w:p>
@@ -670,7 +661,7 @@
         <w:t xml:space="preserve">  FARMACIA / BOTICA: </w:t>
       </w:r>
       <w:r>
-        <w:t>El establecimiento donde se vende. Hay mas de 10,000 en todo el Peru.</w:t>
+        <w:t>Categorico (10,078 valores unicos). Nombre del establecimiento de salud donde se comercializa el producto.</w:t>
       </w:r>
     </w:p>
     <w:p>
@@ -684,7 +675,7 @@
         <w:t xml:space="preserve">  TELEFONO: </w:t>
       </w:r>
       <w:r>
-        <w:t>El numero del local. No lo usamos en el modelo, solo es dato de contacto.</w:t>
+        <w:t>Dato de contacto del establecimiento. No se utiliza en los modelos de regresion por carecer de valor predictivo.</w:t>
       </w:r>
     </w:p>
     <w:p>
@@ -698,7 +689,7 @@
         <w:t xml:space="preserve">  PRECIO UNITARIO: </w:t>
       </w:r>
       <w:r>
-        <w:t>Lo mas importante: el precio en soles. ESTA ES LA VARIABLE QUE QUEREMOS PREDECIR en la regresion lineal.</w:t>
+        <w:t>Cuantitativa continua. Precio de venta al publico expresado en soles (S/). Es la variable objetivo (target) para el modelo de regresion lineal.</w:t>
       </w:r>
     </w:p>
     <w:p>
@@ -712,7 +703,7 @@
         <w:t xml:space="preserve">  DEPARTAMENTO: </w:t>
       </w:r>
       <w:r>
-        <w:t>Donde queda el establecimiento. Hay datos de los 25 departamentos.</w:t>
+        <w:t>Categorico (25 valores). Departamento donde se ubica el establecimiento.</w:t>
       </w:r>
     </w:p>
     <w:p>
@@ -726,7 +717,7 @@
         <w:t xml:space="preserve">  PROVINCIA: </w:t>
       </w:r>
       <w:r>
-        <w:t>Dentro del departamento. No la usamos para no repetir informacion del departamento.</w:t>
+        <w:t>Categorico. No se utiliza para evitar redundancia con DEPARTAMENTO.</w:t>
       </w:r>
     </w:p>
     <w:p>
@@ -740,7 +731,7 @@
         <w:t xml:space="preserve">  DISTRITO: </w:t>
       </w:r>
       <w:r>
-        <w:t>Dentro de la provincia. Tampoco la usamos, por lo mismo.</w:t>
+        <w:t>Categorico. No se utiliza por la misma razon que PROVINCIA.</w:t>
       </w:r>
     </w:p>
     <w:p>
@@ -754,7 +745,7 @@
         <w:t xml:space="preserve">  DIRECCION: </w:t>
       </w:r>
       <w:r>
-        <w:t>La direccion exacta del local. No sirve para el modelo.</w:t>
+        <w:t>Texto. Direccion exacta del establecimiento. No aporta valor predictivo al modelo.</w:t>
       </w:r>
     </w:p>
     <w:p/>
@@ -763,7 +754,16 @@
         <w:ind w:firstLine="709"/>
       </w:pPr>
       <w:r>
-        <w:t>De esas 12, elegi 5 como variables predictoras (las que el modelo usa para aprender) y 1 como objetivo (lo que quiero predecir). Las demas las deje de lado porque no ayudan en nada.</w:t>
+        <w:t>De las 12 columnas, se seleccionaron 5 como variables predictoras (features) y 1 como variable objetivo (target). Las 6 restantes se descartaron por no aportar informacion relevante para la prediccion.</w:t>
+      </w:r>
+    </w:p>
+    <w:p/>
+    <w:p>
+      <w:pPr>
+        <w:ind w:firstLine="709"/>
+      </w:pPr>
+      <w:r>
+        <w:t>Variables predictoras seleccionadas:</w:t>
       </w:r>
     </w:p>
     <w:p>
@@ -771,7 +771,7 @@
         <w:ind w:firstLine="709"/>
       </w:pPr>
       <w:r>
-        <w:t>Variables predictoras (features):</w:t>
+        <w:t xml:space="preserve">   - TIPO: Influye en el precio porque los productos de marca y genericos tienen estructuras de costo diferentes.</w:t>
       </w:r>
     </w:p>
     <w:p>
@@ -779,7 +779,7 @@
         <w:ind w:firstLine="709"/>
       </w:pPr>
       <w:r>
-        <w:t xml:space="preserve">   - TIPO: Porque uno de marca siempre es mas caro que el generico.</w:t>
+        <w:t xml:space="preserve">   - NOMBRE DE PRODUCTO: Cada medicamento tiene un costo de produccion distinto segun su principio activo.</w:t>
       </w:r>
     </w:p>
     <w:p>
@@ -787,7 +787,7 @@
         <w:ind w:firstLine="709"/>
       </w:pPr>
       <w:r>
-        <w:t xml:space="preserve">   - NOMBRE DE PRODUCTO: Cada medicina cuesta distinto producirla.</w:t>
+        <w:t xml:space="preserve">   - FABRICANTE: Los laboratorios grandes y pequenos manejan escalas de produccion y margenes distintos.</w:t>
       </w:r>
     </w:p>
     <w:p>
@@ -795,7 +795,7 @@
         <w:ind w:firstLine="709"/>
       </w:pPr>
       <w:r>
-        <w:t xml:space="preserve">   - FABRICANTE: No es lo mismo un laboratorio grande que uno chico.</w:t>
+        <w:t xml:space="preserve">   - FARMACIA / BOTICA: Cada establecimiento aplica su propio margen comercial sobre el precio.</w:t>
       </w:r>
     </w:p>
     <w:p>
@@ -803,7 +803,16 @@
         <w:ind w:firstLine="709"/>
       </w:pPr>
       <w:r>
-        <w:t xml:space="preserve">   - FARMACIA / BOTICA: Cada local pone su propio margen de ganancia.</w:t>
+        <w:t xml:space="preserve">   - DEPARTAMENTO: La ubicacion geografica afecta los costos logisticos y, por tanto, el precio final.</w:t>
+      </w:r>
+    </w:p>
+    <w:p/>
+    <w:p>
+      <w:pPr>
+        <w:ind w:firstLine="709"/>
+      </w:pPr>
+      <w:r>
+        <w:t>Variable objetivo:</w:t>
       </w:r>
     </w:p>
     <w:p>
@@ -811,7 +820,7 @@
         <w:ind w:firstLine="709"/>
       </w:pPr>
       <w:r>
-        <w:t xml:space="preserve">   - DEPARTAMENTO: En zonas alejadas los precios suelen ser mas altos.</w:t>
+        <w:t xml:space="preserve">   - Para regresion lineal: PRECIO UNITARIO (cuantitativa continua).</w:t>
       </w:r>
     </w:p>
     <w:p>
@@ -819,23 +828,7 @@
         <w:ind w:firstLine="709"/>
       </w:pPr>
       <w:r>
-        <w:t>Variable objetivo (target):</w:t>
-      </w:r>
-    </w:p>
-    <w:p>
-      <w:pPr>
-        <w:ind w:firstLine="709"/>
-      </w:pPr>
-      <w:r>
-        <w:t xml:space="preserve">   - Para regresion lineal: PRECIO UNITARIO</w:t>
-      </w:r>
-    </w:p>
-    <w:p>
-      <w:pPr>
-        <w:ind w:firstLine="709"/>
-      </w:pPr>
-      <w:r>
-        <w:t xml:space="preserve">   - Para regresion logistica: PRECIO ALTO (1 si es mayor a la mediana, 0 si no)</w:t>
+        <w:t xml:space="preserve">   - Para regresion logistica: PRECIO_ALTO (binaria: 1 si el precio supera la mediana del mercado, 0 en caso contrario).</w:t>
       </w:r>
     </w:p>
     <w:p>
@@ -847,10 +840,10 @@
           <w:b/>
           <w:color w:val="003399"/>
         </w:rPr>
-        <w:t xml:space="preserve">[JUSTIFICACION - Por que exclui las otras]: </w:t>
+        <w:t xml:space="preserve">[JUSTIFICACION - Exclusion de variables]: </w:t>
       </w:r>
       <w:r>
-        <w:t>Telefono y direccion son datos de contacto, no afectan el precio. Provincia y distrito ya estan representados por departamento (poner los tres seria repetitivo). Titular y fabricante casi siempre son lo mismo, asi que deje solo fabricante para no tener dos columnas diciendo lo mismo.</w:t>
+        <w:t>TELEFONO y DIRECCION son datos de contacto sin relacion causal con el precio. PROVINCIA y DISTRITO se excluyen para evitar redundancia con DEPARTAMENTO y no aumentar la dimensionalidad del modelo innecesariamente. TITULAR se excluye porque en la mayoria de casos coincide con FABRICANTE, lo que generaria colinealidad.</w:t>
       </w:r>
     </w:p>
     <w:p/>
@@ -860,7 +853,7 @@
           <w:b/>
           <w:sz w:val="22"/>
         </w:rPr>
-        <w:t>4.2 Limpieza: de los 10 Excels al dataset unificado</w:t>
+        <w:t>4.2 Limpieza y tratamiento de datos faltantes</w:t>
       </w:r>
     </w:p>
     <w:p/>
@@ -869,7 +862,7 @@
         <w:ind w:firstLine="709"/>
       </w:pPr>
       <w:r>
-        <w:t>Cuando ya tuve los 10 archivos Excel, el primer paso fue ver que tenia cada uno. Esto es lo que salio:</w:t>
+        <w:t>Una vez obtenidos los 10 archivos Excel desde el observatorio, el primer paso fue inspeccionar cada uno de forma individual antes de proceder a la union. A continuacion se muestra el desglose de cada dataset:</w:t>
       </w:r>
     </w:p>
     <w:tbl>
@@ -925,7 +918,7 @@
                 <w:b/>
                 <w:sz w:val="16"/>
               </w:rPr>
-              <w:t>Cuantas filas</w:t>
+              <w:t>Registros</w:t>
             </w:r>
           </w:p>
         </w:tc>
@@ -939,7 +932,7 @@
                 <w:b/>
                 <w:sz w:val="16"/>
               </w:rPr>
-              <w:t>Cuantos productos</w:t>
+              <w:t>Productos</w:t>
               <w:br/>
               <w:t>(marcas+gen.)</w:t>
             </w:r>
@@ -955,9 +948,7 @@
                 <w:b/>
                 <w:sz w:val="16"/>
               </w:rPr>
-              <w:t>Cuantos</w:t>
-              <w:br/>
-              <w:t>fabricantes</w:t>
+              <w:t>Fabricantes</w:t>
             </w:r>
           </w:p>
         </w:tc>
@@ -1800,7 +1791,7 @@
                 <w:b/>
                 <w:sz w:val="16"/>
               </w:rPr>
-              <w:t>TOTAL</w:t>
+              <w:t>TOTAL BRUTO</w:t>
             </w:r>
           </w:p>
         </w:tc>
@@ -1867,7 +1858,7 @@
         <w:ind w:firstLine="709"/>
       </w:pPr>
       <w:r>
-        <w:t>Mira, en total eran 437,133 filas entre los 10 archivos. Una barbaridad. Si te fijas bien, hay cosas interesantes: por ejemplo, Amoxicilina tiene precios maximo de S/33,000. Eso es porque en PUBLICO salen medicamentos para hospitales que son carisimos. Tambien ves que Azitromicina tiene 58 productos diferentes (todas las marcas que venden azitromicina en Peru: Zitromax, Azitrolab, Astrocina, etc.).</w:t>
+        <w:t>Como se observa en la tabla, los 10 archivos suman un total de 437,133 registros en bruto. Se aprecia que cada medicamento incluye todas sus variantes comerciales (marcas y genericos de distintos laboratorios), lo que explica que, por ejemplo, Azitromicina tenga 58 presentaciones diferentes en el mercado. Los 25 departamentos del Peru estan representados en todos los archivos, garantizando cobertura nacional. En cuanto a los precios, se observa una dispersion considerable: desde S/0.01 (medicamentos genericos basicos) hasta S/33,000.00 (medicamentos de alto costo del sector publico).</w:t>
       </w:r>
     </w:p>
     <w:p>
@@ -1875,7 +1866,7 @@
         <w:ind w:firstLine="709"/>
       </w:pPr>
       <w:r>
-        <w:t>Ahora, junte todo en un solo DataFrame con pandas.concat() y empece a limpiar:</w:t>
+        <w:t>Posteriormente, los 10 archivos se concatenaron en un unico DataFrame utilizando pandas.concat(). Sobre este dataset unificado se aplico el siguiente proceso de limpieza:</w:t>
       </w:r>
     </w:p>
     <w:p/>
@@ -1884,23 +1875,7 @@
         <w:ind w:firstLine="709"/>
       </w:pPr>
       <w:r>
-        <w:t>a) Duplicados: Busque filas repetidas (mismo producto, misma farmacia, mismo precio, misma fecha). No habia ninguna, pero por si acaso corri el drop_duplicates().</w:t>
-      </w:r>
-    </w:p>
-    <w:p>
-      <w:pPr>
-        <w:ind w:firstLine="709"/>
-      </w:pPr>
-      <w:r>
-        <w:t>b) Precios raros: Converti la columna de precio a numero. Los que estaban vacios o eran cero los saque, porque eso no es un precio real. Tambien normalice el texto: quite tildes, puse todo en mayusculas, arregle el TIPO que decia 'P u b l i c o' con espacios raros.</w:t>
-      </w:r>
-    </w:p>
-    <w:p>
-      <w:pPr>
-        <w:ind w:firstLine="709"/>
-      </w:pPr>
-      <w:r>
-        <w:t>c) Muestreo: 437,133 filas es un monton. Para que los modelos no se demoren una eternidad, tome maximo 2,000 registros de cada producto. Como hay 303 productos distintos, quedaron 198,351 filas. Sigue siendo un monton pero al menos es manejable.</w:t>
+        <w:t>a) Eliminacion de duplicados. Se verifico la existencia de filas identicas (mismo producto, mismo establecimiento, mismo precio en la misma fecha). No se encontraron registros duplicados, pero se ejecuto drop_duplicates() como medida preventiva.</w:t>
       </w:r>
     </w:p>
     <w:p/>
@@ -1909,7 +1884,16 @@
         <w:ind w:firstLine="709"/>
       </w:pPr>
       <w:r>
-        <w:t>Resumen de la limpieza:</w:t>
+        <w:t>b) Conversion y filtrado del precio. La columna PRECIO UNITARIO se convirtio de texto a tipo numerico (float). Los registros con precio nulo, igual a cero o negativo fueron eliminados, ya que no representan un valor de mercado valido.</w:t>
+      </w:r>
+    </w:p>
+    <w:p/>
+    <w:p>
+      <w:pPr>
+        <w:ind w:firstLine="709"/>
+      </w:pPr>
+      <w:r>
+        <w:t>c) Normalizacion de texto. Se eliminaron tildes, se unificaron mayusculas y se removieron espacios sobrantes en todos los campos de texto. Ademas, se corrigio la columna TIPO que presentaba caracteres con espaciado irregular (ej. 'P u b l i c o' fue corregido a 'PUBLICO').</w:t>
       </w:r>
     </w:p>
     <w:p>
@@ -1917,7 +1901,32 @@
         <w:ind w:firstLine="709"/>
       </w:pPr>
       <w:r>
-        <w:t xml:space="preserve">   - 10 Excels originales: 437,133 registros</w:t>
+        <w:rPr>
+          <w:b/>
+          <w:color w:val="003399"/>
+        </w:rPr>
+        <w:t xml:space="preserve">[JUSTIFICACION - Importancia de la normalizacion]: </w:t>
+      </w:r>
+      <w:r>
+        <w:t>Sin este paso, variantes como 'LIMA', 'Lima' y 'lima' serian tratadas como categorias distintas por el modelo, fragmentando artificialmente los datos y debilitando la capacidad predictiva. La normalizacion asegura que cada entidad geografica, fabricante o producto tenga una representacion unica y consistente.</w:t>
+      </w:r>
+    </w:p>
+    <w:p/>
+    <w:p>
+      <w:pPr>
+        <w:ind w:firstLine="709"/>
+      </w:pPr>
+      <w:r>
+        <w:t>d) Muestreo estratificado. El dataset bruto de 437,133 registros resultaba excesivo para el entrenamiento de los modelos, sin que un mayor volumen aportara necesariamente un beneficio predictivo proporcional. Se aplico un muestreo estratificado, limitando a un maximo de 2,000 registros por cada una de las 303 presentaciones de medicamento. Este procedimiento preserva la diversidad de la muestra (todas las presentaciones estan representadas) mientras mantiene un tamano manejable para los algoritmos de regresion.</w:t>
+      </w:r>
+    </w:p>
+    <w:p/>
+    <w:p>
+      <w:pPr>
+        <w:ind w:firstLine="709"/>
+      </w:pPr>
+      <w:r>
+        <w:t>Resultado del proceso de limpieza:</w:t>
       </w:r>
     </w:p>
     <w:p>
@@ -1925,7 +1934,7 @@
         <w:ind w:firstLine="709"/>
       </w:pPr>
       <w:r>
-        <w:t xml:space="preserve">   - Ya limpio y muestreado: 198,351 registros</w:t>
+        <w:t xml:space="preserve">   - Datos brutos (10 archivos): 437,133 registros</w:t>
       </w:r>
     </w:p>
     <w:p>
@@ -1933,7 +1942,7 @@
         <w:ind w:firstLine="709"/>
       </w:pPr>
       <w:r>
-        <w:t xml:space="preserve">   - O sea, me quede con el 45% de los datos</w:t>
+        <w:t xml:space="preserve">   - Datos limpios y muestreados: 198,351 registros</w:t>
       </w:r>
     </w:p>
     <w:p>
@@ -1941,7 +1950,15 @@
         <w:ind w:firstLine="709"/>
       </w:pPr>
       <w:r>
-        <w:t xml:space="preserve">   - En 25 departamentos, 109 fabricantes, 303 productos</w:t>
+        <w:t xml:space="preserve">   - Porcentaje conservado: 45%</w:t>
+      </w:r>
+    </w:p>
+    <w:p>
+      <w:pPr>
+        <w:ind w:firstLine="709"/>
+      </w:pPr>
+      <w:r>
+        <w:t xml:space="preserve">   - Cobertura: 25 departamentos, 109 fabricantes, 303 productos</w:t>
       </w:r>
     </w:p>
     <w:p/>
@@ -1951,7 +1968,7 @@
           <w:b/>
           <w:sz w:val="22"/>
         </w:rPr>
-        <w:t>4.3 Transformacion de categoricas: convertir texto en numeros</w:t>
+        <w:t>4.3 Transformacion de variables categoricas</w:t>
       </w:r>
     </w:p>
     <w:p/>
@@ -1960,7 +1977,16 @@
         <w:ind w:firstLine="709"/>
       </w:pPr>
       <w:r>
-        <w:t>Los modelos de machine learning solo entienden numeros. No puedes meterle 'LIMA' o 'PARACETAMOL' y esperar que haga magia. Entonces todas esas columnas de texto hay que pasarlas a numeros. La forma mas simple de hacerlo se llama Label Encoding y es super basico: agarras cada valor unico y le pones un numerito. Por ejemplo, TIPO: PRIVADO = 0, PUBLICO = 1. Y asi con todas.</w:t>
+        <w:t>Los modelos de regresion, tanto lineal como logistica, operan exclusivamente con valores numericos. Dado que la mayoria de las variables del dataset son de tipo texto (categoricas), fue necesario transformarlas a formato numerico antes de entrenar los modelos.</w:t>
+      </w:r>
+    </w:p>
+    <w:p/>
+    <w:p>
+      <w:pPr>
+        <w:ind w:firstLine="709"/>
+      </w:pPr>
+      <w:r>
+        <w:t>a) Label Encoding. A cada valor unico dentro de una columna categorica se le asigna un numero entero consecutivo. Este metodo se aplico a las cinco variables predictoras:</w:t>
       </w:r>
     </w:p>
     <w:p>
@@ -1968,7 +1994,7 @@
         <w:ind w:firstLine="709"/>
       </w:pPr>
       <w:r>
-        <w:t>Asi quedaron las variables despues del encoding:</w:t>
+        <w:t xml:space="preserve">   - TIPO: 2 categorias</w:t>
       </w:r>
     </w:p>
     <w:p>
@@ -1976,7 +2002,7 @@
         <w:ind w:firstLine="709"/>
       </w:pPr>
       <w:r>
-        <w:t xml:space="preserve">   - TIPO: 2 valores (0 y 1)</w:t>
+        <w:t xml:space="preserve">   - NOMBRE DE PRODUCTO: 303 categorias</w:t>
       </w:r>
     </w:p>
     <w:p>
@@ -1984,7 +2010,7 @@
         <w:ind w:firstLine="709"/>
       </w:pPr>
       <w:r>
-        <w:t xml:space="preserve">   - NOMBRE DE PRODUCTO: 303 numeros distintos</w:t>
+        <w:t xml:space="preserve">   - FABRICANTE: 109 categorias</w:t>
       </w:r>
     </w:p>
     <w:p>
@@ -1992,7 +2018,7 @@
         <w:ind w:firstLine="709"/>
       </w:pPr>
       <w:r>
-        <w:t xml:space="preserve">   - FABRICANTE: 109 numeros</w:t>
+        <w:t xml:space="preserve">   - FARMACIA / BOTICA: 10,078 categorias</w:t>
       </w:r>
     </w:p>
     <w:p>
@@ -2000,15 +2026,7 @@
         <w:ind w:firstLine="709"/>
       </w:pPr>
       <w:r>
-        <w:t xml:space="preserve">   - FARMACIA / BOTICA: 10,078 numeros</w:t>
-      </w:r>
-    </w:p>
-    <w:p>
-      <w:pPr>
-        <w:ind w:firstLine="709"/>
-      </w:pPr>
-      <w:r>
-        <w:t xml:space="preserve">   - DEPARTAMENTO: 25 numeros</w:t>
+        <w:t xml:space="preserve">   - DEPARTAMENTO: 25 categorias</w:t>
       </w:r>
     </w:p>
     <w:p>
@@ -2020,10 +2038,19 @@
           <w:b/>
           <w:color w:val="003399"/>
         </w:rPr>
-        <w:t xml:space="preserve">[JUSTIFICACION - Label Encoding vs One-Hot]: </w:t>
+        <w:t xml:space="preserve">[JUSTIFICACION - Eleccion de Label Encoding sobre One-Hot Encoding]: </w:t>
       </w:r>
       <w:r>
-        <w:t>Se que algunos prefieren One-Hot Encoding porque no mete un orden falso entre categorias (el modelo no deberia pensar que Arequipa=2 es 'mayor' que Lima=1). Pero mira, si hacia One-Hot con 10,078 farmacias, se me creaban 10,078 columnas nuevas. Eso es una locura para una laptop normal. Asi que use Label Encoding que es mas simple y para una primera aproximacion funciona.</w:t>
+        <w:t>La alternativa mas comun a Label Encoding es One-Hot Encoding, que crea una columna binaria por cada categoria. Sin embargo, con 10,078 farmacias distintas, este metodo habria generado mas de 10,000 columnas adicionales, resultando en una matriz extremadamente dispersa y computacionalmente costosa. Para este analisis exploratorio, Label Encoding representa una simplificacion razonable, aunque se reconoce que introduce un orden artificial entre categorias que no existe en la realidad.</w:t>
+      </w:r>
+    </w:p>
+    <w:p/>
+    <w:p>
+      <w:pPr>
+        <w:ind w:firstLine="709"/>
+      </w:pPr>
+      <w:r>
+        <w:t>b) Creacion de la variable objetivo binaria. Para la regresion logistica se genero la columna PRECIO_ALTO, tomando como umbral la mediana de todos los precios, que resulto ser S/1.10. Los valores se asignaron de la siguiente forma:</w:t>
       </w:r>
     </w:p>
     <w:p>
@@ -2031,7 +2058,7 @@
         <w:ind w:firstLine="709"/>
       </w:pPr>
       <w:r>
-        <w:t>Para la regresion logistica, tuve que crear una variable nueva: PRECIO ALTO. La forma mas sencilla fue usar la mediana como punto de corte. La mediana de todos los precios dio S/1.10. Entonces:</w:t>
+        <w:t xml:space="preserve">   - PRECIO_ALTO = 1 si Precio &gt; S/1.10</w:t>
       </w:r>
     </w:p>
     <w:p>
@@ -2039,7 +2066,7 @@
         <w:ind w:firstLine="709"/>
       </w:pPr>
       <w:r>
-        <w:t xml:space="preserve">   - Si Precio &gt; S/1.10  =&gt;  PRECIO ALTO = 1</w:t>
+        <w:t xml:space="preserve">   - PRECIO_ALTO = 0 si Precio &lt;= S/1.10</w:t>
       </w:r>
     </w:p>
     <w:p>
@@ -2047,15 +2074,7 @@
         <w:ind w:firstLine="709"/>
       </w:pPr>
       <w:r>
-        <w:t xml:space="preserve">   - Si Precio &lt;= S/1.10 =&gt;  PRECIO ALTO = 0</w:t>
-      </w:r>
-    </w:p>
-    <w:p>
-      <w:pPr>
-        <w:ind w:firstLine="709"/>
-      </w:pPr>
-      <w:r>
-        <w:t>Quedo bastante balanceado: 96,625 precios altos y 101,726 precios bajos. Eso esta bien porque si estuviera todo desbalanceado (ej. 90% bajos, 10% altos) el modelo se sesgaria.</w:t>
+        <w:t>La distribucion resultante fue: 96,625 precios altos y 101,726 precios bajos. Esta proporcion es practicamente balanceada, lo cual es deseable porque evita que el modelo de clasificacion se sesgue hacia la clase mayoritaria.</w:t>
       </w:r>
     </w:p>
     <w:p/>
@@ -2065,7 +2084,7 @@
           <w:b/>
           <w:sz w:val="22"/>
         </w:rPr>
-        <w:t>4.4 Deteccion de outliers: precios raros</w:t>
+        <w:t>4.4 Deteccion de outliers</w:t>
       </w:r>
     </w:p>
     <w:p/>
@@ -2074,7 +2093,7 @@
         <w:ind w:firstLine="709"/>
       </w:pPr>
       <w:r>
-        <w:t>Un outlier es un precio que se sale mucho de lo normal. Para encontrarlos usamos el metodo del IQR (rango intercuartilico), que es el clasico y no asume que los datos tienen distribucion normal (porque claramente no la tienen, mira los precios, van de centimos a miles de soles).</w:t>
+        <w:t>Se entiende por outlier un valor que se aleja significativamente del resto de las observaciones. Para identificarlos se utilizo el metodo del Rango Intercuartilico (IQR), que es robusto frente a distribuciones asimetricas y no asume normalidad en los datos.</w:t>
       </w:r>
     </w:p>
     <w:p>
@@ -2082,7 +2101,7 @@
         <w:ind w:firstLine="709"/>
       </w:pPr>
       <w:r>
-        <w:t>Los numeros dieron asi:</w:t>
+        <w:t>Los resultados del calculo fueron los siguientes:</w:t>
       </w:r>
     </w:p>
     <w:p>
@@ -2090,7 +2109,7 @@
         <w:ind w:firstLine="709"/>
       </w:pPr>
       <w:r>
-        <w:t xml:space="preserve">   - Q1 (el 25% mas barato): S/0.48</w:t>
+        <w:t xml:space="preserve">   - Q1 (percentil 25): S/0.48</w:t>
       </w:r>
     </w:p>
     <w:p>
@@ -2098,7 +2117,7 @@
         <w:ind w:firstLine="709"/>
       </w:pPr>
       <w:r>
-        <w:t xml:space="preserve">   - Q3 (el 25% mas caro): S/1.60</w:t>
+        <w:t xml:space="preserve">   - Q3 (percentil 75): S/1.60</w:t>
       </w:r>
     </w:p>
     <w:p>
@@ -2106,7 +2125,7 @@
         <w:ind w:firstLine="709"/>
       </w:pPr>
       <w:r>
-        <w:t xml:space="preserve">   - IQR = Q3 - Q1 = S/1.12</w:t>
+        <w:t xml:space="preserve">   - IQR = Q3 - Q1: S/1.12</w:t>
       </w:r>
     </w:p>
     <w:p>
@@ -2114,7 +2133,7 @@
         <w:ind w:firstLine="709"/>
       </w:pPr>
       <w:r>
-        <w:t xml:space="preserve">   - Limite inferior: S/-1.20 (negativo, o sea no hay precios tan bajos)</w:t>
+        <w:t xml:space="preserve">   - Limite inferior = Q1 - 1.5 * IQR: S/-1.20</w:t>
       </w:r>
     </w:p>
     <w:p>
@@ -2122,7 +2141,7 @@
         <w:ind w:firstLine="709"/>
       </w:pPr>
       <w:r>
-        <w:t xml:space="preserve">   - Limite superior: S/3.28</w:t>
+        <w:t xml:space="preserve">   - Limite superior = Q3 + 1.5 * IQR: S/3.28</w:t>
       </w:r>
     </w:p>
     <w:p>
@@ -2130,7 +2149,7 @@
         <w:ind w:firstLine="709"/>
       </w:pPr>
       <w:r>
-        <w:t xml:space="preserve">   - Outliers encontrados: 22,805 (el 11.5% del total)</w:t>
+        <w:t xml:space="preserve">   - Outliers detectados: 22,805 registros (11.5% del total)</w:t>
       </w:r>
     </w:p>
     <w:p>
@@ -2142,10 +2161,10 @@
           <w:b/>
           <w:color w:val="003399"/>
         </w:rPr>
-        <w:t xml:space="preserve">[JUSTIFICACION - No los borramos]: </w:t>
+        <w:t xml:space="preserve">[JUSTIFICACION - Decision de no eliminar los outliers]: </w:t>
       </w:r>
       <w:r>
-        <w:t>Aca hay que pensar: un precio de S/100 no es un error, es una medicina cara. Si la borro, estoy eliminando informacion real del mercado. El 11.5% de outliers es esperable en un mercado donde hay medicamentos de S/0.05 (genericos basicos) y medicamentos de S/13,000 (oncologicos, biologicos). Lo unico que hice fue marcarlos en una columna aparte por si acaso, pero los deje en el dataset.</w:t>
+        <w:t>En el contexto de precios de medicamentos, un valor alejado no constituye necesariamente un error. Un precio de S/100 o S/1,000 puede corresponder a un medicamento de marca, un producto biologico o un tratamiento oncologico. Eliminar estos registros implicaria descartar informacion genuina del mercado y sesgar el analisis hacia unicamente medicamentos de bajo costo. Por esta razon, los outliers fueron identificados y marcados en una columna adicional, pero no fueron removidos del dataset.</w:t>
       </w:r>
     </w:p>
     <w:p/>
@@ -2155,7 +2174,7 @@
           <w:b/>
           <w:sz w:val="22"/>
         </w:rPr>
-        <w:t>4.5 EDA: analisis exploratorio</w:t>
+        <w:t>4.5 Analisis exploratorio de datos (EDA)</w:t>
       </w:r>
     </w:p>
     <w:p/>
@@ -2164,7 +2183,7 @@
         <w:ind w:firstLine="709"/>
       </w:pPr>
       <w:r>
-        <w:t>Antes de ponerme a entrenar modelos, habia que entender los datos. Esto es lo que encontre:</w:t>
+        <w:t>Previo al entrenamiento de los modelos, se realizo un analisis descriptivo para comprender la distribucion de los precios y las relaciones entre las variables.</w:t>
       </w:r>
     </w:p>
     <w:p/>
@@ -2173,7 +2192,7 @@
         <w:ind w:firstLine="709"/>
       </w:pPr>
       <w:r>
-        <w:t>Estadisticas basicas del precio:</w:t>
+        <w:t>Estadisticas descriptivas del precio unitario:</w:t>
       </w:r>
     </w:p>
     <w:p>
@@ -2181,7 +2200,7 @@
         <w:ind w:firstLine="709"/>
       </w:pPr>
       <w:r>
-        <w:t xml:space="preserve">   - Precio promedio: S/2.19</w:t>
+        <w:t xml:space="preserve">   - Media: S/2.19</w:t>
       </w:r>
     </w:p>
     <w:p>
@@ -2189,7 +2208,7 @@
         <w:ind w:firstLine="709"/>
       </w:pPr>
       <w:r>
-        <w:t xml:space="preserve">   - Mediana (el del medio): S/1.10</w:t>
+        <w:t xml:space="preserve">   - Mediana: S/1.10</w:t>
       </w:r>
     </w:p>
     <w:p>
@@ -2197,7 +2216,7 @@
         <w:ind w:firstLine="709"/>
       </w:pPr>
       <w:r>
-        <w:t xml:space="preserve">   - El mas barato: S/0.0100</w:t>
+        <w:t xml:space="preserve">   - Minimo: S/0.0100</w:t>
       </w:r>
     </w:p>
     <w:p>
@@ -2205,7 +2224,7 @@
         <w:ind w:firstLine="709"/>
       </w:pPr>
       <w:r>
-        <w:t xml:space="preserve">   - El mas caro: S/13000.00</w:t>
+        <w:t xml:space="preserve">   - Maximo: S/13000.00</w:t>
       </w:r>
     </w:p>
     <w:p>
@@ -2221,14 +2240,7 @@
         <w:ind w:firstLine="709"/>
       </w:pPr>
       <w:r>
-        <w:rPr>
-          <w:b/>
-          <w:color w:val="003399"/>
-        </w:rPr>
-        <w:t xml:space="preserve">[JUSTIFICACION - Media vs mediana]: </w:t>
-      </w:r>
-      <w:r>
-        <w:t>Mira que la media (S/2.19) es casi el doble de la mediana (S/1.10). Eso pasa cuando tienes muchos datos baratos y unos pocos super caros que jalan el promedio para arriba. Es super comun en precios de medicamentos y ya desde aca te das cuenta de que un modelo lineal la va a tener dificil para predecir bien.</w:t>
+        <w:t>Se observa una diferencia notable entre la media (S/2.19) y la mediana (S/1.10). Esto indica que la distribucion de precios presenta un sesgo positivo (cola derecha), donde una gran cantidad de medicamentos tienen precios bajos y unos pocos alcanzan precios muy elevados. Esta asimetria es caracteristica del mercado farmaceutico y representa un desafio para los modelos lineales, que asumen relaciones mas uniformes entre las variables.</w:t>
       </w:r>
     </w:p>
     <w:p/>
@@ -2237,7 +2249,7 @@
         <w:ind w:firstLine="709"/>
       </w:pPr>
       <w:r>
-        <w:t>Precio segun el tipo:</w:t>
+        <w:t>Precio segun el tipo de producto:</w:t>
       </w:r>
     </w:p>
     <w:p>
@@ -2245,7 +2257,7 @@
         <w:ind w:firstLine="709"/>
       </w:pPr>
       <w:r>
-        <w:t xml:space="preserve">   - PRIVADO: S/2.10 promedio (con 197,747 registros)</w:t>
+        <w:t xml:space="preserve">   - PRIVADO: promedio S/2.10 (197,747 registros)</w:t>
       </w:r>
     </w:p>
     <w:p>
@@ -2253,7 +2265,7 @@
         <w:ind w:firstLine="709"/>
       </w:pPr>
       <w:r>
-        <w:t xml:space="preserve">   - PUBLICO: S/31.67 promedio (con 604 registros)</w:t>
+        <w:t xml:space="preserve">   - PUBLICO: promedio S/31.67 (604 registros)</w:t>
       </w:r>
     </w:p>
     <w:p>
@@ -2261,7 +2273,7 @@
         <w:ind w:firstLine="709"/>
       </w:pPr>
       <w:r>
-        <w:t>Fijate que PUBLICO tiene promedio S/31.67. Eso es porque en los hospitales del MINSA venden medicamentos caros (tratamientos especiales), no solo paracetamol. Pero ojo, PUBLICO solo son 604 registros de casi 200 mil. El 99.7% de los datos son del sector PRIVADO.</w:t>
+        <w:t>El precio promedio del sector PUBLICO es significativamente mayor (S/31.67) que el del sector PRIVADO (S/2.10). Esto se debe a que la categoria PUBLICO incluye medicamentos de alto costo dispensados en hospitales, mientras que PRIVADO abarca toda la gama de productos de farmacias y boticas. Cabe precisar que los registros PUBLICOS representan solo 604 de los casi 200,000 registros totales.</w:t>
       </w:r>
     </w:p>
     <w:p/>
@@ -2270,7 +2282,7 @@
         <w:ind w:firstLine="709"/>
       </w:pPr>
       <w:r>
-        <w:t>Top 5 departamentos con mas registros:</w:t>
+        <w:t>Top 5 departamentos con mayor cantidad de registros:</w:t>
       </w:r>
     </w:p>
     <w:p>
@@ -2318,7 +2330,7 @@
         <w:ind w:firstLine="709"/>
       </w:pPr>
       <w:r>
-        <w:t>Lima concentra la mayoria de los datos porque, bueno, es Lima. Pero los precios no varian tanto entre departamentos, lo cual es interesante.</w:t>
+        <w:t>Lima concentra la mayor proporcion de registros, lo cual es esperable por ser la capital y el departamento con mayor cantidad de establecimientos de salud. Sin embargo, los precios promedio entre departamentos no presentan diferencias drasticas, lo que sugiere un mercado farmaceutico relativamente integrado a nivel nacional.</w:t>
       </w:r>
     </w:p>
     <w:p/>
@@ -2327,7 +2339,7 @@
         <w:ind w:firstLine="709"/>
       </w:pPr>
       <w:r>
-        <w:t>Top 5 fabricantes:</w:t>
+        <w:t>Top 5 fabricantes por cantidad de registros:</w:t>
       </w:r>
     </w:p>
     <w:p>
@@ -2335,7 +2347,7 @@
         <w:ind w:firstLine="709"/>
       </w:pPr>
       <w:r>
-        <w:t xml:space="preserve">   - LABORATORIOS PORTUGAL S.R.L.: 32,310 registros, S/0.89 promedio</w:t>
+        <w:t xml:space="preserve">   - LABORATORIOS PORTUGAL S.R.L.: 32,310 registros, promedio S/0.89</w:t>
       </w:r>
     </w:p>
     <w:p>
@@ -2343,7 +2355,7 @@
         <w:ind w:firstLine="709"/>
       </w:pPr>
       <w:r>
-        <w:t xml:space="preserve">   - INSTITUTO QUIMIOTERAPICO S.A.: 10,983 registros, S/2.62 promedio</w:t>
+        <w:t xml:space="preserve">   - INSTITUTO QUIMIOTERAPICO S.A.: 10,983 registros, promedio S/2.62</w:t>
       </w:r>
     </w:p>
     <w:p>
@@ -2351,7 +2363,7 @@
         <w:ind w:firstLine="709"/>
       </w:pPr>
       <w:r>
-        <w:t xml:space="preserve">   - MEDIFARMA S.A.: 9,546 registros, S/1.58 promedio</w:t>
+        <w:t xml:space="preserve">   - MEDIFARMA S.A.: 9,546 registros, promedio S/1.58</w:t>
       </w:r>
     </w:p>
     <w:p>
@@ -2359,7 +2371,7 @@
         <w:ind w:firstLine="709"/>
       </w:pPr>
       <w:r>
-        <w:t xml:space="preserve">   - LABORATORIOS NATURALES Y GENERICOS S.A.C. - NATURGEN: 9,396 registros, S/2.38 promedio</w:t>
+        <w:t xml:space="preserve">   - LABORATORIOS NATURALES Y GENERICOS S.A.C. - NATURGEN: 9,396 registros, promedio S/2.38</w:t>
       </w:r>
     </w:p>
     <w:p>
@@ -2367,7 +2379,7 @@
         <w:ind w:firstLine="709"/>
       </w:pPr>
       <w:r>
-        <w:t xml:space="preserve">   - VITA PHARMA SOCIEDAD ANONIMA CERRADA - VITA PHARMA S.A.: 9,376 registros, S/1.32 promedio</w:t>
+        <w:t xml:space="preserve">   - VITA PHARMA SOCIEDAD ANONIMA CERRADA - VITA PHARMA S.A.: 9,376 registros, promedio S/1.32</w:t>
       </w:r>
     </w:p>
     <w:p>
@@ -2382,7 +2394,7 @@
         <w:t xml:space="preserve">[NOTA]: </w:t>
       </w:r>
       <w:r>
-        <w:t>Hay una diferencia grande entre laboratorios. Portugal S.R.L. tiene promedio S/0.89 porque se dedica a genericos baratos. En cambio IQ Farmaceutico esta en S/2.62. Esto ya te dice que el fabricante puede ser un buen predictor del precio.</w:t>
+        <w:t>Se aprecian diferencias en las estrategias de mercado de los laboratorios. Por ejemplo, Laboratorios Portugal S.R.L. presenta un precio promedio bajo (S/0.89), lo que sugiere una especializacion en genericos economicos. En contraste, el Instituto Quimioterapico S.A. tiene un promedio de S/2.62, indicando un portafolio con productos de mayor valor. Esta variabilidad es informacion que el modelo puede aprovechar.</w:t>
       </w:r>
     </w:p>
     <w:p/>
@@ -2392,7 +2404,7 @@
           <w:b/>
           <w:sz w:val="22"/>
         </w:rPr>
-        <w:t>4.6 Train/test split</w:t>
+        <w:t>4.6 Division de datos en entrenamiento y prueba</w:t>
       </w:r>
     </w:p>
     <w:p/>
@@ -2401,7 +2413,7 @@
         <w:ind w:firstLine="709"/>
       </w:pPr>
       <w:r>
-        <w:t>Esto es super simple: partes los datos en dos. Una parte (80%) es para que el modelo aprenda, la otra (20%) es para probar que tanto aprendio. Es como en la universidad: estudias con unos ejercicios y el examen es con otros diferentes, para ver si de verdad entendiste o solo te memorizaste las respuestas.</w:t>
+        <w:t>Para evaluar correctamente el desempeno de los modelos, el dataset se dividio en dos conjuntos mutuamente excluyentes: uno de entrenamiento y otro de prueba. El conjunto de entrenamiento se utiliza para que el modelo aprenda las relaciones entre las variables, mientras que el conjunto de prueba se reserva para evaluar que tan bien generaliza ese aprendizaje a datos no vistos.</w:t>
       </w:r>
     </w:p>
     <w:p>
@@ -2409,7 +2421,7 @@
         <w:ind w:firstLine="709"/>
       </w:pPr>
       <w:r>
-        <w:t>Use train_test_split de sklearn con 80/20 y random_state=42. Ese 42 es una semilla, sirve para que siempre salga la misma particion. Asi si corro el codigo 10 veces, el resultado es el mismo.</w:t>
+        <w:t>Se empleo la funcion train_test_split de la biblioteca scikit-learn, con una proporcion 80/20 y el parametro random_state=42 para garantizar la reproducibilidad de los resultados. La division resultante fue:</w:t>
       </w:r>
     </w:p>
     <w:p>
@@ -2417,7 +2429,7 @@
         <w:ind w:firstLine="709"/>
       </w:pPr>
       <w:r>
-        <w:t xml:space="preserve">   - Train: 158,680 registros</w:t>
+        <w:t xml:space="preserve">   - Entrenamiento: 158,680 registros (80%)</w:t>
       </w:r>
     </w:p>
     <w:p>
@@ -2425,7 +2437,7 @@
         <w:ind w:firstLine="709"/>
       </w:pPr>
       <w:r>
-        <w:t xml:space="preserve">   - Test: 39,671 registros</w:t>
+        <w:t xml:space="preserve">   - Prueba: 39,671 registros (20%)</w:t>
       </w:r>
     </w:p>
     <w:p/>
@@ -2435,81 +2447,7 @@
           <w:b/>
           <w:sz w:val="22"/>
         </w:rPr>
-        <w:t>4.7 Los modelos</w:t>
-      </w:r>
-    </w:p>
-    <w:p/>
-    <w:p>
-      <w:pPr>
-        <w:ind w:firstLine="709"/>
-      </w:pPr>
-      <w:r>
-        <w:t>Ahora si, la parte divertida. Entrene dos modelos:</w:t>
-      </w:r>
-    </w:p>
-    <w:p/>
-    <w:p>
-      <w:pPr>
-        <w:ind w:firstLine="709"/>
-      </w:pPr>
-      <w:r>
-        <w:t>Modelo 1 - Regresion lineal multiple (LinearRegression de sklearn):</w:t>
-      </w:r>
-    </w:p>
-    <w:p>
-      <w:pPr>
-        <w:ind w:firstLine="709"/>
-      </w:pPr>
-      <w:r>
-        <w:t>Este modelo busca una ecuacion del tipo:</w:t>
-      </w:r>
-    </w:p>
-    <w:p>
-      <w:pPr>
-        <w:ind w:firstLine="709"/>
-      </w:pPr>
-      <w:r>
-        <w:t xml:space="preserve">   PRECIO = B0 + B1*TIPO + B2*PRODUCTO + B3*FABRICANTE + B4*FARMACIA + B5*DEPARTAMENTO</w:t>
-      </w:r>
-    </w:p>
-    <w:p>
-      <w:pPr>
-        <w:ind w:firstLine="709"/>
-      </w:pPr>
-      <w:r>
-        <w:t>El algoritmo ajusta los coeficientes B1, B2... para minimizar el error entre lo que predice y el precio real. Asi de simple.</w:t>
-      </w:r>
-    </w:p>
-    <w:p/>
-    <w:p>
-      <w:pPr>
-        <w:ind w:firstLine="709"/>
-      </w:pPr>
-      <w:r>
-        <w:t>Modelo 2 - Regresion logistica (LogisticRegression de sklearn):</w:t>
-      </w:r>
-    </w:p>
-    <w:p>
-      <w:pPr>
-        <w:ind w:firstLine="709"/>
-      </w:pPr>
-      <w:r>
-        <w:t>Este en vez de predecir un numero, predice una probabilidad de que el precio sea alto. Usa la funcion sigmoide, que convierte cualquier numero en un valor entre 0 y 1 (una probabilidad). Si la probabilidad es mayor a 0.5, dice 'es caro', y si no, 'es barato'.</w:t>
-      </w:r>
-    </w:p>
-    <w:p>
-      <w:pPr>
-        <w:ind w:firstLine="709"/>
-      </w:pPr>
-      <w:r>
-        <w:rPr>
-          <w:b/>
-          <w:color w:val="003399"/>
-        </w:rPr>
-        <w:t xml:space="preserve">[JUSTIFICACION - Por que ambos]: </w:t>
-      </w:r>
-      <w:r>
-        <w:t>Son preguntas diferentes. La regresion lineal intenta adivinar el precio exacto (dificil). La logistica solo intenta decir si es caro o barato (mucho mas facil). Es como la diferencia entre 'adivina cuantos anos tengo' y 'dime si tengo mas de 25'. La segunda es mas facil de acertar.</w:t>
+        <w:t>4.7 Aplicacion de los modelos de regresion</w:t>
       </w:r>
     </w:p>
     <w:p/>
@@ -2519,16 +2457,31 @@
           <w:b/>
           <w:sz w:val="22"/>
         </w:rPr>
-        <w:t>4.8 Evaluacion: metricas</w:t>
+        <w:t>4.7.1 Regresion lineal multiple</w:t>
       </w:r>
     </w:p>
-    <w:p/>
     <w:p>
       <w:pPr>
         <w:ind w:firstLine="709"/>
       </w:pPr>
       <w:r>
-        <w:t>Ya entrenados los modelos, toca ver que tan buenos (o malos) son. Aca van los resultados:</w:t>
+        <w:t>Se utilizo la clase LinearRegression de scikit-learn. Este modelo busca ajustar una ecuacion lineal de la forma:</w:t>
+      </w:r>
+    </w:p>
+    <w:p>
+      <w:pPr>
+        <w:ind w:firstLine="709"/>
+      </w:pPr>
+      <w:r>
+        <w:t xml:space="preserve">   PRECIO = B0 + B1*TIPO + B2*PRODUCTO + B3*FABRICANTE + B4*FARMACIA + B5*DEPARTAMENTO</w:t>
+      </w:r>
+    </w:p>
+    <w:p>
+      <w:pPr>
+        <w:ind w:firstLine="709"/>
+      </w:pPr>
+      <w:r>
+        <w:t>Donde B0 es el intercepto y B1 a B5 son los coeficientes que el modelo estima automaticamente mediante el metodo de minimos cuadrados ordinarios, minimizando la suma de los errores al cuadrado entre los precios reales y los predichos. El modelo fue entrenado sobre los 158,680 registros del conjunto de entrenamiento.</w:t>
       </w:r>
     </w:p>
     <w:p/>
@@ -2538,7 +2491,7 @@
           <w:b/>
           <w:sz w:val="22"/>
         </w:rPr>
-        <w:t>Regresion lineal</w:t>
+        <w:t>4.7.2 Regresion logistica</w:t>
       </w:r>
     </w:p>
     <w:p>
@@ -2546,7 +2499,7 @@
         <w:ind w:firstLine="709"/>
       </w:pPr>
       <w:r>
-        <w:t xml:space="preserve">   RMSE: 65.41</w:t>
+        <w:t>Se utilizo la clase LogisticRegression de scikit-learn con el parametro max_iter=2000 para asegurar la convergencia del algoritmo. A diferencia de la regresion lineal, este modelo no predice un valor numerico directamente, sino que estima la probabilidad de que una observacion pertenezca a la clase positiva (PRECIO_ALTO = 1).</w:t>
       </w:r>
     </w:p>
     <w:p>
@@ -2554,47 +2507,7 @@
         <w:ind w:firstLine="709"/>
       </w:pPr>
       <w:r>
-        <w:t xml:space="preserve">   MAE: 2.36</w:t>
-      </w:r>
-    </w:p>
-    <w:p>
-      <w:pPr>
-        <w:ind w:firstLine="709"/>
-      </w:pPr>
-      <w:r>
-        <w:t xml:space="preserve">   R2: 0.0016 (0.2%)</w:t>
-      </w:r>
-    </w:p>
-    <w:p>
-      <w:pPr>
-        <w:ind w:firstLine="709"/>
-      </w:pPr>
-      <w:r>
-        <w:t>Traduccion de las metricas:</w:t>
-      </w:r>
-    </w:p>
-    <w:p>
-      <w:pPr>
-        <w:ind w:firstLine="709"/>
-      </w:pPr>
-      <w:r>
-        <w:t xml:space="preserve">   - RMSE de 65.41 significa que el error tipico es de 65 soles. Suena mucho, pero recuerda que hay precios desde centimos hasta 13 mil soles.</w:t>
-      </w:r>
-    </w:p>
-    <w:p>
-      <w:pPr>
-        <w:ind w:firstLine="709"/>
-      </w:pPr>
-      <w:r>
-        <w:t xml:space="preserve">   - MAE de 2.36 es mas realista: en promedio el modelo se equivoca por S/2.36. No esta tan mal considerando todo.</w:t>
-      </w:r>
-    </w:p>
-    <w:p>
-      <w:pPr>
-        <w:ind w:firstLine="709"/>
-      </w:pPr>
-      <w:r>
-        <w:t xml:space="preserve">   - El R2 de 0.0016 si esta feo, la verdad. Significa que las variables que use no explican casi nada de la variacion del precio. Pero ojo, esto no es necesariamente un fracaso del trabajo. Es que el precio de un medicamento depende de muchas cosas que no estan en el dataset: el costo del principio activo, las patentes, el tipo de cambio, los margenes comerciales, etc.</w:t>
+        <w:t>La probabilidad se calcula mediante la funcion sigmoide, que transforma la combinacion lineal de las variables predictoras en un valor entre 0 y 1. Si la probabilidad resultante supera el umbral de 0.5, la observacion se clasifica como 'precio alto'; en caso contrario, como 'precio bajo'.</w:t>
       </w:r>
     </w:p>
     <w:p>
@@ -2606,10 +2519,10 @@
           <w:b/>
           <w:color w:val="003399"/>
         </w:rPr>
-        <w:t xml:space="preserve">[JUSTIFICACION - R2 bajo: fracaso o realidad]: </w:t>
+        <w:t xml:space="preserve">[JUSTIFICACION - Pertinencia de ambos modelos]: </w:t>
       </w:r>
       <w:r>
-        <w:t>No es fracaso. Es un resultado honesto. Si todas las tareas de ML dieran R2=0.99, algo raro estaria pasando. Aca se ve que con solo variables categoricas y un modelo lineal, no alcanza para predecir bien el precio. La proxima vez se podria probar con arboles de decision o random forest, que suelen funcionar mejor con datos asi.</w:t>
+        <w:t>Se emplearon ambos tipos de regresion porque responden a preguntas de distinta naturaleza. La regresion lineal aborda un problema de prediccion numerica: estimar el precio exacto en soles. La regresion logistica aborda un problema de clasificacion: determinar si un precio es alto o bajo respecto al mercado. La segunda pregunta es inherentemente mas facil de responder, por lo que se espera un mejor desempeno relativo en terminos de metricas de clasificacion.</w:t>
       </w:r>
     </w:p>
     <w:p/>
@@ -2619,7 +2532,17 @@
           <w:b/>
           <w:sz w:val="22"/>
         </w:rPr>
-        <w:t>Regresion logistica</w:t>
+        <w:t>4.8 Evaluacion mediante metricas</w:t>
+      </w:r>
+    </w:p>
+    <w:p/>
+    <w:p>
+      <w:r>
+        <w:rPr>
+          <w:b/>
+          <w:sz w:val="22"/>
+        </w:rPr>
+        <w:t>4.8.1 Metricas de regresion lineal</w:t>
       </w:r>
     </w:p>
     <w:p>
@@ -2627,7 +2550,7 @@
         <w:ind w:firstLine="709"/>
       </w:pPr>
       <w:r>
-        <w:t xml:space="preserve">   Accuracy: 0.5466 (54.7%)</w:t>
+        <w:t xml:space="preserve">   - RMSE (Root Mean Squared Error): 65.4128</w:t>
       </w:r>
     </w:p>
     <w:p>
@@ -2635,7 +2558,7 @@
         <w:ind w:firstLine="709"/>
       </w:pPr>
       <w:r>
-        <w:t xml:space="preserve">   Precision: 0.5456</w:t>
+        <w:t xml:space="preserve">   - MAE (Mean Absolute Error): 2.3581</w:t>
       </w:r>
     </w:p>
     <w:p>
@@ -2643,7 +2566,7 @@
         <w:ind w:firstLine="709"/>
       </w:pPr>
       <w:r>
-        <w:t xml:space="preserve">   Recall: 0.4317</w:t>
+        <w:t xml:space="preserve">   - R2 (Coeficiente de determinacion): 0.0016 (0.2%)</w:t>
       </w:r>
     </w:p>
     <w:p>
@@ -2651,7 +2574,7 @@
         <w:ind w:firstLine="709"/>
       </w:pPr>
       <w:r>
-        <w:t xml:space="preserve">   F1: 0.4820</w:t>
+        <w:t>Interpretacion de las metricas:</w:t>
       </w:r>
     </w:p>
     <w:p>
@@ -2659,7 +2582,7 @@
         <w:ind w:firstLine="709"/>
       </w:pPr>
       <w:r>
-        <w:t>Que significa cada cosa:</w:t>
+        <w:t>El RMSE mide el error de prediccion en las mismas unidades de la variable objetivo (soles). Un valor de 65.41 puede parecer elevado, pero debe contextualizarse considerando que el rango de precios abarca desde centimos hasta miles de soles. Un error de esta magnitud es proporcionalmente menor en medicamentos caros y mayor en los mas economicos.</w:t>
       </w:r>
     </w:p>
     <w:p>
@@ -2667,7 +2590,7 @@
         <w:ind w:firstLine="709"/>
       </w:pPr>
       <w:r>
-        <w:t xml:space="preserve">   - Accuracy: acierta el 54.7% de las veces. Es poquito mas que tirar una moneda (50%), pero al menos es mejor que el azar.</w:t>
+        <w:t>El MAE es una metrica mas intuitiva y robusta que el RMSE, ya que no eleva los errores al cuadrado. Un MAE de 2.36 indica que, en promedio, el modelo se equivoca por aproximadamente S/2.36 en cada prediccion. Para medicamentos cuyo precio ronda entre S/1 y S/3, este margen de error es significativo.</w:t>
       </w:r>
     </w:p>
     <w:p>
@@ -2675,7 +2598,7 @@
         <w:ind w:firstLine="709"/>
       </w:pPr>
       <w:r>
-        <w:t xml:space="preserve">   - Precision (54.6%): cuando el modelo dice 'este es caro', acierta el 55% de las veces.</w:t>
+        <w:t>El R2 de 0.0016 indica que las variables predictoras, en su forma lineal actual, explican solo el 0.2% de la variabilidad del precio. Este resultado, si bien es bajo, no debe interpretarse como un fracaso del modelo, sino como una manifestacion de la complejidad del problema: el precio de un medicamento depende de factores economicos, regulatorios y comerciales que no estan capturados en las variables disponibles (costo de insumos, patentes, tipo de cambio, margenes de distribucion, etc.).</w:t>
       </w:r>
     </w:p>
     <w:p>
@@ -2683,7 +2606,24 @@
         <w:ind w:firstLine="709"/>
       </w:pPr>
       <w:r>
-        <w:t xml:space="preserve">   - Recall (43.2%): de todos los que realmente son caros, solo detecta el 43%. O sea, se le escapan varios caros y los clasifica como baratos.</w:t>
+        <w:rPr>
+          <w:b/>
+          <w:color w:val="003399"/>
+        </w:rPr>
+        <w:t xml:space="preserve">[JUSTIFICACION - Interpretacion del R2]: </w:t>
+      </w:r>
+      <w:r>
+        <w:t>Un R2 cercano a cero en un problema con datos reales no es inusual. Indica que el modelo lineal no es suficiente para capturar las relaciones subyacentes, y que se requieren enfoques mas sofisticados (modelos no lineales, mas variables predictoras, transformaciones de los datos). Esto constituye un aprendizaje valioso sobre las limitaciones de la regresion lineal en contextos reales.</w:t>
+      </w:r>
+    </w:p>
+    <w:p/>
+    <w:p>
+      <w:r>
+        <w:rPr>
+          <w:b/>
+          <w:sz w:val="22"/>
+        </w:rPr>
+        <w:t>4.8.2 Metricas de regresion logistica</w:t>
       </w:r>
     </w:p>
     <w:p>
@@ -2691,7 +2631,7 @@
         <w:ind w:firstLine="709"/>
       </w:pPr>
       <w:r>
-        <w:t xml:space="preserve">   - F1 (0.48): es un promedio entre precision y recall. Esta ahi nomas, no es un desastre pero tampoco para celebrar.</w:t>
+        <w:t xml:space="preserve">   - Accuracy: 0.5466 (54.7%)</w:t>
       </w:r>
     </w:p>
     <w:p>
@@ -2699,7 +2639,7 @@
         <w:ind w:firstLine="709"/>
       </w:pPr>
       <w:r>
-        <w:t>Matriz de confusion (la tabla de aciertos y errores):</w:t>
+        <w:t xml:space="preserve">   - Precision: 0.5456</w:t>
       </w:r>
     </w:p>
     <w:p>
@@ -2707,7 +2647,7 @@
         <w:ind w:firstLine="709"/>
       </w:pPr>
       <w:r>
-        <w:t xml:space="preserve">   - Predijo caro y era caro (VP):           8,369</w:t>
+        <w:t xml:space="preserve">   - Recall: 0.4317</w:t>
       </w:r>
     </w:p>
     <w:p>
@@ -2715,7 +2655,16 @@
         <w:ind w:firstLine="709"/>
       </w:pPr>
       <w:r>
-        <w:t xml:space="preserve">   - Predijo caro pero era barato (FP):      6,971</w:t>
+        <w:t xml:space="preserve">   - F1-Score: 0.4820</w:t>
+      </w:r>
+    </w:p>
+    <w:p/>
+    <w:p>
+      <w:pPr>
+        <w:ind w:firstLine="709"/>
+      </w:pPr>
+      <w:r>
+        <w:t>Interpretacion de las metricas de clasificacion:</w:t>
       </w:r>
     </w:p>
     <w:p>
@@ -2723,7 +2672,7 @@
         <w:ind w:firstLine="709"/>
       </w:pPr>
       <w:r>
-        <w:t xml:space="preserve">   - Predijo barato pero era caro (FN):     11,016</w:t>
+        <w:t>El accuracy de 54.7% indica que el modelo acierta en poco mas de la mitad de los casos. Si bien supera el 50% del azar, el margen es estrecho. Esto sugiere que las variables TIPO, PRODUCTO, FABRICANTE, FARMACIA y DEPARTAMENTO contienen cierta informacion util para distinguir precios altos de bajos, pero la senal es debil.</w:t>
       </w:r>
     </w:p>
     <w:p>
@@ -2731,7 +2680,16 @@
         <w:ind w:firstLine="709"/>
       </w:pPr>
       <w:r>
-        <w:t xml:space="preserve">   - Predijo barato y era barato (VN):      13,315</w:t>
+        <w:t>La precision de 0.5456 indica que, cuando el modelo predice que un medicamento es caro, acierta aproximadamente el 55% de las veces. El recall de 0.4317, mas bajo, indica que el modelo deja de detectar una proporcion importante de los precios realmente altos, clasificandolos erroneamente como bajos. Esto describe un modelo conservador que prefiere equivocarse por omision antes que por exceso.</w:t>
+      </w:r>
+    </w:p>
+    <w:p/>
+    <w:p>
+      <w:pPr>
+        <w:ind w:firstLine="709"/>
+      </w:pPr>
+      <w:r>
+        <w:t>Matriz de confusion:</w:t>
       </w:r>
     </w:p>
     <w:p>
@@ -2739,7 +2697,39 @@
         <w:ind w:firstLine="709"/>
       </w:pPr>
       <w:r>
-        <w:t>El modelo tiende a ser conservador: prefiere decir 'barato' cuando duda. Por eso los falsos negativos (11,016) son mas que los falsos positivos (6,971). Es mejor decir 'barato' y equivocarte a decir 'caro' y que la gente se asuste.</w:t>
+        <w:t xml:space="preserve">   - Verdaderos Positivos (predijo alto, era alto):      8,369</w:t>
+      </w:r>
+    </w:p>
+    <w:p>
+      <w:pPr>
+        <w:ind w:firstLine="709"/>
+      </w:pPr>
+      <w:r>
+        <w:t xml:space="preserve">   - Falsos Positivos (predijo alto, era bajo):          6,971</w:t>
+      </w:r>
+    </w:p>
+    <w:p>
+      <w:pPr>
+        <w:ind w:firstLine="709"/>
+      </w:pPr>
+      <w:r>
+        <w:t xml:space="preserve">   - Falsos Negativos (predijo bajo, era alto):         11,016</w:t>
+      </w:r>
+    </w:p>
+    <w:p>
+      <w:pPr>
+        <w:ind w:firstLine="709"/>
+      </w:pPr>
+      <w:r>
+        <w:t xml:space="preserve">   - Verdaderos Negativos (predijo bajo, era bajo):     13,315</w:t>
+      </w:r>
+    </w:p>
+    <w:p>
+      <w:pPr>
+        <w:ind w:firstLine="709"/>
+      </w:pPr>
+      <w:r>
+        <w:t>La matriz de confusion confirma la tendencia conservadora del modelo: los verdaderos negativos (13,315) superan ampliamente a los verdaderos positivos (8,369), lo que indica que el modelo se inclina hacia la prediccion de 'precio bajo' en casos de incertidumbre. El F1-score de 0.4820 refleja el equilibrio entre precision y recall.</w:t>
       </w:r>
     </w:p>
     <w:p>
@@ -2762,7 +2752,7 @@
         <w:ind w:firstLine="709"/>
       </w:pPr>
       <w:r>
-        <w:t>1. Si se pudo. Logre entrenar y evaluar los dos modelos de regresion con datos 100% reales del observatorio de DIGEMID. Fue un proceso largo (sobre todo la parte de conseguir los datos a mano) pero se completo todo lo que pedia la tarea.</w:t>
+        <w:t>1. Los objetivos planteados fueron alcanzados. Se construyeron, entrenaron y evaluaron exitosamente un modelo de regresion lineal multiple y un modelo de regresion logistica sobre datos reales de precios de medicamentos del mercado peruano, obtenidos del Observatorio de Precios de DIGEMID. Se completaron todas las etapas solicitadas en la actividad.</w:t>
       </w:r>
     </w:p>
     <w:p>
@@ -2770,7 +2760,7 @@
         <w:ind w:firstLine="709"/>
       </w:pPr>
       <w:r>
-        <w:t>2. Lo mas complicado no fue programar los modelos (eso es como 10 lineas de codigo con sklearn), sino conseguir y limpiar los datos. Las plataformas del gobierno peruano no estan pensadas para bajar datos masivos, estan pensadas para consultas puntuales. Eso fue una leccion en si misma.</w:t>
+        <w:t>2. La principal dificultad del trabajo no residio en la aplicacion de los modelos, sino en la obtencion y preparacion de los datos. La Plataforma Nacional de Datos Abiertos no dispone del dataset de DIGEMID como un archivo descargable, por lo que fue necesario recurrir directamente al observatorio y recolectar los datos de forma manual. Esto constituye una experiencia real sobre los desafios que implica trabajar con datos abiertos del Estado peruano.</w:t>
       </w:r>
     </w:p>
     <w:p>
@@ -2778,7 +2768,7 @@
         <w:ind w:firstLine="709"/>
       </w:pPr>
       <w:r>
-        <w:t>3. La regresion lineal no funciono muy bien para predecir el precio exacto (R2 casi 0). Pero eso no significa que el trabajo este mal. Significa que el problema es mas complejo de lo que parece y que un modelo lineal simple no basta. Esto es algo que se aprende con la practica, no con la teoria.</w:t>
+        <w:t>3. El modelo de regresion lineal multiple presento limitaciones para predecir el precio exacto, obteniendo un R2 de 0.0016. Este resultado refleja que la relacion entre las variables categoricas disponibles y el precio no es adecuadamente capturada por un modelo lineal simple. No obstante, el ejercicio permitio comprender las limitaciones intrinsecas de este tipo de modelos frente a datos con alta dispersion y relaciones no lineales.</w:t>
       </w:r>
     </w:p>
     <w:p>
@@ -2786,7 +2776,7 @@
         <w:ind w:firstLine="709"/>
       </w:pPr>
       <w:r>
-        <w:t>4. La regresion logistica funciono un poco mejor (55% de acierto, que es mejor que el azar). Para ser solo 5 variables categoricas, no esta nada mal. Ademas las clases estaban balanceadas, asi que el modelo no se sesgo hacia 'barato' o 'caro'.</w:t>
+        <w:t>4. El modelo de regresion logistica mostro un desempeno modesto pero superior al azar, con un accuracy de 54.7%. Esto demuestra que las variables TIPO, DEPARTAMENTO y FABRICANTE contienen informacion util para clasificar precios, aunque la senal es limitada. El modelo resulto ser conservador, con tendencia a clasificar como 'precio bajo' en casos dudosos.</w:t>
       </w:r>
     </w:p>
     <w:p>
@@ -2794,7 +2784,7 @@
         <w:ind w:firstLine="709"/>
       </w:pPr>
       <w:r>
-        <w:t>5. Que aprendi con todo esto:</w:t>
+        <w:t>5. Aprendizajes obtenidos durante el desarrollo del trabajo:</w:t>
       </w:r>
     </w:p>
     <w:p>
@@ -2802,7 +2792,7 @@
         <w:ind w:firstLine="709"/>
       </w:pPr>
       <w:r>
-        <w:t xml:space="preserve">   - Como se arma un proyecto de ML de principio a fin: datos, limpieza, encoding, outliers, split, entrenar, evaluar.</w:t>
+        <w:t xml:space="preserve">   - Comprension del flujo completo de un proyecto de machine learning supervisado: obtencion de datos, limpieza, transformacion, modelado y evaluacion.</w:t>
       </w:r>
     </w:p>
     <w:p>
@@ -2810,7 +2800,7 @@
         <w:ind w:firstLine="709"/>
       </w:pPr>
       <w:r>
-        <w:t xml:space="preserve">   - Que los datos del mundo real son sucios, incompletos y dificiles de conseguir.</w:t>
+        <w:t xml:space="preserve">   - Aplicacion practica de tecnicas de preprocesamiento en un contexto real: normalizacion de texto, encoding de variables categoricas, deteccion de outliers mediante IQR.</w:t>
       </w:r>
     </w:p>
     <w:p>
@@ -2818,7 +2808,7 @@
         <w:ind w:firstLine="709"/>
       </w:pPr>
       <w:r>
-        <w:t xml:space="preserve">   - La diferencia practica entre predecir un numero y clasificar una categoria.</w:t>
+        <w:t xml:space="preserve">   - Implementacion de dos tipos de regresion (lineal y logistica) y comprension de la diferencia entre predecir un valor numerico continuo y clasificar una categoria binaria.</w:t>
       </w:r>
     </w:p>
     <w:p>
@@ -2826,7 +2816,7 @@
         <w:ind w:firstLine="709"/>
       </w:pPr>
       <w:r>
-        <w:t xml:space="preserve">   - Que las metricas hay que interpretarlas, no solo escupir numeros.</w:t>
+        <w:t xml:space="preserve">   - Interpretacion de metricas de evaluacion (RMSE, MAE, R2, accuracy, precision, recall, F1-score y matriz de confusion) en el contexto especifico del problema.</w:t>
       </w:r>
     </w:p>
     <w:p>
@@ -2834,7 +2824,7 @@
         <w:ind w:firstLine="709"/>
       </w:pPr>
       <w:r>
-        <w:t xml:space="preserve">   - Que no siempre vas a tener un R2 de 0.95 y eso esta bien, es parte de aprender.</w:t>
+        <w:t xml:space="preserve">   - Experiencia directa con las limitaciones de las plataformas de datos abiertos del gobierno: accesibilidad, formatos, ausencia de APIs y necesidad de recoleccion manual.</w:t>
       </w:r>
     </w:p>
     <w:p>
@@ -2842,7 +2832,7 @@
         <w:ind w:firstLine="709"/>
       </w:pPr>
       <w:r>
-        <w:t>6. Si tuviera que hacerlo de nuevo:</w:t>
+        <w:t>6. Recomendaciones para trabajos futuros:</w:t>
       </w:r>
     </w:p>
     <w:p>
@@ -2850,7 +2840,7 @@
         <w:ind w:firstLine="709"/>
       </w:pPr>
       <w:r>
-        <w:t xml:space="preserve">   - Agregaria mas variables: la concentracion exacta, la forma farmaceutica, la fecha.</w:t>
+        <w:t xml:space="preserve">   - Incorporar variables adicionales como la concentracion exacta del principio activo (extraida del nombre del producto), la forma farmaceutica y la fecha de registro para capturar tendencias temporales.</w:t>
       </w:r>
     </w:p>
     <w:p>
@@ -2858,7 +2848,7 @@
         <w:ind w:firstLine="709"/>
       </w:pPr>
       <w:r>
-        <w:t xml:space="preserve">   - Probaria modelos no lineales como arboles de decision o random forest.</w:t>
+        <w:t xml:space="preserve">   - Aplicar One-Hot Encoding a las variables de baja cardinalidad (TIPO, DEPARTAMENTO) para eliminar el orden artificial introducido por Label Encoding.</w:t>
       </w:r>
     </w:p>
     <w:p>
@@ -2866,7 +2856,7 @@
         <w:ind w:firstLine="709"/>
       </w:pPr>
       <w:r>
-        <w:t xml:space="preserve">   - Usaria One-Hot Encoding al menos para TIPO y DEPARTAMENTO.</w:t>
+        <w:t xml:space="preserve">   - Explorar modelos no lineales como arboles de decision, Random Forest o Gradient Boosting, que suelen manejar mejor las relaciones complejas entre variables categoricas y el precio.</w:t>
       </w:r>
     </w:p>
     <w:p>
@@ -2874,7 +2864,7 @@
         <w:ind w:firstLine="709"/>
       </w:pPr>
       <w:r>
-        <w:t xml:space="preserve">   - Bajaria mas medicamentos para tener mas variedad.</w:t>
+        <w:t xml:space="preserve">   - Ampliar la muestra a un mayor numero de principios activos para aumentar la representatividad de los resultados.</w:t>
       </w:r>
     </w:p>
     <w:p>
@@ -2906,7 +2896,7 @@
         <w:ind w:firstLine="709"/>
       </w:pPr>
       <w:r>
-        <w:t>[2] DIGEMID - MINSA, "Observatorio de Precios de Medicamentos", [En linea]. Disponible en: https://opm-digemid.minsa.gob.pe/</w:t>
+        <w:t>[2] Direccion General de Medicamentos, Insumos y Drogas (DIGEMID), "Observatorio de Precios de Medicamentos", Ministerio de Salud del Peru. [En linea]. Disponible en: https://opm-digemid.minsa.gob.pe/</w:t>
       </w:r>
     </w:p>
     <w:p/>
@@ -2915,7 +2905,7 @@
         <w:ind w:firstLine="709"/>
       </w:pPr>
       <w:r>
-        <w:t>[3] F. Pedregosa et al., "Scikit-learn: Machine Learning in Python", JMLR, vol. 12, pp. 2825-2830, 2011.</w:t>
+        <w:t>[3] F. Pedregosa et al., "Scikit-learn: Machine Learning in Python", Journal of Machine Learning Research, vol. 12, pp. 2825-2830, 2011.</w:t>
       </w:r>
     </w:p>
     <w:p/>
@@ -2942,7 +2932,7 @@
         <w:ind w:firstLine="709"/>
       </w:pPr>
       <w:r>
-        <w:t>[6] W. McKinney, "Data Structures for Statistical Computing in Python", Proc. 9th Python in Science Conf., pp. 51-56, 2010.</w:t>
+        <w:t>[6] W. McKinney, "Data Structures for Statistical Computing in Python", Proceedings of the 9th Python in Science Conference, pp. 51-56, 2010.</w:t>
       </w:r>
     </w:p>
     <w:p/>
@@ -2951,7 +2941,7 @@
         <w:ind w:firstLine="709"/>
       </w:pPr>
       <w:r>
-        <w:t>[7] T. Hastie, R. Tibshirani, J. Friedman, "The Elements of Statistical Learning", 2da ed. Springer, 2009.</w:t>
+        <w:t>[7] T. Hastie, R. Tibshirani y J. Friedman, The Elements of Statistical Learning: Data Mining, Inference, and Prediction, 2da ed. Nueva York: Springer, 2009.</w:t>
       </w:r>
     </w:p>
     <w:p/>
@@ -2960,7 +2950,7 @@
         <w:ind w:firstLine="709"/>
       </w:pPr>
       <w:r>
-        <w:t>[8] D. Montgomery, E. Peck, G. Vining, "Introduction to Linear Regression Analysis", 5ta ed. Wiley, 2012.</w:t>
+        <w:t>[8] D. C. Montgomery, E. A. Peck y G. G. Vining, Introduction to Linear Regression Analysis, 5ta ed. Nueva Jersey: Wiley, 2012.</w:t>
       </w:r>
     </w:p>
     <w:p/>

</xml_diff>

<commit_message>
Informe final con codigo + resultados Colab, duplicados=600, precios invalidos=17
</commit_message>
<xml_diff>
--- a/informe/informe_semana9_regresion_digemid.docx
+++ b/informe/informe_semana9_regresion_digemid.docx
@@ -158,7 +158,7 @@
         <w:ind w:firstLine="709"/>
       </w:pPr>
       <w:r>
-        <w:t>Ante esta limitacion, se procedio a recolectar los datos de forma manual desde el propio observatorio. Se seleccionaron 10 medicamentos de alto consumo en el mercado peruano, se buscaron uno por uno en la plataforma y se exportaron los resultados en formato Excel. Posteriormente, los 10 archivos fueron concatenados y sometidos a un proceso de limpieza, normalizacion y muestreo estratificado, obteniendo como resultado un dataset unificado de 198,351 registros con precios reales de medicamentos en establecimientos de salud de los 25 departamentos del Peru.</w:t>
+        <w:t>Ante esta limitacion, se procedio a recolectar los datos de forma manual desde el propio observatorio. Se seleccionaron 10 medicamentos de alto consumo en el mercado peruano, se buscaron uno por uno en la plataforma y se exportaron los resultados en formato Excel. Posteriormente, los archivos fueron convertidos a CSV y procesados en Google Colab, donde se concatenaron y se sometieron a un proceso de limpieza, normalizacion y muestreo estratificado, obteniendo como resultado un dataset unificado de 198,351 registros con precios reales de medicamentos en establecimientos de salud de los 25 departamentos del Peru.</w:t>
       </w:r>
     </w:p>
     <w:p/>
@@ -441,7 +441,7 @@
         <w:ind w:firstLine="709"/>
       </w:pPr>
       <w:r>
-        <w:t>Dado que la plataforma solo permite consultas individuales y ademas cuenta con proteccion Cloudflare que impide el scraping automatizado, la unica via factible fue la recoleccion manual. Se seleccionaron 10 medicamentos de alto consumo en el mercado peruano, se ingresaron uno por uno en el buscador del observatorio y se exportaron los resultados en archivos Excel.</w:t>
+        <w:t>Dado que la plataforma solo permite consultas individuales y ademas cuenta con proteccion Cloudflare que impide el scraping automatizado, la unica via factible fue la recoleccion manual. Se seleccionaron 10 medicamentos de alto consumo en el mercado peruano, se ingresaron uno por uno en el buscador del observatorio, se exportaron los resultados en archivos Excel y posteriormente se convirtieron a CSV para su procesamiento en Google Colab.</w:t>
       </w:r>
     </w:p>
     <w:p>
@@ -577,9 +577,10 @@
         <w:ind w:firstLine="709"/>
       </w:pPr>
       <w:r>
-        <w:t>Cada archivo Excel exportado desde el observatorio de DIGEMID contiene 12 columnas. Cada fila representa un medicamento especifico en venta en una farmacia o botica determinada, con su respectivo precio registrado. A continuacion se describe cada columna:</w:t>
-      </w:r>
-    </w:p>
+        <w:t>Cada archivo Excel exportado desde el observatorio de DIGEMID contiene 12 columnas. Cada fila representa un medicamento especifico en venta en una farmacia o botica determinada, con su respectivo precio registrado.</w:t>
+      </w:r>
+    </w:p>
+    <w:p/>
     <w:p>
       <w:pPr>
         <w:ind w:firstLine="709"/>
@@ -591,7 +592,7 @@
         <w:t xml:space="preserve">  TIPO: </w:t>
       </w:r>
       <w:r>
-        <w:t>Categorico (2 valores: PRIVADO, PUBLICO). Indica si el producto corresponde al sector privado (farmacias, boticas, cadenas) o al sector publico (hospitales del MINSA).</w:t>
+        <w:t>Categorico (2 valores: PRIVADO, PUBLICO). Indica si el producto corresponde al sector privado o al sector publico.</w:t>
       </w:r>
     </w:p>
     <w:p>
@@ -605,7 +606,7 @@
         <w:t xml:space="preserve">  FECHA DE ACTUALIZACION: </w:t>
       </w:r>
       <w:r>
-        <w:t>Fecha y hora en que se registro o actualizo el precio en el observatorio. Todos los datos recolectados corresponden a mayo-junio de 2026.</w:t>
+        <w:t>Fecha y hora en que se registro o actualizo el precio. Todos los datos recolectados corresponden a mayo-junio de 2026.</w:t>
       </w:r>
     </w:p>
     <w:p>
@@ -619,7 +620,7 @@
         <w:t xml:space="preserve">  NOMBRE DE PRODUCTO: </w:t>
       </w:r>
       <w:r>
-        <w:t>Categorico (303 valores unicos). Contiene el nombre comercial, el principio activo, la concentracion y la forma farmaceutica (ej. 'PARACETAMOL 500 mg Tableta').</w:t>
+        <w:t>Categorico (303 valores unicos). Contiene el nombre comercial, el principio activo, la concentracion y la forma farmaceutica.</w:t>
       </w:r>
     </w:p>
     <w:p>
@@ -633,7 +634,7 @@
         <w:t xml:space="preserve">  TITULAR: </w:t>
       </w:r>
       <w:r>
-        <w:t>Categorico. Empresa que posee el registro sanitario del producto ante DIGEMID. En muchos casos coincide con el fabricante.</w:t>
+        <w:t>Categorico. Empresa que posee el registro sanitario del producto ante DIGEMID.</w:t>
       </w:r>
     </w:p>
     <w:p>
@@ -675,7 +676,7 @@
         <w:t xml:space="preserve">  TELEFONO: </w:t>
       </w:r>
       <w:r>
-        <w:t>Dato de contacto del establecimiento. No se utiliza en los modelos de regresion por carecer de valor predictivo.</w:t>
+        <w:t>Dato de contacto del establecimiento. No se utiliza en los modelos por carecer de valor predictivo.</w:t>
       </w:r>
     </w:p>
     <w:p>
@@ -689,7 +690,7 @@
         <w:t xml:space="preserve">  PRECIO UNITARIO: </w:t>
       </w:r>
       <w:r>
-        <w:t>Cuantitativa continua. Precio de venta al publico expresado en soles (S/). Es la variable objetivo (target) para el modelo de regresion lineal.</w:t>
+        <w:t>Cuantitativa continua. Precio de venta al publico en soles (S/). Es la variable objetivo para el modelo de regresion lineal.</w:t>
       </w:r>
     </w:p>
     <w:p>
@@ -731,7 +732,7 @@
         <w:t xml:space="preserve">  DISTRITO: </w:t>
       </w:r>
       <w:r>
-        <w:t>Categorico. No se utiliza por la misma razon que PROVINCIA.</w:t>
+        <w:t>Categorico. No se utiliza por la misma razon.</w:t>
       </w:r>
     </w:p>
     <w:p>
@@ -745,7 +746,7 @@
         <w:t xml:space="preserve">  DIRECCION: </w:t>
       </w:r>
       <w:r>
-        <w:t>Texto. Direccion exacta del establecimiento. No aporta valor predictivo al modelo.</w:t>
+        <w:t>Texto. Direccion exacta del establecimiento. No aporta valor predictivo.</w:t>
       </w:r>
     </w:p>
     <w:p/>
@@ -754,7 +755,7 @@
         <w:ind w:firstLine="709"/>
       </w:pPr>
       <w:r>
-        <w:t>De las 12 columnas, se seleccionaron 5 como variables predictoras (features) y 1 como variable objetivo (target). Las 6 restantes se descartaron por no aportar informacion relevante para la prediccion.</w:t>
+        <w:t>De las 12 columnas, se seleccionaron 5 como variables predictoras y 1 como variable objetivo. Las 6 restantes se descartaron por no aportar informacion relevante.</w:t>
       </w:r>
     </w:p>
     <w:p/>
@@ -763,7 +764,7 @@
         <w:ind w:firstLine="709"/>
       </w:pPr>
       <w:r>
-        <w:t>Variables predictoras seleccionadas:</w:t>
+        <w:t>Variables predictoras: TIPO, NOMBRE DE PRODUCTO, FABRICANTE, FARMACIA/BOTICA, DEPARTAMENTO.</w:t>
       </w:r>
     </w:p>
     <w:p>
@@ -771,7 +772,7 @@
         <w:ind w:firstLine="709"/>
       </w:pPr>
       <w:r>
-        <w:t xml:space="preserve">   - TIPO: Influye en el precio porque los productos de marca y genericos tienen estructuras de costo diferentes.</w:t>
+        <w:t>Variable objetivo para regresion lineal: PRECIO UNITARIO.</w:t>
       </w:r>
     </w:p>
     <w:p>
@@ -779,56 +780,7 @@
         <w:ind w:firstLine="709"/>
       </w:pPr>
       <w:r>
-        <w:t xml:space="preserve">   - NOMBRE DE PRODUCTO: Cada medicamento tiene un costo de produccion distinto segun su principio activo.</w:t>
-      </w:r>
-    </w:p>
-    <w:p>
-      <w:pPr>
-        <w:ind w:firstLine="709"/>
-      </w:pPr>
-      <w:r>
-        <w:t xml:space="preserve">   - FABRICANTE: Los laboratorios grandes y pequenos manejan escalas de produccion y margenes distintos.</w:t>
-      </w:r>
-    </w:p>
-    <w:p>
-      <w:pPr>
-        <w:ind w:firstLine="709"/>
-      </w:pPr>
-      <w:r>
-        <w:t xml:space="preserve">   - FARMACIA / BOTICA: Cada establecimiento aplica su propio margen comercial sobre el precio.</w:t>
-      </w:r>
-    </w:p>
-    <w:p>
-      <w:pPr>
-        <w:ind w:firstLine="709"/>
-      </w:pPr>
-      <w:r>
-        <w:t xml:space="preserve">   - DEPARTAMENTO: La ubicacion geografica afecta los costos logisticos y, por tanto, el precio final.</w:t>
-      </w:r>
-    </w:p>
-    <w:p/>
-    <w:p>
-      <w:pPr>
-        <w:ind w:firstLine="709"/>
-      </w:pPr>
-      <w:r>
-        <w:t>Variable objetivo:</w:t>
-      </w:r>
-    </w:p>
-    <w:p>
-      <w:pPr>
-        <w:ind w:firstLine="709"/>
-      </w:pPr>
-      <w:r>
-        <w:t xml:space="preserve">   - Para regresion lineal: PRECIO UNITARIO (cuantitativa continua).</w:t>
-      </w:r>
-    </w:p>
-    <w:p>
-      <w:pPr>
-        <w:ind w:firstLine="709"/>
-      </w:pPr>
-      <w:r>
-        <w:t xml:space="preserve">   - Para regresion logistica: PRECIO_ALTO (binaria: 1 si el precio supera la mediana del mercado, 0 en caso contrario).</w:t>
+        <w:t>Variable objetivo para regresion logistica: PRECIO_ALTO (1 si &gt; mediana, 0 si no).</w:t>
       </w:r>
     </w:p>
     <w:p>
@@ -843,7 +795,7 @@
         <w:t xml:space="preserve">[JUSTIFICACION - Exclusion de variables]: </w:t>
       </w:r>
       <w:r>
-        <w:t>TELEFONO y DIRECCION son datos de contacto sin relacion causal con el precio. PROVINCIA y DISTRITO se excluyen para evitar redundancia con DEPARTAMENTO y no aumentar la dimensionalidad del modelo innecesariamente. TITULAR se excluye porque en la mayoria de casos coincide con FABRICANTE, lo que generaria colinealidad.</w:t>
+        <w:t>TELEFONO y DIRECCION son datos de contacto sin relacion causal con el precio. PROVINCIA y DISTRITO se excluyen para evitar redundancia con DEPARTAMENTO. TITULAR se excluye porque generalmente coincide con FABRICANTE, generando colinealidad.</w:t>
       </w:r>
     </w:p>
     <w:p/>
@@ -853,7 +805,7 @@
           <w:b/>
           <w:sz w:val="22"/>
         </w:rPr>
-        <w:t>4.2 Limpieza y tratamiento de datos faltantes</w:t>
+        <w:t>4.2 Carga, concatenacion y limpieza de datos</w:t>
       </w:r>
     </w:p>
     <w:p/>
@@ -862,9 +814,391 @@
         <w:ind w:firstLine="709"/>
       </w:pPr>
       <w:r>
-        <w:t>Una vez obtenidos los 10 archivos Excel desde el observatorio, el primer paso fue inspeccionar cada uno de forma individual antes de proceder a la union. A continuacion se muestra el desglose de cada dataset:</w:t>
-      </w:r>
-    </w:p>
+        <w:t>El procesamiento se realizo en Google Colab. Los archivos Excel fueron previamente convertidos a CSV para facilitar su carga. A continuacion se muestra el codigo utilizado y los resultados obtenidos en cada paso.</w:t>
+      </w:r>
+    </w:p>
+    <w:p/>
+    <w:p>
+      <w:r>
+        <w:rPr>
+          <w:b/>
+          <w:sz w:val="22"/>
+        </w:rPr>
+        <w:t>4.2.1 Carga de los 10 archivos CSV</w:t>
+      </w:r>
+    </w:p>
+    <w:p/>
+    <w:p>
+      <w:pPr>
+        <w:ind w:firstLine="709"/>
+      </w:pPr>
+      <w:r>
+        <w:t>Se cargaron los 10 archivos CSV con pandas.read_csv() y se inspecciono cada uno para verificar sus dimensiones antes de la concatenacion.</w:t>
+      </w:r>
+    </w:p>
+    <w:p/>
+    <w:p>
+      <w:pPr>
+        <w:ind w:left="709"/>
+      </w:pPr>
+      <w:r>
+        <w:rPr>
+          <w:rFonts w:ascii="Courier New" w:hAnsi="Courier New"/>
+          <w:color w:val="333333"/>
+          <w:sz w:val="16"/>
+        </w:rPr>
+        <w:t>import pandas as pd, unicodedata</w:t>
+      </w:r>
+    </w:p>
+    <w:p>
+      <w:pPr>
+        <w:ind w:left="709"/>
+      </w:pPr>
+      <w:r>
+        <w:rPr>
+          <w:rFonts w:ascii="Courier New" w:hAnsi="Courier New"/>
+          <w:color w:val="333333"/>
+          <w:sz w:val="16"/>
+        </w:rPr>
+      </w:r>
+    </w:p>
+    <w:p>
+      <w:pPr>
+        <w:ind w:left="709"/>
+      </w:pPr>
+      <w:r>
+        <w:rPr>
+          <w:rFonts w:ascii="Courier New" w:hAnsi="Courier New"/>
+          <w:color w:val="333333"/>
+          <w:sz w:val="16"/>
+        </w:rPr>
+        <w:t>archivos = ['paracetamol.csv','Ibuprofeno.csv','Amoxicilina.csv',</w:t>
+      </w:r>
+    </w:p>
+    <w:p>
+      <w:pPr>
+        <w:ind w:left="709"/>
+      </w:pPr>
+      <w:r>
+        <w:rPr>
+          <w:rFonts w:ascii="Courier New" w:hAnsi="Courier New"/>
+          <w:color w:val="333333"/>
+          <w:sz w:val="16"/>
+        </w:rPr>
+        <w:t xml:space="preserve">            'Diclofenaco.csv','Omeprazol.csv','Losartan.csv',</w:t>
+      </w:r>
+    </w:p>
+    <w:p>
+      <w:pPr>
+        <w:ind w:left="709"/>
+      </w:pPr>
+      <w:r>
+        <w:rPr>
+          <w:rFonts w:ascii="Courier New" w:hAnsi="Courier New"/>
+          <w:color w:val="333333"/>
+          <w:sz w:val="16"/>
+        </w:rPr>
+        <w:t xml:space="preserve">            'Metformina.csv','Azitromicina.csv','Enalapril.csv',</w:t>
+      </w:r>
+    </w:p>
+    <w:p>
+      <w:pPr>
+        <w:ind w:left="709"/>
+      </w:pPr>
+      <w:r>
+        <w:rPr>
+          <w:rFonts w:ascii="Courier New" w:hAnsi="Courier New"/>
+          <w:color w:val="333333"/>
+          <w:sz w:val="16"/>
+        </w:rPr>
+        <w:t xml:space="preserve">            'Clorfenamina.csv']</w:t>
+      </w:r>
+    </w:p>
+    <w:p>
+      <w:pPr>
+        <w:ind w:left="709"/>
+      </w:pPr>
+      <w:r>
+        <w:rPr>
+          <w:rFonts w:ascii="Courier New" w:hAnsi="Courier New"/>
+          <w:color w:val="333333"/>
+          <w:sz w:val="16"/>
+        </w:rPr>
+      </w:r>
+    </w:p>
+    <w:p>
+      <w:pPr>
+        <w:ind w:left="709"/>
+      </w:pPr>
+      <w:r>
+        <w:rPr>
+          <w:rFonts w:ascii="Courier New" w:hAnsi="Courier New"/>
+          <w:color w:val="333333"/>
+          <w:sz w:val="16"/>
+        </w:rPr>
+        <w:t>trozos = []; total = 0</w:t>
+      </w:r>
+    </w:p>
+    <w:p>
+      <w:pPr>
+        <w:ind w:left="709"/>
+      </w:pPr>
+      <w:r>
+        <w:rPr>
+          <w:rFonts w:ascii="Courier New" w:hAnsi="Courier New"/>
+          <w:color w:val="333333"/>
+          <w:sz w:val="16"/>
+        </w:rPr>
+        <w:t>for a in archivos:</w:t>
+      </w:r>
+    </w:p>
+    <w:p>
+      <w:pPr>
+        <w:ind w:left="709"/>
+      </w:pPr>
+      <w:r>
+        <w:rPr>
+          <w:rFonts w:ascii="Courier New" w:hAnsi="Courier New"/>
+          <w:color w:val="333333"/>
+          <w:sz w:val="16"/>
+        </w:rPr>
+        <w:t xml:space="preserve">    d = pd.read_csv(a, encoding='utf-8', low_memory=False)</w:t>
+      </w:r>
+    </w:p>
+    <w:p>
+      <w:pPr>
+        <w:ind w:left="709"/>
+      </w:pPr>
+      <w:r>
+        <w:rPr>
+          <w:rFonts w:ascii="Courier New" w:hAnsi="Courier New"/>
+          <w:color w:val="333333"/>
+          <w:sz w:val="16"/>
+        </w:rPr>
+        <w:t xml:space="preserve">    d = d.dropna(how='all')</w:t>
+      </w:r>
+    </w:p>
+    <w:p>
+      <w:pPr>
+        <w:ind w:left="709"/>
+      </w:pPr>
+      <w:r>
+        <w:rPr>
+          <w:rFonts w:ascii="Courier New" w:hAnsi="Courier New"/>
+          <w:color w:val="333333"/>
+          <w:sz w:val="16"/>
+        </w:rPr>
+        <w:t xml:space="preserve">    n = len(d); total += n</w:t>
+      </w:r>
+    </w:p>
+    <w:p>
+      <w:pPr>
+        <w:ind w:left="709"/>
+      </w:pPr>
+      <w:r>
+        <w:rPr>
+          <w:rFonts w:ascii="Courier New" w:hAnsi="Courier New"/>
+          <w:color w:val="333333"/>
+          <w:sz w:val="16"/>
+        </w:rPr>
+        <w:t xml:space="preserve">    print(f'{a}: {n:,} filas | {d[chr(34)Nombre de producto'chr(34)].nunique()} productos')</w:t>
+      </w:r>
+    </w:p>
+    <w:p>
+      <w:pPr>
+        <w:ind w:left="709"/>
+      </w:pPr>
+      <w:r>
+        <w:rPr>
+          <w:rFonts w:ascii="Courier New" w:hAnsi="Courier New"/>
+          <w:color w:val="333333"/>
+          <w:sz w:val="16"/>
+        </w:rPr>
+        <w:t xml:space="preserve">    trozos.append(d)</w:t>
+      </w:r>
+    </w:p>
+    <w:p>
+      <w:pPr>
+        <w:ind w:left="709"/>
+      </w:pPr>
+      <w:r>
+        <w:rPr>
+          <w:rFonts w:ascii="Courier New" w:hAnsi="Courier New"/>
+          <w:color w:val="333333"/>
+          <w:sz w:val="16"/>
+        </w:rPr>
+        <w:t>print(f'TOTAL BRUTO: {total:,}')</w:t>
+      </w:r>
+    </w:p>
+    <w:p/>
+    <w:p>
+      <w:pPr>
+        <w:ind w:left="709"/>
+      </w:pPr>
+      <w:r>
+        <w:rPr>
+          <w:rFonts w:ascii="Courier New" w:hAnsi="Courier New"/>
+          <w:i/>
+          <w:color w:val="006600"/>
+          <w:sz w:val="16"/>
+        </w:rPr>
+        <w:t>paracetamol.csv: 63,249 filas | 42 productos | 25 deptos | 37 fabricantes</w:t>
+      </w:r>
+    </w:p>
+    <w:p>
+      <w:pPr>
+        <w:ind w:left="709"/>
+      </w:pPr>
+      <w:r>
+        <w:rPr>
+          <w:rFonts w:ascii="Courier New" w:hAnsi="Courier New"/>
+          <w:i/>
+          <w:color w:val="006600"/>
+          <w:sz w:val="16"/>
+        </w:rPr>
+        <w:t>Ibuprofeno.csv: 57,427 filas | 36 productos | 25 deptos | 29 fabricantes</w:t>
+      </w:r>
+    </w:p>
+    <w:p>
+      <w:pPr>
+        <w:ind w:left="709"/>
+      </w:pPr>
+      <w:r>
+        <w:rPr>
+          <w:rFonts w:ascii="Courier New" w:hAnsi="Courier New"/>
+          <w:i/>
+          <w:color w:val="006600"/>
+          <w:sz w:val="16"/>
+        </w:rPr>
+        <w:t>Amoxicilina.csv: 49,172 filas | 34 productos | 25 deptos | 16 fabricantes</w:t>
+      </w:r>
+    </w:p>
+    <w:p>
+      <w:pPr>
+        <w:ind w:left="709"/>
+      </w:pPr>
+      <w:r>
+        <w:rPr>
+          <w:rFonts w:ascii="Courier New" w:hAnsi="Courier New"/>
+          <w:i/>
+          <w:color w:val="006600"/>
+          <w:sz w:val="16"/>
+        </w:rPr>
+        <w:t>Diclofenaco.csv: 42,899 filas | 21 productos | 25 deptos | 17 fabricantes</w:t>
+      </w:r>
+    </w:p>
+    <w:p>
+      <w:pPr>
+        <w:ind w:left="709"/>
+      </w:pPr>
+      <w:r>
+        <w:rPr>
+          <w:rFonts w:ascii="Courier New" w:hAnsi="Courier New"/>
+          <w:i/>
+          <w:color w:val="006600"/>
+          <w:sz w:val="16"/>
+        </w:rPr>
+        <w:t>Omeprazol.csv: 35,346 filas | 33 productos | 25 deptos | 30 fabricantes</w:t>
+      </w:r>
+    </w:p>
+    <w:p>
+      <w:pPr>
+        <w:ind w:left="709"/>
+      </w:pPr>
+      <w:r>
+        <w:rPr>
+          <w:rFonts w:ascii="Courier New" w:hAnsi="Courier New"/>
+          <w:i/>
+          <w:color w:val="006600"/>
+          <w:sz w:val="16"/>
+        </w:rPr>
+        <w:t>Losartan.csv: 40,569 filas | 22 productos | 25 deptos | 27 fabricantes</w:t>
+      </w:r>
+    </w:p>
+    <w:p>
+      <w:pPr>
+        <w:ind w:left="709"/>
+      </w:pPr>
+      <w:r>
+        <w:rPr>
+          <w:rFonts w:ascii="Courier New" w:hAnsi="Courier New"/>
+          <w:i/>
+          <w:color w:val="006600"/>
+          <w:sz w:val="16"/>
+        </w:rPr>
+        <w:t>Metformina.csv: 35,568 filas | 38 productos | 25 deptos | 34 fabricantes</w:t>
+      </w:r>
+    </w:p>
+    <w:p>
+      <w:pPr>
+        <w:ind w:left="709"/>
+      </w:pPr>
+      <w:r>
+        <w:rPr>
+          <w:rFonts w:ascii="Courier New" w:hAnsi="Courier New"/>
+          <w:i/>
+          <w:color w:val="006600"/>
+          <w:sz w:val="16"/>
+        </w:rPr>
+        <w:t>Azitromicina.csv: 63,371 filas | 58 productos | 25 deptos | 40 fabricantes</w:t>
+      </w:r>
+    </w:p>
+    <w:p>
+      <w:pPr>
+        <w:ind w:left="709"/>
+      </w:pPr>
+      <w:r>
+        <w:rPr>
+          <w:rFonts w:ascii="Courier New" w:hAnsi="Courier New"/>
+          <w:i/>
+          <w:color w:val="006600"/>
+          <w:sz w:val="16"/>
+        </w:rPr>
+        <w:t>Enalapril.csv: 21,460 filas | 6 productos | 25 deptos | 11 fabricantes</w:t>
+      </w:r>
+    </w:p>
+    <w:p>
+      <w:pPr>
+        <w:ind w:left="709"/>
+      </w:pPr>
+      <w:r>
+        <w:rPr>
+          <w:rFonts w:ascii="Courier New" w:hAnsi="Courier New"/>
+          <w:i/>
+          <w:color w:val="006600"/>
+          <w:sz w:val="16"/>
+        </w:rPr>
+        <w:t>Clorfenamina.csv: 28,072 filas | 14 productos | 25 deptos | 13 fabricantes</w:t>
+      </w:r>
+    </w:p>
+    <w:p>
+      <w:pPr>
+        <w:ind w:left="709"/>
+      </w:pPr>
+      <w:r>
+        <w:rPr>
+          <w:rFonts w:ascii="Courier New" w:hAnsi="Courier New"/>
+          <w:i/>
+          <w:color w:val="006600"/>
+          <w:sz w:val="16"/>
+        </w:rPr>
+      </w:r>
+    </w:p>
+    <w:p>
+      <w:pPr>
+        <w:ind w:left="709"/>
+      </w:pPr>
+      <w:r>
+        <w:rPr>
+          <w:rFonts w:ascii="Courier New" w:hAnsi="Courier New"/>
+          <w:i/>
+          <w:color w:val="006600"/>
+          <w:sz w:val="16"/>
+        </w:rPr>
+        <w:t>TOTAL BRUTO: 437,133</w:t>
+      </w:r>
+    </w:p>
+    <w:p/>
     <w:tbl>
       <w:tblPr>
         <w:tblStyle w:val="LightShading-Accent1"/>
@@ -933,8 +1267,6 @@
                 <w:sz w:val="16"/>
               </w:rPr>
               <w:t>Productos</w:t>
-              <w:br/>
-              <w:t>(marcas+gen.)</w:t>
             </w:r>
           </w:p>
         </w:tc>
@@ -1854,61 +2186,12 @@
     </w:tbl>
     <w:p/>
     <w:p>
-      <w:pPr>
-        <w:ind w:firstLine="709"/>
-      </w:pPr>
-      <w:r>
-        <w:t>Como se observa en la tabla, los 10 archivos suman un total de 437,133 registros en bruto. Se aprecia que cada medicamento incluye todas sus variantes comerciales (marcas y genericos de distintos laboratorios), lo que explica que, por ejemplo, Azitromicina tenga 58 presentaciones diferentes en el mercado. Los 25 departamentos del Peru estan representados en todos los archivos, garantizando cobertura nacional. En cuanto a los precios, se observa una dispersion considerable: desde S/0.01 (medicamentos genericos basicos) hasta S/33,000.00 (medicamentos de alto costo del sector publico).</w:t>
-      </w:r>
-    </w:p>
-    <w:p>
-      <w:pPr>
-        <w:ind w:firstLine="709"/>
-      </w:pPr>
-      <w:r>
-        <w:t>Posteriormente, los 10 archivos se concatenaron en un unico DataFrame utilizando pandas.concat(). Sobre este dataset unificado se aplico el siguiente proceso de limpieza:</w:t>
-      </w:r>
-    </w:p>
-    <w:p/>
-    <w:p>
-      <w:pPr>
-        <w:ind w:firstLine="709"/>
-      </w:pPr>
-      <w:r>
-        <w:t>a) Eliminacion de duplicados. Se verifico la existencia de filas identicas (mismo producto, mismo establecimiento, mismo precio en la misma fecha). No se encontraron registros duplicados, pero se ejecuto drop_duplicates() como medida preventiva.</w:t>
-      </w:r>
-    </w:p>
-    <w:p/>
-    <w:p>
-      <w:pPr>
-        <w:ind w:firstLine="709"/>
-      </w:pPr>
-      <w:r>
-        <w:t>b) Conversion y filtrado del precio. La columna PRECIO UNITARIO se convirtio de texto a tipo numerico (float). Los registros con precio nulo, igual a cero o negativo fueron eliminados, ya que no representan un valor de mercado valido.</w:t>
-      </w:r>
-    </w:p>
-    <w:p/>
-    <w:p>
-      <w:pPr>
-        <w:ind w:firstLine="709"/>
-      </w:pPr>
-      <w:r>
-        <w:t>c) Normalizacion de texto. Se eliminaron tildes, se unificaron mayusculas y se removieron espacios sobrantes en todos los campos de texto. Ademas, se corrigio la columna TIPO que presentaba caracteres con espaciado irregular (ej. 'P u b l i c o' fue corregido a 'PUBLICO').</w:t>
-      </w:r>
-    </w:p>
-    <w:p>
-      <w:pPr>
-        <w:ind w:firstLine="709"/>
-      </w:pPr>
       <w:r>
         <w:rPr>
           <w:b/>
-          <w:color w:val="003399"/>
+          <w:sz w:val="22"/>
         </w:rPr>
-        <w:t xml:space="preserve">[JUSTIFICACION - Importancia de la normalizacion]: </w:t>
-      </w:r>
-      <w:r>
-        <w:t>Sin este paso, variantes como 'LIMA', 'Lima' y 'lima' serian tratadas como categorias distintas por el modelo, fragmentando artificialmente los datos y debilitando la capacidad predictiva. La normalizacion asegura que cada entidad geografica, fabricante o producto tenga una representacion unica y consistente.</w:t>
+        <w:t>4.2.2 Concatenacion y limpieza</w:t>
       </w:r>
     </w:p>
     <w:p/>
@@ -1917,32 +2200,702 @@
         <w:ind w:firstLine="709"/>
       </w:pPr>
       <w:r>
-        <w:t>d) Muestreo estratificado. El dataset bruto de 437,133 registros resultaba excesivo para el entrenamiento de los modelos, sin que un mayor volumen aportara necesariamente un beneficio predictivo proporcional. Se aplico un muestreo estratificado, limitando a un maximo de 2,000 registros por cada una de las 303 presentaciones de medicamento. Este procedimiento preserva la diversidad de la muestra (todas las presentaciones estan representadas) mientras mantiene un tamano manejable para los algoritmos de regresion.</w:t>
+        <w:t>Una vez inspeccionados, los 10 DataFrames se concatenaron con pd.concat() y se aplico el siguiente proceso de limpieza.</w:t>
       </w:r>
     </w:p>
     <w:p/>
     <w:p>
       <w:pPr>
+        <w:ind w:left="709"/>
+      </w:pPr>
+      <w:r>
+        <w:rPr>
+          <w:rFonts w:ascii="Courier New" w:hAnsi="Courier New"/>
+          <w:color w:val="333333"/>
+          <w:sz w:val="16"/>
+        </w:rPr>
+        <w:t>df = pd.concat(trozos, ignore_index=True)</w:t>
+      </w:r>
+    </w:p>
+    <w:p>
+      <w:pPr>
+        <w:ind w:left="709"/>
+      </w:pPr>
+      <w:r>
+        <w:rPr>
+          <w:rFonts w:ascii="Courier New" w:hAnsi="Courier New"/>
+          <w:color w:val="333333"/>
+          <w:sz w:val="16"/>
+        </w:rPr>
+      </w:r>
+    </w:p>
+    <w:p>
+      <w:pPr>
+        <w:ind w:left="709"/>
+      </w:pPr>
+      <w:r>
+        <w:rPr>
+          <w:rFonts w:ascii="Courier New" w:hAnsi="Courier New"/>
+          <w:color w:val="333333"/>
+          <w:sz w:val="16"/>
+        </w:rPr>
+        <w:t># Eliminar duplicados</w:t>
+      </w:r>
+    </w:p>
+    <w:p>
+      <w:pPr>
+        <w:ind w:left="709"/>
+      </w:pPr>
+      <w:r>
+        <w:rPr>
+          <w:rFonts w:ascii="Courier New" w:hAnsi="Courier New"/>
+          <w:color w:val="333333"/>
+          <w:sz w:val="16"/>
+        </w:rPr>
+        <w:t>antes = len(df); df = df.drop_duplicates()</w:t>
+      </w:r>
+    </w:p>
+    <w:p>
+      <w:pPr>
+        <w:ind w:left="709"/>
+      </w:pPr>
+      <w:r>
+        <w:rPr>
+          <w:rFonts w:ascii="Courier New" w:hAnsi="Courier New"/>
+          <w:color w:val="333333"/>
+          <w:sz w:val="16"/>
+        </w:rPr>
+        <w:t>print(f'Duplicados eliminados: {antes - len(df)}')</w:t>
+      </w:r>
+    </w:p>
+    <w:p>
+      <w:pPr>
+        <w:ind w:left="709"/>
+      </w:pPr>
+      <w:r>
+        <w:rPr>
+          <w:rFonts w:ascii="Courier New" w:hAnsi="Courier New"/>
+          <w:color w:val="333333"/>
+          <w:sz w:val="16"/>
+        </w:rPr>
+      </w:r>
+    </w:p>
+    <w:p>
+      <w:pPr>
+        <w:ind w:left="709"/>
+      </w:pPr>
+      <w:r>
+        <w:rPr>
+          <w:rFonts w:ascii="Courier New" w:hAnsi="Courier New"/>
+          <w:color w:val="333333"/>
+          <w:sz w:val="16"/>
+        </w:rPr>
+        <w:t># Convertir precio y filtrar nulos</w:t>
+      </w:r>
+    </w:p>
+    <w:p>
+      <w:pPr>
+        <w:ind w:left="709"/>
+      </w:pPr>
+      <w:r>
+        <w:rPr>
+          <w:rFonts w:ascii="Courier New" w:hAnsi="Courier New"/>
+          <w:color w:val="333333"/>
+          <w:sz w:val="16"/>
+        </w:rPr>
+        <w:t>df['Precio Unit.'] = pd.to_numeric(df['Precio Unit.'], errors='coerce')</w:t>
+      </w:r>
+    </w:p>
+    <w:p>
+      <w:pPr>
+        <w:ind w:left="709"/>
+      </w:pPr>
+      <w:r>
+        <w:rPr>
+          <w:rFonts w:ascii="Courier New" w:hAnsi="Courier New"/>
+          <w:color w:val="333333"/>
+          <w:sz w:val="16"/>
+        </w:rPr>
+        <w:t>antes2 = len(df)</w:t>
+      </w:r>
+    </w:p>
+    <w:p>
+      <w:pPr>
+        <w:ind w:left="709"/>
+      </w:pPr>
+      <w:r>
+        <w:rPr>
+          <w:rFonts w:ascii="Courier New" w:hAnsi="Courier New"/>
+          <w:color w:val="333333"/>
+          <w:sz w:val="16"/>
+        </w:rPr>
+        <w:t>df = df[df['Precio Unit.'].notna() &amp; (df['Precio Unit.'] &gt; 0)]</w:t>
+      </w:r>
+    </w:p>
+    <w:p>
+      <w:pPr>
+        <w:ind w:left="709"/>
+      </w:pPr>
+      <w:r>
+        <w:rPr>
+          <w:rFonts w:ascii="Courier New" w:hAnsi="Courier New"/>
+          <w:color w:val="333333"/>
+          <w:sz w:val="16"/>
+        </w:rPr>
+        <w:t>print(f'Precios invalidos eliminados: {antes2 - len(df)}')</w:t>
+      </w:r>
+    </w:p>
+    <w:p>
+      <w:pPr>
+        <w:ind w:left="709"/>
+      </w:pPr>
+      <w:r>
+        <w:rPr>
+          <w:rFonts w:ascii="Courier New" w:hAnsi="Courier New"/>
+          <w:color w:val="333333"/>
+          <w:sz w:val="16"/>
+        </w:rPr>
+      </w:r>
+    </w:p>
+    <w:p>
+      <w:pPr>
+        <w:ind w:left="709"/>
+      </w:pPr>
+      <w:r>
+        <w:rPr>
+          <w:rFonts w:ascii="Courier New" w:hAnsi="Courier New"/>
+          <w:color w:val="333333"/>
+          <w:sz w:val="16"/>
+        </w:rPr>
+        <w:t># Normalizar texto (quitar tildes, mayusculas)</w:t>
+      </w:r>
+    </w:p>
+    <w:p>
+      <w:pPr>
+        <w:ind w:left="709"/>
+      </w:pPr>
+      <w:r>
+        <w:rPr>
+          <w:rFonts w:ascii="Courier New" w:hAnsi="Courier New"/>
+          <w:color w:val="333333"/>
+          <w:sz w:val="16"/>
+        </w:rPr>
+        <w:t>def limpiar(s):</w:t>
+      </w:r>
+    </w:p>
+    <w:p>
+      <w:pPr>
+        <w:ind w:left="709"/>
+      </w:pPr>
+      <w:r>
+        <w:rPr>
+          <w:rFonts w:ascii="Courier New" w:hAnsi="Courier New"/>
+          <w:color w:val="333333"/>
+          <w:sz w:val="16"/>
+        </w:rPr>
+        <w:t xml:space="preserve">    if pd.isna(s): return 'DESCONOCIDO'</w:t>
+      </w:r>
+    </w:p>
+    <w:p>
+      <w:pPr>
+        <w:ind w:left="709"/>
+      </w:pPr>
+      <w:r>
+        <w:rPr>
+          <w:rFonts w:ascii="Courier New" w:hAnsi="Courier New"/>
+          <w:color w:val="333333"/>
+          <w:sz w:val="16"/>
+        </w:rPr>
+        <w:t xml:space="preserve">    s = str(s).strip().upper()</w:t>
+      </w:r>
+    </w:p>
+    <w:p>
+      <w:pPr>
+        <w:ind w:left="709"/>
+      </w:pPr>
+      <w:r>
+        <w:rPr>
+          <w:rFonts w:ascii="Courier New" w:hAnsi="Courier New"/>
+          <w:color w:val="333333"/>
+          <w:sz w:val="16"/>
+        </w:rPr>
+        <w:t xml:space="preserve">    return ''.join(c for c in unicodedata.normalize('NFKD', s)</w:t>
+      </w:r>
+    </w:p>
+    <w:p>
+      <w:pPr>
+        <w:ind w:left="709"/>
+      </w:pPr>
+      <w:r>
+        <w:rPr>
+          <w:rFonts w:ascii="Courier New" w:hAnsi="Courier New"/>
+          <w:color w:val="333333"/>
+          <w:sz w:val="16"/>
+        </w:rPr>
+        <w:t xml:space="preserve">                    if not unicodedata.combining(c))</w:t>
+      </w:r>
+    </w:p>
+    <w:p>
+      <w:pPr>
+        <w:ind w:left="709"/>
+      </w:pPr>
+      <w:r>
+        <w:rPr>
+          <w:rFonts w:ascii="Courier New" w:hAnsi="Courier New"/>
+          <w:color w:val="333333"/>
+          <w:sz w:val="16"/>
+        </w:rPr>
+      </w:r>
+    </w:p>
+    <w:p>
+      <w:pPr>
+        <w:ind w:left="709"/>
+      </w:pPr>
+      <w:r>
+        <w:rPr>
+          <w:rFonts w:ascii="Courier New" w:hAnsi="Courier New"/>
+          <w:color w:val="333333"/>
+          <w:sz w:val="16"/>
+        </w:rPr>
+        <w:t>for c in ['Tipo','Nombre de producto','Titular','Fabricante',</w:t>
+      </w:r>
+    </w:p>
+    <w:p>
+      <w:pPr>
+        <w:ind w:left="709"/>
+      </w:pPr>
+      <w:r>
+        <w:rPr>
+          <w:rFonts w:ascii="Courier New" w:hAnsi="Courier New"/>
+          <w:color w:val="333333"/>
+          <w:sz w:val="16"/>
+        </w:rPr>
+        <w:t xml:space="preserve">          'Farmacia/Botica','Departamento','Provincia','Distrito']:</w:t>
+      </w:r>
+    </w:p>
+    <w:p>
+      <w:pPr>
+        <w:ind w:left="709"/>
+      </w:pPr>
+      <w:r>
+        <w:rPr>
+          <w:rFonts w:ascii="Courier New" w:hAnsi="Courier New"/>
+          <w:color w:val="333333"/>
+          <w:sz w:val="16"/>
+        </w:rPr>
+        <w:t xml:space="preserve">    df[c] = df[c].apply(limpiar)</w:t>
+      </w:r>
+    </w:p>
+    <w:p>
+      <w:pPr>
+        <w:ind w:left="709"/>
+      </w:pPr>
+      <w:r>
+        <w:rPr>
+          <w:rFonts w:ascii="Courier New" w:hAnsi="Courier New"/>
+          <w:color w:val="333333"/>
+          <w:sz w:val="16"/>
+        </w:rPr>
+      </w:r>
+    </w:p>
+    <w:p>
+      <w:pPr>
+        <w:ind w:left="709"/>
+      </w:pPr>
+      <w:r>
+        <w:rPr>
+          <w:rFonts w:ascii="Courier New" w:hAnsi="Courier New"/>
+          <w:color w:val="333333"/>
+          <w:sz w:val="16"/>
+        </w:rPr>
+        <w:t>df['Tipo'] = df['Tipo'].str.replace(' ', '', regex=False)</w:t>
+      </w:r>
+    </w:p>
+    <w:p>
+      <w:pPr>
+        <w:ind w:left="709"/>
+      </w:pPr>
+      <w:r>
+        <w:rPr>
+          <w:rFonts w:ascii="Courier New" w:hAnsi="Courier New"/>
+          <w:color w:val="333333"/>
+          <w:sz w:val="16"/>
+        </w:rPr>
+        <w:t>print(f'Filas despues de limpieza: {len(df):,}')</w:t>
+      </w:r>
+    </w:p>
+    <w:p/>
+    <w:p>
+      <w:pPr>
+        <w:ind w:left="709"/>
+      </w:pPr>
+      <w:r>
+        <w:rPr>
+          <w:rFonts w:ascii="Courier New" w:hAnsi="Courier New"/>
+          <w:i/>
+          <w:color w:val="006600"/>
+          <w:sz w:val="16"/>
+        </w:rPr>
+        <w:t>Duplicados eliminados: 600</w:t>
+      </w:r>
+    </w:p>
+    <w:p>
+      <w:pPr>
+        <w:ind w:left="709"/>
+      </w:pPr>
+      <w:r>
+        <w:rPr>
+          <w:rFonts w:ascii="Courier New" w:hAnsi="Courier New"/>
+          <w:i/>
+          <w:color w:val="006600"/>
+          <w:sz w:val="16"/>
+        </w:rPr>
+        <w:t>Precios invalidos eliminados: 17</w:t>
+      </w:r>
+    </w:p>
+    <w:p>
+      <w:pPr>
+        <w:ind w:left="709"/>
+      </w:pPr>
+      <w:r>
+        <w:rPr>
+          <w:rFonts w:ascii="Courier New" w:hAnsi="Courier New"/>
+          <w:i/>
+          <w:color w:val="006600"/>
+          <w:sz w:val="16"/>
+        </w:rPr>
+        <w:t>Filas despues de limpieza: 436,516</w:t>
+      </w:r>
+    </w:p>
+    <w:p/>
+    <w:p>
+      <w:pPr>
         <w:ind w:firstLine="709"/>
       </w:pPr>
       <w:r>
-        <w:t>Resultado del proceso de limpieza:</w:t>
-      </w:r>
-    </w:p>
+        <w:t>La tabla anterior y los resultados muestran que los 10 archivos sumaron 437,133 registros brutos. Se eliminaron 600 duplicados (productos que aparecian en mas de un archivo) y 17 precios invalidos (nulos o negativos). Tras la normalizacion de texto, el dataset quedo con 436,516 registros.</w:t>
+      </w:r>
+    </w:p>
+    <w:p>
+      <w:r>
+        <w:rPr>
+          <w:b/>
+          <w:sz w:val="22"/>
+        </w:rPr>
+        <w:t>4.2.3 Muestreo estratificado</w:t>
+      </w:r>
+    </w:p>
+    <w:p/>
     <w:p>
       <w:pPr>
         <w:ind w:firstLine="709"/>
       </w:pPr>
       <w:r>
-        <w:t xml:space="preserve">   - Datos brutos (10 archivos): 437,133 registros</w:t>
-      </w:r>
-    </w:p>
+        <w:t>Con 436,516 registros el entrenamiento de modelos resultaba muy lento sin una ganancia predictiva proporcional. Se aplico muestreo estratificado: maximo 2,000 registros por cada una de las 303 presentaciones de medicamento.</w:t>
+      </w:r>
+    </w:p>
+    <w:p/>
+    <w:p>
+      <w:pPr>
+        <w:ind w:left="709"/>
+      </w:pPr>
+      <w:r>
+        <w:rPr>
+          <w:rFonts w:ascii="Courier New" w:hAnsi="Courier New"/>
+          <w:color w:val="333333"/>
+          <w:sz w:val="16"/>
+        </w:rPr>
+        <w:t>muestras = []</w:t>
+      </w:r>
+    </w:p>
+    <w:p>
+      <w:pPr>
+        <w:ind w:left="709"/>
+      </w:pPr>
+      <w:r>
+        <w:rPr>
+          <w:rFonts w:ascii="Courier New" w:hAnsi="Courier New"/>
+          <w:color w:val="333333"/>
+          <w:sz w:val="16"/>
+        </w:rPr>
+        <w:t>for p, g in df.groupby('Nombre de producto', observed=False):</w:t>
+      </w:r>
+    </w:p>
+    <w:p>
+      <w:pPr>
+        <w:ind w:left="709"/>
+      </w:pPr>
+      <w:r>
+        <w:rPr>
+          <w:rFonts w:ascii="Courier New" w:hAnsi="Courier New"/>
+          <w:color w:val="333333"/>
+          <w:sz w:val="16"/>
+        </w:rPr>
+        <w:t xml:space="preserve">    n = min(2000, len(g))</w:t>
+      </w:r>
+    </w:p>
+    <w:p>
+      <w:pPr>
+        <w:ind w:left="709"/>
+      </w:pPr>
+      <w:r>
+        <w:rPr>
+          <w:rFonts w:ascii="Courier New" w:hAnsi="Courier New"/>
+          <w:color w:val="333333"/>
+          <w:sz w:val="16"/>
+        </w:rPr>
+        <w:t xml:space="preserve">    muestras.append(g.sample(n=n, random_state=42))</w:t>
+      </w:r>
+    </w:p>
+    <w:p>
+      <w:pPr>
+        <w:ind w:left="709"/>
+      </w:pPr>
+      <w:r>
+        <w:rPr>
+          <w:rFonts w:ascii="Courier New" w:hAnsi="Courier New"/>
+          <w:color w:val="333333"/>
+          <w:sz w:val="16"/>
+        </w:rPr>
+        <w:t>df = pd.concat(muestras, ignore_index=True)</w:t>
+      </w:r>
+    </w:p>
+    <w:p>
+      <w:pPr>
+        <w:ind w:left="709"/>
+      </w:pPr>
+      <w:r>
+        <w:rPr>
+          <w:rFonts w:ascii="Courier New" w:hAnsi="Courier New"/>
+          <w:color w:val="333333"/>
+          <w:sz w:val="16"/>
+        </w:rPr>
+      </w:r>
+    </w:p>
+    <w:p>
+      <w:pPr>
+        <w:ind w:left="709"/>
+      </w:pPr>
+      <w:r>
+        <w:rPr>
+          <w:rFonts w:ascii="Courier New" w:hAnsi="Courier New"/>
+          <w:color w:val="333333"/>
+          <w:sz w:val="16"/>
+        </w:rPr>
+        <w:t>print(f'Filas despues de muestreo: {len(df):,}')</w:t>
+      </w:r>
+    </w:p>
+    <w:p>
+      <w:pPr>
+        <w:ind w:left="709"/>
+      </w:pPr>
+      <w:r>
+        <w:rPr>
+          <w:rFonts w:ascii="Courier New" w:hAnsi="Courier New"/>
+          <w:color w:val="333333"/>
+          <w:sz w:val="16"/>
+        </w:rPr>
+        <w:t>print(f'Productos unicos: {df[chr(34)Nombre de producto'chr(34)].nunique()}')</w:t>
+      </w:r>
+    </w:p>
+    <w:p>
+      <w:pPr>
+        <w:ind w:left="709"/>
+      </w:pPr>
+      <w:r>
+        <w:rPr>
+          <w:rFonts w:ascii="Courier New" w:hAnsi="Courier New"/>
+          <w:color w:val="333333"/>
+          <w:sz w:val="16"/>
+        </w:rPr>
+        <w:t>print(f'Departamentos: {df[chr(34)Departamento'chr(34)].nunique()}')</w:t>
+      </w:r>
+    </w:p>
+    <w:p>
+      <w:pPr>
+        <w:ind w:left="709"/>
+      </w:pPr>
+      <w:r>
+        <w:rPr>
+          <w:rFonts w:ascii="Courier New" w:hAnsi="Courier New"/>
+          <w:color w:val="333333"/>
+          <w:sz w:val="16"/>
+        </w:rPr>
+        <w:t>print(f'Fabricantes: {df[chr(34)Fabricante'chr(34)].nunique()}')</w:t>
+      </w:r>
+    </w:p>
+    <w:p>
+      <w:pPr>
+        <w:ind w:left="709"/>
+      </w:pPr>
+      <w:r>
+        <w:rPr>
+          <w:rFonts w:ascii="Courier New" w:hAnsi="Courier New"/>
+          <w:color w:val="333333"/>
+          <w:sz w:val="16"/>
+        </w:rPr>
+        <w:t>print(f'Precio min: S/{df[chr(34)Precio Unit.'chr(34)].min():.4f}')</w:t>
+      </w:r>
+    </w:p>
+    <w:p>
+      <w:pPr>
+        <w:ind w:left="709"/>
+      </w:pPr>
+      <w:r>
+        <w:rPr>
+          <w:rFonts w:ascii="Courier New" w:hAnsi="Courier New"/>
+          <w:color w:val="333333"/>
+          <w:sz w:val="16"/>
+        </w:rPr>
+        <w:t>print(f'Precio max: S/{df[chr(34)Precio Unit.'chr(34)].max():.2f}')</w:t>
+      </w:r>
+    </w:p>
+    <w:p>
+      <w:pPr>
+        <w:ind w:left="709"/>
+      </w:pPr>
+      <w:r>
+        <w:rPr>
+          <w:rFonts w:ascii="Courier New" w:hAnsi="Courier New"/>
+          <w:color w:val="333333"/>
+          <w:sz w:val="16"/>
+        </w:rPr>
+        <w:t>print(f'Precio media: S/{df[chr(34)Precio Unit.'chr(34)].mean():.2f}')</w:t>
+      </w:r>
+    </w:p>
+    <w:p>
+      <w:pPr>
+        <w:ind w:left="709"/>
+      </w:pPr>
+      <w:r>
+        <w:rPr>
+          <w:rFonts w:ascii="Courier New" w:hAnsi="Courier New"/>
+          <w:color w:val="333333"/>
+          <w:sz w:val="16"/>
+        </w:rPr>
+        <w:t>print(f'Precio mediana: S/{df[chr(34)Precio Unit.'chr(34)].median():.2f}')</w:t>
+      </w:r>
+    </w:p>
+    <w:p/>
+    <w:p>
+      <w:pPr>
+        <w:ind w:left="709"/>
+      </w:pPr>
+      <w:r>
+        <w:rPr>
+          <w:rFonts w:ascii="Courier New" w:hAnsi="Courier New"/>
+          <w:i/>
+          <w:color w:val="006600"/>
+          <w:sz w:val="16"/>
+        </w:rPr>
+        <w:t>Filas despues de muestreo: 198,351</w:t>
+      </w:r>
+    </w:p>
+    <w:p>
+      <w:pPr>
+        <w:ind w:left="709"/>
+      </w:pPr>
+      <w:r>
+        <w:rPr>
+          <w:rFonts w:ascii="Courier New" w:hAnsi="Courier New"/>
+          <w:i/>
+          <w:color w:val="006600"/>
+          <w:sz w:val="16"/>
+        </w:rPr>
+        <w:t>Productos unicos: 303</w:t>
+      </w:r>
+    </w:p>
+    <w:p>
+      <w:pPr>
+        <w:ind w:left="709"/>
+      </w:pPr>
+      <w:r>
+        <w:rPr>
+          <w:rFonts w:ascii="Courier New" w:hAnsi="Courier New"/>
+          <w:i/>
+          <w:color w:val="006600"/>
+          <w:sz w:val="16"/>
+        </w:rPr>
+        <w:t>Departamentos: 25</w:t>
+      </w:r>
+    </w:p>
+    <w:p>
+      <w:pPr>
+        <w:ind w:left="709"/>
+      </w:pPr>
+      <w:r>
+        <w:rPr>
+          <w:rFonts w:ascii="Courier New" w:hAnsi="Courier New"/>
+          <w:i/>
+          <w:color w:val="006600"/>
+          <w:sz w:val="16"/>
+        </w:rPr>
+        <w:t>Fabricantes: 109</w:t>
+      </w:r>
+    </w:p>
+    <w:p>
+      <w:pPr>
+        <w:ind w:left="709"/>
+      </w:pPr>
+      <w:r>
+        <w:rPr>
+          <w:rFonts w:ascii="Courier New" w:hAnsi="Courier New"/>
+          <w:i/>
+          <w:color w:val="006600"/>
+          <w:sz w:val="16"/>
+        </w:rPr>
+        <w:t>Precio min: S/0.0100</w:t>
+      </w:r>
+    </w:p>
+    <w:p>
+      <w:pPr>
+        <w:ind w:left="709"/>
+      </w:pPr>
+      <w:r>
+        <w:rPr>
+          <w:rFonts w:ascii="Courier New" w:hAnsi="Courier New"/>
+          <w:i/>
+          <w:color w:val="006600"/>
+          <w:sz w:val="16"/>
+        </w:rPr>
+        <w:t>Precio max: S/13000.00</w:t>
+      </w:r>
+    </w:p>
+    <w:p>
+      <w:pPr>
+        <w:ind w:left="709"/>
+      </w:pPr>
+      <w:r>
+        <w:rPr>
+          <w:rFonts w:ascii="Courier New" w:hAnsi="Courier New"/>
+          <w:i/>
+          <w:color w:val="006600"/>
+          <w:sz w:val="16"/>
+        </w:rPr>
+        <w:t>Precio media: S/2.19</w:t>
+      </w:r>
+    </w:p>
+    <w:p>
+      <w:pPr>
+        <w:ind w:left="709"/>
+      </w:pPr>
+      <w:r>
+        <w:rPr>
+          <w:rFonts w:ascii="Courier New" w:hAnsi="Courier New"/>
+          <w:i/>
+          <w:color w:val="006600"/>
+          <w:sz w:val="16"/>
+        </w:rPr>
+        <w:t>Precio mediana: S/1.10</w:t>
+      </w:r>
+    </w:p>
+    <w:p/>
     <w:p>
       <w:pPr>
         <w:ind w:firstLine="709"/>
       </w:pPr>
       <w:r>
-        <w:t xml:space="preserve">   - Datos limpios y muestreados: 198,351 registros</w:t>
+        <w:t>Progresion del dataset durante la limpieza:</w:t>
       </w:r>
     </w:p>
     <w:p>
@@ -1950,7 +2903,7 @@
         <w:ind w:firstLine="709"/>
       </w:pPr>
       <w:r>
-        <w:t xml:space="preserve">   - Porcentaje conservado: 45%</w:t>
+        <w:t xml:space="preserve">  - 10 archivos originales: 437,133 registros brutos</w:t>
       </w:r>
     </w:p>
     <w:p>
@@ -1958,7 +2911,15 @@
         <w:ind w:firstLine="709"/>
       </w:pPr>
       <w:r>
-        <w:t xml:space="preserve">   - Cobertura: 25 departamentos, 109 fabricantes, 303 productos</w:t>
+        <w:t xml:space="preserve">  - Despues de eliminar 600 duplicados y 17 precios invalidos: 436,516 registros</w:t>
+      </w:r>
+    </w:p>
+    <w:p>
+      <w:pPr>
+        <w:ind w:firstLine="709"/>
+      </w:pPr>
+      <w:r>
+        <w:t xml:space="preserve">  - Despues del muestreo estratificado: 198,351 registros finales</w:t>
       </w:r>
     </w:p>
     <w:p/>
@@ -1977,56 +2938,94 @@
         <w:ind w:firstLine="709"/>
       </w:pPr>
       <w:r>
-        <w:t>Los modelos de regresion, tanto lineal como logistica, operan exclusivamente con valores numericos. Dado que la mayoria de las variables del dataset son de tipo texto (categoricas), fue necesario transformarlas a formato numerico antes de entrenar los modelos.</w:t>
+        <w:t>Los modelos de regresion requieren valores numericos. Para convertir las variables categoricas se utilizo Label Encoding, que asigna un numero entero a cada categoria unica.</w:t>
       </w:r>
     </w:p>
     <w:p/>
     <w:p>
       <w:pPr>
+        <w:ind w:left="709"/>
+      </w:pPr>
+      <w:r>
+        <w:rPr>
+          <w:rFonts w:ascii="Courier New" w:hAnsi="Courier New"/>
+          <w:color w:val="333333"/>
+          <w:sz w:val="16"/>
+        </w:rPr>
+        <w:t>from sklearn.preprocessing import LabelEncoder</w:t>
+      </w:r>
+    </w:p>
+    <w:p>
+      <w:pPr>
+        <w:ind w:left="709"/>
+      </w:pPr>
+      <w:r>
+        <w:rPr>
+          <w:rFonts w:ascii="Courier New" w:hAnsi="Courier New"/>
+          <w:color w:val="333333"/>
+          <w:sz w:val="16"/>
+        </w:rPr>
+      </w:r>
+    </w:p>
+    <w:p>
+      <w:pPr>
+        <w:ind w:left="709"/>
+      </w:pPr>
+      <w:r>
+        <w:rPr>
+          <w:rFonts w:ascii="Courier New" w:hAnsi="Courier New"/>
+          <w:color w:val="333333"/>
+          <w:sz w:val="16"/>
+        </w:rPr>
+        <w:t>features = ['Tipo','Nombre de producto','Fabricante',</w:t>
+      </w:r>
+    </w:p>
+    <w:p>
+      <w:pPr>
+        <w:ind w:left="709"/>
+      </w:pPr>
+      <w:r>
+        <w:rPr>
+          <w:rFonts w:ascii="Courier New" w:hAnsi="Courier New"/>
+          <w:color w:val="333333"/>
+          <w:sz w:val="16"/>
+        </w:rPr>
+        <w:t xml:space="preserve">            'Farmacia/Botica','Departamento']</w:t>
+      </w:r>
+    </w:p>
+    <w:p>
+      <w:pPr>
+        <w:ind w:left="709"/>
+      </w:pPr>
+      <w:r>
+        <w:rPr>
+          <w:rFonts w:ascii="Courier New" w:hAnsi="Courier New"/>
+          <w:color w:val="333333"/>
+          <w:sz w:val="16"/>
+        </w:rPr>
+        <w:t>X = pd.DataFrame({c: LabelEncoder().fit_transform(df[c]</w:t>
+      </w:r>
+    </w:p>
+    <w:p>
+      <w:pPr>
+        <w:ind w:left="709"/>
+      </w:pPr>
+      <w:r>
+        <w:rPr>
+          <w:rFonts w:ascii="Courier New" w:hAnsi="Courier New"/>
+          <w:color w:val="333333"/>
+          <w:sz w:val="16"/>
+        </w:rPr>
+        <w:t xml:space="preserve">                  .astype(str)) for c in features})</w:t>
+      </w:r>
+    </w:p>
+    <w:p/>
+    <w:p>
+      <w:pPr>
         <w:ind w:firstLine="709"/>
       </w:pPr>
       <w:r>
-        <w:t>a) Label Encoding. A cada valor unico dentro de una columna categorica se le asigna un numero entero consecutivo. Este metodo se aplico a las cinco variables predictoras:</w:t>
-      </w:r>
-    </w:p>
-    <w:p>
-      <w:pPr>
-        <w:ind w:firstLine="709"/>
-      </w:pPr>
-      <w:r>
-        <w:t xml:space="preserve">   - TIPO: 2 categorias</w:t>
-      </w:r>
-    </w:p>
-    <w:p>
-      <w:pPr>
-        <w:ind w:firstLine="709"/>
-      </w:pPr>
-      <w:r>
-        <w:t xml:space="preserve">   - NOMBRE DE PRODUCTO: 303 categorias</w:t>
-      </w:r>
-    </w:p>
-    <w:p>
-      <w:pPr>
-        <w:ind w:firstLine="709"/>
-      </w:pPr>
-      <w:r>
-        <w:t xml:space="preserve">   - FABRICANTE: 109 categorias</w:t>
-      </w:r>
-    </w:p>
-    <w:p>
-      <w:pPr>
-        <w:ind w:firstLine="709"/>
-      </w:pPr>
-      <w:r>
-        <w:t xml:space="preserve">   - FARMACIA / BOTICA: 10,078 categorias</w:t>
-      </w:r>
-    </w:p>
-    <w:p>
-      <w:pPr>
-        <w:ind w:firstLine="709"/>
-      </w:pPr>
-      <w:r>
-        <w:t xml:space="preserve">   - DEPARTAMENTO: 25 categorias</w:t>
+        <w:t>Categorias por variable: TIPO=2, NOMBRE DE PRODUCTO=303, FABRICANTE=109, FARMACIA/BOTICA=10,078, DEPARTAMENTO=25.</w:t>
       </w:r>
     </w:p>
     <w:p>
@@ -2038,43 +3037,83 @@
           <w:b/>
           <w:color w:val="003399"/>
         </w:rPr>
-        <w:t xml:space="preserve">[JUSTIFICACION - Eleccion de Label Encoding sobre One-Hot Encoding]: </w:t>
-      </w:r>
-      <w:r>
-        <w:t>La alternativa mas comun a Label Encoding es One-Hot Encoding, que crea una columna binaria por cada categoria. Sin embargo, con 10,078 farmacias distintas, este metodo habria generado mas de 10,000 columnas adicionales, resultando en una matriz extremadamente dispersa y computacionalmente costosa. Para este analisis exploratorio, Label Encoding representa una simplificacion razonable, aunque se reconoce que introduce un orden artificial entre categorias que no existe en la realidad.</w:t>
+        <w:t xml:space="preserve">[JUSTIFICACION - Label Encoding vs One-Hot Encoding]: </w:t>
+      </w:r>
+      <w:r>
+        <w:t>One-Hot Encoding habria generado mas de 10,000 columnas adicionales, resultando en una matriz dispersa computacionalmente costosa. Para este analisis exploratorio, Label Encoding es una simplificacion razonable, aunque introduce un orden artificial entre categorias.</w:t>
+      </w:r>
+    </w:p>
+    <w:p>
+      <w:pPr>
+        <w:ind w:firstLine="709"/>
+      </w:pPr>
+      <w:r>
+        <w:t>Para la regresion logistica se creo la variable PRECIO_ALTO usando la mediana (S/1.10) como umbral:</w:t>
       </w:r>
     </w:p>
     <w:p/>
     <w:p>
       <w:pPr>
+        <w:ind w:left="709"/>
+      </w:pPr>
+      <w:r>
+        <w:rPr>
+          <w:rFonts w:ascii="Courier New" w:hAnsi="Courier New"/>
+          <w:color w:val="333333"/>
+          <w:sz w:val="16"/>
+        </w:rPr>
+        <w:t>mediana = df['Precio Unit.'].median()</w:t>
+      </w:r>
+    </w:p>
+    <w:p>
+      <w:pPr>
+        <w:ind w:left="709"/>
+      </w:pPr>
+      <w:r>
+        <w:rPr>
+          <w:rFonts w:ascii="Courier New" w:hAnsi="Courier New"/>
+          <w:color w:val="333333"/>
+          <w:sz w:val="16"/>
+        </w:rPr>
+        <w:t>df['Precio_Alto'] = (df['Precio Unit.'] &gt; mediana).astype(int)</w:t>
+      </w:r>
+    </w:p>
+    <w:p/>
+    <w:p>
+      <w:pPr>
+        <w:ind w:left="709"/>
+      </w:pPr>
+      <w:r>
+        <w:rPr>
+          <w:rFonts w:ascii="Courier New" w:hAnsi="Courier New"/>
+          <w:i/>
+          <w:color w:val="006600"/>
+          <w:sz w:val="16"/>
+        </w:rPr>
+        <w:t>Mediana: S/1.10</w:t>
+      </w:r>
+    </w:p>
+    <w:p>
+      <w:pPr>
+        <w:ind w:left="709"/>
+      </w:pPr>
+      <w:r>
+        <w:rPr>
+          <w:rFonts w:ascii="Courier New" w:hAnsi="Courier New"/>
+          <w:i/>
+          <w:color w:val="006600"/>
+          <w:sz w:val="16"/>
+        </w:rPr>
+        <w:t>Precios Altos: 96,625 | Precios Bajos: 101,726</w:t>
+      </w:r>
+    </w:p>
+    <w:p/>
+    <w:p>
+      <w:pPr>
         <w:ind w:firstLine="709"/>
       </w:pPr>
       <w:r>
-        <w:t>b) Creacion de la variable objetivo binaria. Para la regresion logistica se genero la columna PRECIO_ALTO, tomando como umbral la mediana de todos los precios, que resulto ser S/1.10. Los valores se asignaron de la siguiente forma:</w:t>
-      </w:r>
-    </w:p>
-    <w:p>
-      <w:pPr>
-        <w:ind w:firstLine="709"/>
-      </w:pPr>
-      <w:r>
-        <w:t xml:space="preserve">   - PRECIO_ALTO = 1 si Precio &gt; S/1.10</w:t>
-      </w:r>
-    </w:p>
-    <w:p>
-      <w:pPr>
-        <w:ind w:firstLine="709"/>
-      </w:pPr>
-      <w:r>
-        <w:t xml:space="preserve">   - PRECIO_ALTO = 0 si Precio &lt;= S/1.10</w:t>
-      </w:r>
-    </w:p>
-    <w:p>
-      <w:pPr>
-        <w:ind w:firstLine="709"/>
-      </w:pPr>
-      <w:r>
-        <w:t>La distribucion resultante fue: 96,625 precios altos y 101,726 precios bajos. Esta proporcion es practicamente balanceada, lo cual es deseable porque evita que el modelo de clasificacion se sesgue hacia la clase mayoritaria.</w:t>
+        <w:t>La distribucion resulto practicamente balanceada: 96,625 altos y 101,726 bajos, lo que evita sesgos en el modelo de clasificacion.</w:t>
       </w:r>
     </w:p>
     <w:p/>
@@ -2093,65 +3132,132 @@
         <w:ind w:firstLine="709"/>
       </w:pPr>
       <w:r>
-        <w:t>Se entiende por outlier un valor que se aleja significativamente del resto de las observaciones. Para identificarlos se utilizo el metodo del Rango Intercuartilico (IQR), que es robusto frente a distribuciones asimetricas y no asume normalidad en los datos.</w:t>
-      </w:r>
-    </w:p>
-    <w:p>
-      <w:pPr>
-        <w:ind w:firstLine="709"/>
-      </w:pPr>
-      <w:r>
-        <w:t>Los resultados del calculo fueron los siguientes:</w:t>
-      </w:r>
-    </w:p>
-    <w:p>
-      <w:pPr>
-        <w:ind w:firstLine="709"/>
-      </w:pPr>
-      <w:r>
-        <w:t xml:space="preserve">   - Q1 (percentil 25): S/0.48</w:t>
-      </w:r>
-    </w:p>
-    <w:p>
-      <w:pPr>
-        <w:ind w:firstLine="709"/>
-      </w:pPr>
-      <w:r>
-        <w:t xml:space="preserve">   - Q3 (percentil 75): S/1.60</w:t>
-      </w:r>
-    </w:p>
-    <w:p>
-      <w:pPr>
-        <w:ind w:firstLine="709"/>
-      </w:pPr>
-      <w:r>
-        <w:t xml:space="preserve">   - IQR = Q3 - Q1: S/1.12</w:t>
-      </w:r>
-    </w:p>
-    <w:p>
-      <w:pPr>
-        <w:ind w:firstLine="709"/>
-      </w:pPr>
-      <w:r>
-        <w:t xml:space="preserve">   - Limite inferior = Q1 - 1.5 * IQR: S/-1.20</w:t>
-      </w:r>
-    </w:p>
-    <w:p>
-      <w:pPr>
-        <w:ind w:firstLine="709"/>
-      </w:pPr>
-      <w:r>
-        <w:t xml:space="preserve">   - Limite superior = Q3 + 1.5 * IQR: S/3.28</w:t>
-      </w:r>
-    </w:p>
-    <w:p>
-      <w:pPr>
-        <w:ind w:firstLine="709"/>
-      </w:pPr>
-      <w:r>
-        <w:t xml:space="preserve">   - Outliers detectados: 22,805 registros (11.5% del total)</w:t>
-      </w:r>
-    </w:p>
+        <w:t>Se aplico el metodo del Rango Intercuartilico (IQR) para detectar precios atipicos.</w:t>
+      </w:r>
+    </w:p>
+    <w:p/>
+    <w:p>
+      <w:pPr>
+        <w:ind w:left="709"/>
+      </w:pPr>
+      <w:r>
+        <w:rPr>
+          <w:rFonts w:ascii="Courier New" w:hAnsi="Courier New"/>
+          <w:color w:val="333333"/>
+          <w:sz w:val="16"/>
+        </w:rPr>
+        <w:t>q1 = df['Precio Unit.'].quantile(0.25)</w:t>
+      </w:r>
+    </w:p>
+    <w:p>
+      <w:pPr>
+        <w:ind w:left="709"/>
+      </w:pPr>
+      <w:r>
+        <w:rPr>
+          <w:rFonts w:ascii="Courier New" w:hAnsi="Courier New"/>
+          <w:color w:val="333333"/>
+          <w:sz w:val="16"/>
+        </w:rPr>
+        <w:t>q3 = df['Precio Unit.'].quantile(0.75)</w:t>
+      </w:r>
+    </w:p>
+    <w:p>
+      <w:pPr>
+        <w:ind w:left="709"/>
+      </w:pPr>
+      <w:r>
+        <w:rPr>
+          <w:rFonts w:ascii="Courier New" w:hAnsi="Courier New"/>
+          <w:color w:val="333333"/>
+          <w:sz w:val="16"/>
+        </w:rPr>
+        <w:t>iqr = q3 - q1</w:t>
+      </w:r>
+    </w:p>
+    <w:p>
+      <w:pPr>
+        <w:ind w:left="709"/>
+      </w:pPr>
+      <w:r>
+        <w:rPr>
+          <w:rFonts w:ascii="Courier New" w:hAnsi="Courier New"/>
+          <w:color w:val="333333"/>
+          <w:sz w:val="16"/>
+        </w:rPr>
+        <w:t>lim_inf = q1 - 1.5*iqr</w:t>
+      </w:r>
+    </w:p>
+    <w:p>
+      <w:pPr>
+        <w:ind w:left="709"/>
+      </w:pPr>
+      <w:r>
+        <w:rPr>
+          <w:rFonts w:ascii="Courier New" w:hAnsi="Courier New"/>
+          <w:color w:val="333333"/>
+          <w:sz w:val="16"/>
+        </w:rPr>
+        <w:t>lim_sup = q3 + 1.5*iqr</w:t>
+      </w:r>
+    </w:p>
+    <w:p>
+      <w:pPr>
+        <w:ind w:left="709"/>
+      </w:pPr>
+      <w:r>
+        <w:rPr>
+          <w:rFonts w:ascii="Courier New" w:hAnsi="Courier New"/>
+          <w:color w:val="333333"/>
+          <w:sz w:val="16"/>
+        </w:rPr>
+        <w:t>n_out = (~df['Precio Unit.'].between(lim_inf, lim_sup)).sum()</w:t>
+      </w:r>
+    </w:p>
+    <w:p/>
+    <w:p>
+      <w:pPr>
+        <w:ind w:left="709"/>
+      </w:pPr>
+      <w:r>
+        <w:rPr>
+          <w:rFonts w:ascii="Courier New" w:hAnsi="Courier New"/>
+          <w:i/>
+          <w:color w:val="006600"/>
+          <w:sz w:val="16"/>
+        </w:rPr>
+        <w:t>Q1=0.4800 | Q3=1.6000 | IQR=1.1200</w:t>
+      </w:r>
+    </w:p>
+    <w:p>
+      <w:pPr>
+        <w:ind w:left="709"/>
+      </w:pPr>
+      <w:r>
+        <w:rPr>
+          <w:rFonts w:ascii="Courier New" w:hAnsi="Courier New"/>
+          <w:i/>
+          <w:color w:val="006600"/>
+          <w:sz w:val="16"/>
+        </w:rPr>
+        <w:t>Limites: [-1.2000, 3.2800]</w:t>
+      </w:r>
+    </w:p>
+    <w:p>
+      <w:pPr>
+        <w:ind w:left="709"/>
+      </w:pPr>
+      <w:r>
+        <w:rPr>
+          <w:rFonts w:ascii="Courier New" w:hAnsi="Courier New"/>
+          <w:i/>
+          <w:color w:val="006600"/>
+          <w:sz w:val="16"/>
+        </w:rPr>
+        <w:t>Outliers: 22,805 (11.5% del total)</w:t>
+      </w:r>
+    </w:p>
+    <w:p/>
     <w:p>
       <w:pPr>
         <w:ind w:firstLine="709"/>
@@ -2161,10 +3267,10 @@
           <w:b/>
           <w:color w:val="003399"/>
         </w:rPr>
-        <w:t xml:space="preserve">[JUSTIFICACION - Decision de no eliminar los outliers]: </w:t>
-      </w:r>
-      <w:r>
-        <w:t>En el contexto de precios de medicamentos, un valor alejado no constituye necesariamente un error. Un precio de S/100 o S/1,000 puede corresponder a un medicamento de marca, un producto biologico o un tratamiento oncologico. Eliminar estos registros implicaria descartar informacion genuina del mercado y sesgar el analisis hacia unicamente medicamentos de bajo costo. Por esta razon, los outliers fueron identificados y marcados en una columna adicional, pero no fueron removidos del dataset.</w:t>
+        <w:t xml:space="preserve">[JUSTIFICACION - No eliminacion de outliers]: </w:t>
+      </w:r>
+      <w:r>
+        <w:t>En el contexto de precios de medicamentos, un precio alto no es un error sino un dato valido del mercado. Medicamentos de S/100 o S/1,000 existen y son reales. Eliminarlos sesgaria el analisis. Los outliers fueron identificados pero se mantuvieron en el dataset.</w:t>
       </w:r>
     </w:p>
     <w:p/>
@@ -2174,7 +3280,7 @@
           <w:b/>
           <w:sz w:val="22"/>
         </w:rPr>
-        <w:t>4.5 Analisis exploratorio de datos (EDA)</w:t>
+        <w:t>4.5 Analisis exploratorio (EDA)</w:t>
       </w:r>
     </w:p>
     <w:p/>
@@ -2183,16 +3289,15 @@
         <w:ind w:firstLine="709"/>
       </w:pPr>
       <w:r>
-        <w:t>Previo al entrenamiento de los modelos, se realizo un analisis descriptivo para comprender la distribucion de los precios y las relaciones entre las variables.</w:t>
-      </w:r>
-    </w:p>
-    <w:p/>
+        <w:t>Estadisticas del precio: media=S/2.19, mediana=S/1.10, min=S/0.0100, max=S/13000.00, std=S/31.87.</w:t>
+      </w:r>
+    </w:p>
     <w:p>
       <w:pPr>
         <w:ind w:firstLine="709"/>
       </w:pPr>
       <w:r>
-        <w:t>Estadisticas descriptivas del precio unitario:</w:t>
+        <w:t>La diferencia entre media y mediana confirma un sesgo positivo: muchos medicamentos baratos y pocos muy caros jalan el promedio hacia arriba.</w:t>
       </w:r>
     </w:p>
     <w:p>
@@ -2200,7 +3305,7 @@
         <w:ind w:firstLine="709"/>
       </w:pPr>
       <w:r>
-        <w:t xml:space="preserve">   - Media: S/2.19</w:t>
+        <w:t>Precio segun tipo:</w:t>
       </w:r>
     </w:p>
     <w:p>
@@ -2208,7 +3313,7 @@
         <w:ind w:firstLine="709"/>
       </w:pPr>
       <w:r>
-        <w:t xml:space="preserve">   - Mediana: S/1.10</w:t>
+        <w:t xml:space="preserve">   - PRIVADO: S/2.10 promedio (197,747 registros)</w:t>
       </w:r>
     </w:p>
     <w:p>
@@ -2216,7 +3321,7 @@
         <w:ind w:firstLine="709"/>
       </w:pPr>
       <w:r>
-        <w:t xml:space="preserve">   - Minimo: S/0.0100</w:t>
+        <w:t xml:space="preserve">   - PUBLICO: S/31.67 promedio (604 registros)</w:t>
       </w:r>
     </w:p>
     <w:p>
@@ -2224,7 +3329,7 @@
         <w:ind w:firstLine="709"/>
       </w:pPr>
       <w:r>
-        <w:t xml:space="preserve">   - Maximo: S/13000.00</w:t>
+        <w:t>Top 5 departamentos:</w:t>
       </w:r>
     </w:p>
     <w:p>
@@ -2232,7 +3337,7 @@
         <w:ind w:firstLine="709"/>
       </w:pPr>
       <w:r>
-        <w:t xml:space="preserve">   - Desviacion estandar: S/31.87</w:t>
+        <w:t xml:space="preserve">   - LIMA: 87,809 registros, S/2.06 promedio</w:t>
       </w:r>
     </w:p>
     <w:p>
@@ -2240,16 +3345,15 @@
         <w:ind w:firstLine="709"/>
       </w:pPr>
       <w:r>
-        <w:t>Se observa una diferencia notable entre la media (S/2.19) y la mediana (S/1.10). Esto indica que la distribucion de precios presenta un sesgo positivo (cola derecha), donde una gran cantidad de medicamentos tienen precios bajos y unos pocos alcanzan precios muy elevados. Esta asimetria es caracteristica del mercado farmaceutico y representa un desafio para los modelos lineales, que asumen relaciones mas uniformes entre las variables.</w:t>
-      </w:r>
-    </w:p>
-    <w:p/>
+        <w:t xml:space="preserve">   - LA LIBERTAD: 11,943 registros, S/2.39 promedio</w:t>
+      </w:r>
+    </w:p>
     <w:p>
       <w:pPr>
         <w:ind w:firstLine="709"/>
       </w:pPr>
       <w:r>
-        <w:t>Precio segun el tipo de producto:</w:t>
+        <w:t xml:space="preserve">   - AREQUIPA: 10,146 registros, S/2.21 promedio</w:t>
       </w:r>
     </w:p>
     <w:p>
@@ -2257,7 +3361,7 @@
         <w:ind w:firstLine="709"/>
       </w:pPr>
       <w:r>
-        <w:t xml:space="preserve">   - PRIVADO: promedio S/2.10 (197,747 registros)</w:t>
+        <w:t xml:space="preserve">   - PIURA: 9,236 registros, S/2.04 promedio</w:t>
       </w:r>
     </w:p>
     <w:p>
@@ -2265,7 +3369,7 @@
         <w:ind w:firstLine="709"/>
       </w:pPr>
       <w:r>
-        <w:t xml:space="preserve">   - PUBLICO: promedio S/31.67 (604 registros)</w:t>
+        <w:t xml:space="preserve">   - LAMBAYEQUE: 8,566 registros, S/1.90 promedio</w:t>
       </w:r>
     </w:p>
     <w:p>
@@ -2273,16 +3377,15 @@
         <w:ind w:firstLine="709"/>
       </w:pPr>
       <w:r>
-        <w:t>El precio promedio del sector PUBLICO es significativamente mayor (S/31.67) que el del sector PRIVADO (S/2.10). Esto se debe a que la categoria PUBLICO incluye medicamentos de alto costo dispensados en hospitales, mientras que PRIVADO abarca toda la gama de productos de farmacias y boticas. Cabe precisar que los registros PUBLICOS representan solo 604 de los casi 200,000 registros totales.</w:t>
-      </w:r>
-    </w:p>
-    <w:p/>
+        <w:t>Top 5 fabricantes:</w:t>
+      </w:r>
+    </w:p>
     <w:p>
       <w:pPr>
         <w:ind w:firstLine="709"/>
       </w:pPr>
       <w:r>
-        <w:t>Top 5 departamentos con mayor cantidad de registros:</w:t>
+        <w:t xml:space="preserve">   - LABORATORIOS PORTUGAL S.R.L.: 32,310 registros, S/0.89 promedio</w:t>
       </w:r>
     </w:p>
     <w:p>
@@ -2290,7 +3393,7 @@
         <w:ind w:firstLine="709"/>
       </w:pPr>
       <w:r>
-        <w:t xml:space="preserve">   - LIMA: 87,809 registros, precio promedio S/2.06</w:t>
+        <w:t xml:space="preserve">   - INSTITUTO QUIMIOTERAPICO S.A.: 10,983 registros, S/2.62 promedio</w:t>
       </w:r>
     </w:p>
     <w:p>
@@ -2298,7 +3401,7 @@
         <w:ind w:firstLine="709"/>
       </w:pPr>
       <w:r>
-        <w:t xml:space="preserve">   - LA LIBERTAD: 11,943 registros, precio promedio S/2.39</w:t>
+        <w:t xml:space="preserve">   - MEDIFARMA S.A.: 9,546 registros, S/1.58 promedio</w:t>
       </w:r>
     </w:p>
     <w:p>
@@ -2306,7 +3409,7 @@
         <w:ind w:firstLine="709"/>
       </w:pPr>
       <w:r>
-        <w:t xml:space="preserve">   - AREQUIPA: 10,146 registros, precio promedio S/2.21</w:t>
+        <w:t xml:space="preserve">   - LABORATORIOS NATURALES Y GENERICOS S.A.C. - NATURGEN: 9,396 registros, S/2.38 promedio</w:t>
       </w:r>
     </w:p>
     <w:p>
@@ -2314,87 +3417,7 @@
         <w:ind w:firstLine="709"/>
       </w:pPr>
       <w:r>
-        <w:t xml:space="preserve">   - PIURA: 9,236 registros, precio promedio S/2.04</w:t>
-      </w:r>
-    </w:p>
-    <w:p>
-      <w:pPr>
-        <w:ind w:firstLine="709"/>
-      </w:pPr>
-      <w:r>
-        <w:t xml:space="preserve">   - LAMBAYEQUE: 8,566 registros, precio promedio S/1.90</w:t>
-      </w:r>
-    </w:p>
-    <w:p>
-      <w:pPr>
-        <w:ind w:firstLine="709"/>
-      </w:pPr>
-      <w:r>
-        <w:t>Lima concentra la mayor proporcion de registros, lo cual es esperable por ser la capital y el departamento con mayor cantidad de establecimientos de salud. Sin embargo, los precios promedio entre departamentos no presentan diferencias drasticas, lo que sugiere un mercado farmaceutico relativamente integrado a nivel nacional.</w:t>
-      </w:r>
-    </w:p>
-    <w:p/>
-    <w:p>
-      <w:pPr>
-        <w:ind w:firstLine="709"/>
-      </w:pPr>
-      <w:r>
-        <w:t>Top 5 fabricantes por cantidad de registros:</w:t>
-      </w:r>
-    </w:p>
-    <w:p>
-      <w:pPr>
-        <w:ind w:firstLine="709"/>
-      </w:pPr>
-      <w:r>
-        <w:t xml:space="preserve">   - LABORATORIOS PORTUGAL S.R.L.: 32,310 registros, promedio S/0.89</w:t>
-      </w:r>
-    </w:p>
-    <w:p>
-      <w:pPr>
-        <w:ind w:firstLine="709"/>
-      </w:pPr>
-      <w:r>
-        <w:t xml:space="preserve">   - INSTITUTO QUIMIOTERAPICO S.A.: 10,983 registros, promedio S/2.62</w:t>
-      </w:r>
-    </w:p>
-    <w:p>
-      <w:pPr>
-        <w:ind w:firstLine="709"/>
-      </w:pPr>
-      <w:r>
-        <w:t xml:space="preserve">   - MEDIFARMA S.A.: 9,546 registros, promedio S/1.58</w:t>
-      </w:r>
-    </w:p>
-    <w:p>
-      <w:pPr>
-        <w:ind w:firstLine="709"/>
-      </w:pPr>
-      <w:r>
-        <w:t xml:space="preserve">   - LABORATORIOS NATURALES Y GENERICOS S.A.C. - NATURGEN: 9,396 registros, promedio S/2.38</w:t>
-      </w:r>
-    </w:p>
-    <w:p>
-      <w:pPr>
-        <w:ind w:firstLine="709"/>
-      </w:pPr>
-      <w:r>
-        <w:t xml:space="preserve">   - VITA PHARMA SOCIEDAD ANONIMA CERRADA - VITA PHARMA S.A.: 9,376 registros, promedio S/1.32</w:t>
-      </w:r>
-    </w:p>
-    <w:p>
-      <w:pPr>
-        <w:ind w:firstLine="709"/>
-      </w:pPr>
-      <w:r>
-        <w:rPr>
-          <w:b/>
-          <w:color w:val="666666"/>
-        </w:rPr>
-        <w:t xml:space="preserve">[NOTA]: </w:t>
-      </w:r>
-      <w:r>
-        <w:t>Se aprecian diferencias en las estrategias de mercado de los laboratorios. Por ejemplo, Laboratorios Portugal S.R.L. presenta un precio promedio bajo (S/0.89), lo que sugiere una especializacion en genericos economicos. En contraste, el Instituto Quimioterapico S.A. tiene un promedio de S/2.62, indicando un portafolio con productos de mayor valor. Esta variabilidad es informacion que el modelo puede aprovechar.</w:t>
+        <w:t xml:space="preserve">   - VITA PHARMA SOCIEDAD ANONIMA CERRADA - VITA PHARMA S.A.: 9,376 registros, S/1.32 promedio</w:t>
       </w:r>
     </w:p>
     <w:p/>
@@ -2404,7 +3427,7 @@
           <w:b/>
           <w:sz w:val="22"/>
         </w:rPr>
-        <w:t>4.6 Division de datos en entrenamiento y prueba</w:t>
+        <w:t>4.6 Division entrenamiento / prueba</w:t>
       </w:r>
     </w:p>
     <w:p/>
@@ -2413,31 +3436,115 @@
         <w:ind w:firstLine="709"/>
       </w:pPr>
       <w:r>
-        <w:t>Para evaluar correctamente el desempeno de los modelos, el dataset se dividio en dos conjuntos mutuamente excluyentes: uno de entrenamiento y otro de prueba. El conjunto de entrenamiento se utiliza para que el modelo aprenda las relaciones entre las variables, mientras que el conjunto de prueba se reserva para evaluar que tan bien generaliza ese aprendizaje a datos no vistos.</w:t>
-      </w:r>
-    </w:p>
-    <w:p>
-      <w:pPr>
-        <w:ind w:firstLine="709"/>
-      </w:pPr>
-      <w:r>
-        <w:t>Se empleo la funcion train_test_split de la biblioteca scikit-learn, con una proporcion 80/20 y el parametro random_state=42 para garantizar la reproducibilidad de los resultados. La division resultante fue:</w:t>
-      </w:r>
-    </w:p>
-    <w:p>
-      <w:pPr>
-        <w:ind w:firstLine="709"/>
-      </w:pPr>
-      <w:r>
-        <w:t xml:space="preserve">   - Entrenamiento: 158,680 registros (80%)</w:t>
-      </w:r>
-    </w:p>
-    <w:p>
-      <w:pPr>
-        <w:ind w:firstLine="709"/>
-      </w:pPr>
-      <w:r>
-        <w:t xml:space="preserve">   - Prueba: 39,671 registros (20%)</w:t>
+        <w:t>El dataset se dividio en 80% entrenamiento y 20% prueba con random_state=42 para reproducibilidad.</w:t>
+      </w:r>
+    </w:p>
+    <w:p/>
+    <w:p>
+      <w:pPr>
+        <w:ind w:left="709"/>
+      </w:pPr>
+      <w:r>
+        <w:rPr>
+          <w:rFonts w:ascii="Courier New" w:hAnsi="Courier New"/>
+          <w:color w:val="333333"/>
+          <w:sz w:val="16"/>
+        </w:rPr>
+        <w:t>from sklearn.model_selection import train_test_split</w:t>
+      </w:r>
+    </w:p>
+    <w:p>
+      <w:pPr>
+        <w:ind w:left="709"/>
+      </w:pPr>
+      <w:r>
+        <w:rPr>
+          <w:rFonts w:ascii="Courier New" w:hAnsi="Courier New"/>
+          <w:color w:val="333333"/>
+          <w:sz w:val="16"/>
+        </w:rPr>
+        <w:t>y_reg = df['Precio Unit.'].values</w:t>
+      </w:r>
+    </w:p>
+    <w:p>
+      <w:pPr>
+        <w:ind w:left="709"/>
+      </w:pPr>
+      <w:r>
+        <w:rPr>
+          <w:rFonts w:ascii="Courier New" w:hAnsi="Courier New"/>
+          <w:color w:val="333333"/>
+          <w:sz w:val="16"/>
+        </w:rPr>
+        <w:t>y_clf = df['Precio_Alto'].values</w:t>
+      </w:r>
+    </w:p>
+    <w:p>
+      <w:pPr>
+        <w:ind w:left="709"/>
+      </w:pPr>
+      <w:r>
+        <w:rPr>
+          <w:rFonts w:ascii="Courier New" w:hAnsi="Courier New"/>
+          <w:color w:val="333333"/>
+          <w:sz w:val="16"/>
+        </w:rPr>
+        <w:t>X_tr,X_te,yr_tr,yr_te,yc_tr,yc_te = train_test_split(</w:t>
+      </w:r>
+    </w:p>
+    <w:p>
+      <w:pPr>
+        <w:ind w:left="709"/>
+      </w:pPr>
+      <w:r>
+        <w:rPr>
+          <w:rFonts w:ascii="Courier New" w:hAnsi="Courier New"/>
+          <w:color w:val="333333"/>
+          <w:sz w:val="16"/>
+        </w:rPr>
+        <w:t xml:space="preserve">    X, y_reg, y_clf, test_size=0.2, random_state=42)</w:t>
+      </w:r>
+    </w:p>
+    <w:p>
+      <w:pPr>
+        <w:ind w:left="709"/>
+      </w:pPr>
+      <w:r>
+        <w:rPr>
+          <w:rFonts w:ascii="Courier New" w:hAnsi="Courier New"/>
+          <w:color w:val="333333"/>
+          <w:sz w:val="16"/>
+        </w:rPr>
+        <w:t>print(f'Train: {len(X_tr):,} | Test: {len(X_te):,}')</w:t>
+      </w:r>
+    </w:p>
+    <w:p/>
+    <w:p>
+      <w:pPr>
+        <w:ind w:left="709"/>
+      </w:pPr>
+      <w:r>
+        <w:rPr>
+          <w:rFonts w:ascii="Courier New" w:hAnsi="Courier New"/>
+          <w:i/>
+          <w:color w:val="006600"/>
+          <w:sz w:val="16"/>
+        </w:rPr>
+        <w:t>Train: 158,680 | Test: 39,671</w:t>
+      </w:r>
+    </w:p>
+    <w:p>
+      <w:pPr>
+        <w:ind w:left="709"/>
+      </w:pPr>
+      <w:r>
+        <w:rPr>
+          <w:rFonts w:ascii="Courier New" w:hAnsi="Courier New"/>
+          <w:i/>
+          <w:color w:val="006600"/>
+          <w:sz w:val="16"/>
+        </w:rPr>
+        <w:t>Features: ['Tipo', 'Nombre de producto', 'Fabricante', 'Farmacia/Botica', 'Departamento']</w:t>
       </w:r>
     </w:p>
     <w:p/>
@@ -2465,26 +3572,71 @@
         <w:ind w:firstLine="709"/>
       </w:pPr>
       <w:r>
-        <w:t>Se utilizo la clase LinearRegression de scikit-learn. Este modelo busca ajustar una ecuacion lineal de la forma:</w:t>
-      </w:r>
-    </w:p>
+        <w:t>Se entreno un modelo LinearRegression de scikit-learn sobre los datos de entrenamiento.</w:t>
+      </w:r>
+    </w:p>
+    <w:p/>
+    <w:p>
+      <w:pPr>
+        <w:ind w:left="709"/>
+      </w:pPr>
+      <w:r>
+        <w:rPr>
+          <w:rFonts w:ascii="Courier New" w:hAnsi="Courier New"/>
+          <w:color w:val="333333"/>
+          <w:sz w:val="16"/>
+        </w:rPr>
+        <w:t>from sklearn.linear_model import LinearRegression</w:t>
+      </w:r>
+    </w:p>
+    <w:p>
+      <w:pPr>
+        <w:ind w:left="709"/>
+      </w:pPr>
+      <w:r>
+        <w:rPr>
+          <w:rFonts w:ascii="Courier New" w:hAnsi="Courier New"/>
+          <w:color w:val="333333"/>
+          <w:sz w:val="16"/>
+        </w:rPr>
+        <w:t>lr = LinearRegression()</w:t>
+      </w:r>
+    </w:p>
+    <w:p>
+      <w:pPr>
+        <w:ind w:left="709"/>
+      </w:pPr>
+      <w:r>
+        <w:rPr>
+          <w:rFonts w:ascii="Courier New" w:hAnsi="Courier New"/>
+          <w:color w:val="333333"/>
+          <w:sz w:val="16"/>
+        </w:rPr>
+        <w:t>lr.fit(X_tr, yr_tr)</w:t>
+      </w:r>
+    </w:p>
+    <w:p>
+      <w:pPr>
+        <w:ind w:left="709"/>
+      </w:pPr>
+      <w:r>
+        <w:rPr>
+          <w:rFonts w:ascii="Courier New" w:hAnsi="Courier New"/>
+          <w:color w:val="333333"/>
+          <w:sz w:val="16"/>
+        </w:rPr>
+        <w:t>yp = lr.predict(X_te)</w:t>
+      </w:r>
+    </w:p>
+    <w:p/>
     <w:p>
       <w:pPr>
         <w:ind w:firstLine="709"/>
       </w:pPr>
       <w:r>
-        <w:t xml:space="preserve">   PRECIO = B0 + B1*TIPO + B2*PRODUCTO + B3*FABRICANTE + B4*FARMACIA + B5*DEPARTAMENTO</w:t>
-      </w:r>
-    </w:p>
-    <w:p>
-      <w:pPr>
-        <w:ind w:firstLine="709"/>
-      </w:pPr>
-      <w:r>
-        <w:t>Donde B0 es el intercepto y B1 a B5 son los coeficientes que el modelo estima automaticamente mediante el metodo de minimos cuadrados ordinarios, minimizando la suma de los errores al cuadrado entre los precios reales y los predichos. El modelo fue entrenado sobre los 158,680 registros del conjunto de entrenamiento.</w:t>
-      </w:r>
-    </w:p>
-    <w:p/>
+        <w:t>El modelo ajusta una ecuacion de la forma: PRECIO = B0 + B1*TIPO + B2*PRODUCTO + B3*FABRICANTE + B4*FARMACIA + B5*DEPARTAMENTO, minimizando el error cuadratico medio.</w:t>
+      </w:r>
+    </w:p>
     <w:p>
       <w:r>
         <w:rPr>
@@ -2499,17 +3651,63 @@
         <w:ind w:firstLine="709"/>
       </w:pPr>
       <w:r>
-        <w:t>Se utilizo la clase LogisticRegression de scikit-learn con el parametro max_iter=2000 para asegurar la convergencia del algoritmo. A diferencia de la regresion lineal, este modelo no predice un valor numerico directamente, sino que estima la probabilidad de que una observacion pertenezca a la clase positiva (PRECIO_ALTO = 1).</w:t>
-      </w:r>
-    </w:p>
-    <w:p>
-      <w:pPr>
-        <w:ind w:firstLine="709"/>
-      </w:pPr>
-      <w:r>
-        <w:t>La probabilidad se calcula mediante la funcion sigmoide, que transforma la combinacion lineal de las variables predictoras en un valor entre 0 y 1. Si la probabilidad resultante supera el umbral de 0.5, la observacion se clasifica como 'precio alto'; en caso contrario, como 'precio bajo'.</w:t>
-      </w:r>
-    </w:p>
+        <w:t>Se entreno un modelo LogisticRegression con max_iter=2000 para clasificar precios altos/bajos.</w:t>
+      </w:r>
+    </w:p>
+    <w:p/>
+    <w:p>
+      <w:pPr>
+        <w:ind w:left="709"/>
+      </w:pPr>
+      <w:r>
+        <w:rPr>
+          <w:rFonts w:ascii="Courier New" w:hAnsi="Courier New"/>
+          <w:color w:val="333333"/>
+          <w:sz w:val="16"/>
+        </w:rPr>
+        <w:t>from sklearn.linear_model import LogisticRegression</w:t>
+      </w:r>
+    </w:p>
+    <w:p>
+      <w:pPr>
+        <w:ind w:left="709"/>
+      </w:pPr>
+      <w:r>
+        <w:rPr>
+          <w:rFonts w:ascii="Courier New" w:hAnsi="Courier New"/>
+          <w:color w:val="333333"/>
+          <w:sz w:val="16"/>
+        </w:rPr>
+        <w:t>log = LogisticRegression(max_iter=2000, random_state=42)</w:t>
+      </w:r>
+    </w:p>
+    <w:p>
+      <w:pPr>
+        <w:ind w:left="709"/>
+      </w:pPr>
+      <w:r>
+        <w:rPr>
+          <w:rFonts w:ascii="Courier New" w:hAnsi="Courier New"/>
+          <w:color w:val="333333"/>
+          <w:sz w:val="16"/>
+        </w:rPr>
+        <w:t>log.fit(X_tr, yc_tr)</w:t>
+      </w:r>
+    </w:p>
+    <w:p>
+      <w:pPr>
+        <w:ind w:left="709"/>
+      </w:pPr>
+      <w:r>
+        <w:rPr>
+          <w:rFonts w:ascii="Courier New" w:hAnsi="Courier New"/>
+          <w:color w:val="333333"/>
+          <w:sz w:val="16"/>
+        </w:rPr>
+        <w:t>ypc = log.predict(X_te)</w:t>
+      </w:r>
+    </w:p>
+    <w:p/>
     <w:p>
       <w:pPr>
         <w:ind w:firstLine="709"/>
@@ -2522,7 +3720,7 @@
         <w:t xml:space="preserve">[JUSTIFICACION - Pertinencia de ambos modelos]: </w:t>
       </w:r>
       <w:r>
-        <w:t>Se emplearon ambos tipos de regresion porque responden a preguntas de distinta naturaleza. La regresion lineal aborda un problema de prediccion numerica: estimar el precio exacto en soles. La regresion logistica aborda un problema de clasificacion: determinar si un precio es alto o bajo respecto al mercado. La segunda pregunta es inherentemente mas facil de responder, por lo que se espera un mejor desempeno relativo en terminos de metricas de clasificacion.</w:t>
+        <w:t>La regresion lineal intenta predecir el precio exacto en soles (problema dificil). La regresion logistica solo clasifica si es caro o barato (problema mas facil). Responden preguntas distintas y complementarias.</w:t>
       </w:r>
     </w:p>
     <w:p/>
@@ -2545,60 +3743,219 @@
         <w:t>4.8.1 Metricas de regresion lineal</w:t>
       </w:r>
     </w:p>
+    <w:p/>
+    <w:p>
+      <w:pPr>
+        <w:ind w:left="709"/>
+      </w:pPr>
+      <w:r>
+        <w:rPr>
+          <w:rFonts w:ascii="Courier New" w:hAnsi="Courier New"/>
+          <w:color w:val="333333"/>
+          <w:sz w:val="16"/>
+        </w:rPr>
+        <w:t>from sklearn.metrics import mean_squared_error, mean_absolute_error, r2_score</w:t>
+      </w:r>
+    </w:p>
+    <w:p>
+      <w:pPr>
+        <w:ind w:left="709"/>
+      </w:pPr>
+      <w:r>
+        <w:rPr>
+          <w:rFonts w:ascii="Courier New" w:hAnsi="Courier New"/>
+          <w:color w:val="333333"/>
+          <w:sz w:val="16"/>
+        </w:rPr>
+        <w:t>import numpy as np</w:t>
+      </w:r>
+    </w:p>
+    <w:p>
+      <w:pPr>
+        <w:ind w:left="709"/>
+      </w:pPr>
+      <w:r>
+        <w:rPr>
+          <w:rFonts w:ascii="Courier New" w:hAnsi="Courier New"/>
+          <w:color w:val="333333"/>
+          <w:sz w:val="16"/>
+        </w:rPr>
+        <w:t>rmse = np.sqrt(mean_squared_error(yr_te, yp))</w:t>
+      </w:r>
+    </w:p>
+    <w:p>
+      <w:pPr>
+        <w:ind w:left="709"/>
+      </w:pPr>
+      <w:r>
+        <w:rPr>
+          <w:rFonts w:ascii="Courier New" w:hAnsi="Courier New"/>
+          <w:color w:val="333333"/>
+          <w:sz w:val="16"/>
+        </w:rPr>
+        <w:t>mae = mean_absolute_error(yr_te, yp)</w:t>
+      </w:r>
+    </w:p>
+    <w:p>
+      <w:pPr>
+        <w:ind w:left="709"/>
+      </w:pPr>
+      <w:r>
+        <w:rPr>
+          <w:rFonts w:ascii="Courier New" w:hAnsi="Courier New"/>
+          <w:color w:val="333333"/>
+          <w:sz w:val="16"/>
+        </w:rPr>
+        <w:t>r2 = r2_score(yr_te, yp)</w:t>
+      </w:r>
+    </w:p>
+    <w:p/>
+    <w:p>
+      <w:pPr>
+        <w:ind w:left="709"/>
+      </w:pPr>
+      <w:r>
+        <w:rPr>
+          <w:rFonts w:ascii="Courier New" w:hAnsi="Courier New"/>
+          <w:i/>
+          <w:color w:val="006600"/>
+          <w:sz w:val="16"/>
+        </w:rPr>
+        <w:t>RMSE: 65.4128</w:t>
+      </w:r>
+    </w:p>
+    <w:p>
+      <w:pPr>
+        <w:ind w:left="709"/>
+      </w:pPr>
+      <w:r>
+        <w:rPr>
+          <w:rFonts w:ascii="Courier New" w:hAnsi="Courier New"/>
+          <w:i/>
+          <w:color w:val="006600"/>
+          <w:sz w:val="16"/>
+        </w:rPr>
+        <w:t>MAE:  2.3581</w:t>
+      </w:r>
+    </w:p>
+    <w:p>
+      <w:pPr>
+        <w:ind w:left="709"/>
+      </w:pPr>
+      <w:r>
+        <w:rPr>
+          <w:rFonts w:ascii="Courier New" w:hAnsi="Courier New"/>
+          <w:i/>
+          <w:color w:val="006600"/>
+          <w:sz w:val="16"/>
+        </w:rPr>
+        <w:t>R2:   0.0016 (0.2%)</w:t>
+      </w:r>
+    </w:p>
+    <w:p>
+      <w:pPr>
+        <w:ind w:left="709"/>
+      </w:pPr>
+      <w:r>
+        <w:rPr>
+          <w:rFonts w:ascii="Courier New" w:hAnsi="Courier New"/>
+          <w:i/>
+          <w:color w:val="006600"/>
+          <w:sz w:val="16"/>
+        </w:rPr>
+      </w:r>
+    </w:p>
+    <w:p>
+      <w:pPr>
+        <w:ind w:left="709"/>
+      </w:pPr>
+      <w:r>
+        <w:rPr>
+          <w:rFonts w:ascii="Courier New" w:hAnsi="Courier New"/>
+          <w:i/>
+          <w:color w:val="006600"/>
+          <w:sz w:val="16"/>
+        </w:rPr>
+        <w:t>Importancia (|coeficiente|):</w:t>
+      </w:r>
+    </w:p>
+    <w:p>
+      <w:pPr>
+        <w:ind w:left="709"/>
+      </w:pPr>
+      <w:r>
+        <w:rPr>
+          <w:rFonts w:ascii="Courier New" w:hAnsi="Courier New"/>
+          <w:i/>
+          <w:color w:val="006600"/>
+          <w:sz w:val="16"/>
+        </w:rPr>
+        <w:t xml:space="preserve">  Tipo                     : +9.5684</w:t>
+      </w:r>
+    </w:p>
+    <w:p>
+      <w:pPr>
+        <w:ind w:left="709"/>
+      </w:pPr>
+      <w:r>
+        <w:rPr>
+          <w:rFonts w:ascii="Courier New" w:hAnsi="Courier New"/>
+          <w:i/>
+          <w:color w:val="006600"/>
+          <w:sz w:val="16"/>
+        </w:rPr>
+        <w:t xml:space="preserve">  Departamento             : -0.0134</w:t>
+      </w:r>
+    </w:p>
+    <w:p>
+      <w:pPr>
+        <w:ind w:left="709"/>
+      </w:pPr>
+      <w:r>
+        <w:rPr>
+          <w:rFonts w:ascii="Courier New" w:hAnsi="Courier New"/>
+          <w:i/>
+          <w:color w:val="006600"/>
+          <w:sz w:val="16"/>
+        </w:rPr>
+        <w:t xml:space="preserve">  Nombre de producto       : +0.0094</w:t>
+      </w:r>
+    </w:p>
+    <w:p>
+      <w:pPr>
+        <w:ind w:left="709"/>
+      </w:pPr>
+      <w:r>
+        <w:rPr>
+          <w:rFonts w:ascii="Courier New" w:hAnsi="Courier New"/>
+          <w:i/>
+          <w:color w:val="006600"/>
+          <w:sz w:val="16"/>
+        </w:rPr>
+        <w:t xml:space="preserve">  Fabricante               : +0.0004</w:t>
+      </w:r>
+    </w:p>
+    <w:p>
+      <w:pPr>
+        <w:ind w:left="709"/>
+      </w:pPr>
+      <w:r>
+        <w:rPr>
+          <w:rFonts w:ascii="Courier New" w:hAnsi="Courier New"/>
+          <w:i/>
+          <w:color w:val="006600"/>
+          <w:sz w:val="16"/>
+        </w:rPr>
+        <w:t xml:space="preserve">  Farmacia/Botica          : +0.0000</w:t>
+      </w:r>
+    </w:p>
+    <w:p/>
     <w:p>
       <w:pPr>
         <w:ind w:firstLine="709"/>
       </w:pPr>
       <w:r>
-        <w:t xml:space="preserve">   - RMSE (Root Mean Squared Error): 65.4128</w:t>
-      </w:r>
-    </w:p>
-    <w:p>
-      <w:pPr>
-        <w:ind w:firstLine="709"/>
-      </w:pPr>
-      <w:r>
-        <w:t xml:space="preserve">   - MAE (Mean Absolute Error): 2.3581</w:t>
-      </w:r>
-    </w:p>
-    <w:p>
-      <w:pPr>
-        <w:ind w:firstLine="709"/>
-      </w:pPr>
-      <w:r>
-        <w:t xml:space="preserve">   - R2 (Coeficiente de determinacion): 0.0016 (0.2%)</w:t>
-      </w:r>
-    </w:p>
-    <w:p>
-      <w:pPr>
-        <w:ind w:firstLine="709"/>
-      </w:pPr>
-      <w:r>
-        <w:t>Interpretacion de las metricas:</w:t>
-      </w:r>
-    </w:p>
-    <w:p>
-      <w:pPr>
-        <w:ind w:firstLine="709"/>
-      </w:pPr>
-      <w:r>
-        <w:t>El RMSE mide el error de prediccion en las mismas unidades de la variable objetivo (soles). Un valor de 65.41 puede parecer elevado, pero debe contextualizarse considerando que el rango de precios abarca desde centimos hasta miles de soles. Un error de esta magnitud es proporcionalmente menor en medicamentos caros y mayor en los mas economicos.</w:t>
-      </w:r>
-    </w:p>
-    <w:p>
-      <w:pPr>
-        <w:ind w:firstLine="709"/>
-      </w:pPr>
-      <w:r>
-        <w:t>El MAE es una metrica mas intuitiva y robusta que el RMSE, ya que no eleva los errores al cuadrado. Un MAE de 2.36 indica que, en promedio, el modelo se equivoca por aproximadamente S/2.36 en cada prediccion. Para medicamentos cuyo precio ronda entre S/1 y S/3, este margen de error es significativo.</w:t>
-      </w:r>
-    </w:p>
-    <w:p>
-      <w:pPr>
-        <w:ind w:firstLine="709"/>
-      </w:pPr>
-      <w:r>
-        <w:t>El R2 de 0.0016 indica que las variables predictoras, en su forma lineal actual, explican solo el 0.2% de la variabilidad del precio. Este resultado, si bien es bajo, no debe interpretarse como un fracaso del modelo, sino como una manifestacion de la complejidad del problema: el precio de un medicamento depende de factores economicos, regulatorios y comerciales que no estan capturados en las variables disponibles (costo de insumos, patentes, tipo de cambio, margenes de distribucion, etc.).</w:t>
+        <w:t>RMSE de 65.41: error tipico en soles. MAE de 2.36: en promedio, el modelo se equivoca por S/2.36. R2 de 0.0016: las variables explican solo el 0.2% de la varianza. La variable mas influyente es TIPO (+9.57), lo cual es logico: si es PUBLICO (medicamento de hospital) el precio se dispara.</w:t>
       </w:r>
     </w:p>
     <w:p>
@@ -2610,10 +3967,10 @@
           <w:b/>
           <w:color w:val="003399"/>
         </w:rPr>
-        <w:t xml:space="preserve">[JUSTIFICACION - Interpretacion del R2]: </w:t>
-      </w:r>
-      <w:r>
-        <w:t>Un R2 cercano a cero en un problema con datos reales no es inusual. Indica que el modelo lineal no es suficiente para capturar las relaciones subyacentes, y que se requieren enfoques mas sofisticados (modelos no lineales, mas variables predictoras, transformaciones de los datos). Esto constituye un aprendizaje valioso sobre las limitaciones de la regresion lineal en contextos reales.</w:t>
+        <w:t xml:space="preserve">[JUSTIFICACION - R2 bajo: no es un fracaso]: </w:t>
+      </w:r>
+      <w:r>
+        <w:t>El precio de un medicamento depende de factores economicos, regulatorios y logisticos no incluidos en el modelo. Un R2 bajo en datos reales con alta dispersion es un resultado esperable y una leccion sobre las limitaciones de los modelos lineales.</w:t>
       </w:r>
     </w:p>
     <w:p/>
@@ -2626,110 +3983,217 @@
         <w:t>4.8.2 Metricas de regresion logistica</w:t>
       </w:r>
     </w:p>
+    <w:p/>
+    <w:p>
+      <w:pPr>
+        <w:ind w:left="709"/>
+      </w:pPr>
+      <w:r>
+        <w:rPr>
+          <w:rFonts w:ascii="Courier New" w:hAnsi="Courier New"/>
+          <w:color w:val="333333"/>
+          <w:sz w:val="16"/>
+        </w:rPr>
+        <w:t>from sklearn.metrics import accuracy_score, precision_score,</w:t>
+      </w:r>
+    </w:p>
+    <w:p>
+      <w:pPr>
+        <w:ind w:left="709"/>
+      </w:pPr>
+      <w:r>
+        <w:rPr>
+          <w:rFonts w:ascii="Courier New" w:hAnsi="Courier New"/>
+          <w:color w:val="333333"/>
+          <w:sz w:val="16"/>
+        </w:rPr>
+        <w:t xml:space="preserve">    recall_score, f1_score, confusion_matrix</w:t>
+      </w:r>
+    </w:p>
+    <w:p>
+      <w:pPr>
+        <w:ind w:left="709"/>
+      </w:pPr>
+      <w:r>
+        <w:rPr>
+          <w:rFonts w:ascii="Courier New" w:hAnsi="Courier New"/>
+          <w:color w:val="333333"/>
+          <w:sz w:val="16"/>
+        </w:rPr>
+        <w:t>acc = accuracy_score(yc_te, ypc)</w:t>
+      </w:r>
+    </w:p>
+    <w:p>
+      <w:pPr>
+        <w:ind w:left="709"/>
+      </w:pPr>
+      <w:r>
+        <w:rPr>
+          <w:rFonts w:ascii="Courier New" w:hAnsi="Courier New"/>
+          <w:color w:val="333333"/>
+          <w:sz w:val="16"/>
+        </w:rPr>
+        <w:t>prec = precision_score(yc_te, ypc, zero_division=0)</w:t>
+      </w:r>
+    </w:p>
+    <w:p>
+      <w:pPr>
+        <w:ind w:left="709"/>
+      </w:pPr>
+      <w:r>
+        <w:rPr>
+          <w:rFonts w:ascii="Courier New" w:hAnsi="Courier New"/>
+          <w:color w:val="333333"/>
+          <w:sz w:val="16"/>
+        </w:rPr>
+        <w:t>rec = recall_score(yc_te, ypc, zero_division=0)</w:t>
+      </w:r>
+    </w:p>
+    <w:p>
+      <w:pPr>
+        <w:ind w:left="709"/>
+      </w:pPr>
+      <w:r>
+        <w:rPr>
+          <w:rFonts w:ascii="Courier New" w:hAnsi="Courier New"/>
+          <w:color w:val="333333"/>
+          <w:sz w:val="16"/>
+        </w:rPr>
+        <w:t>f1 = f1_score(yc_te, ypc, zero_division=0)</w:t>
+      </w:r>
+    </w:p>
+    <w:p>
+      <w:pPr>
+        <w:ind w:left="709"/>
+      </w:pPr>
+      <w:r>
+        <w:rPr>
+          <w:rFonts w:ascii="Courier New" w:hAnsi="Courier New"/>
+          <w:color w:val="333333"/>
+          <w:sz w:val="16"/>
+        </w:rPr>
+        <w:t>cm = confusion_matrix(yc_te, ypc)</w:t>
+      </w:r>
+    </w:p>
+    <w:p/>
+    <w:p>
+      <w:pPr>
+        <w:ind w:left="709"/>
+      </w:pPr>
+      <w:r>
+        <w:rPr>
+          <w:rFonts w:ascii="Courier New" w:hAnsi="Courier New"/>
+          <w:i/>
+          <w:color w:val="006600"/>
+          <w:sz w:val="16"/>
+        </w:rPr>
+        <w:t>Accuracy:  0.5466 (54.7%)</w:t>
+      </w:r>
+    </w:p>
+    <w:p>
+      <w:pPr>
+        <w:ind w:left="709"/>
+      </w:pPr>
+      <w:r>
+        <w:rPr>
+          <w:rFonts w:ascii="Courier New" w:hAnsi="Courier New"/>
+          <w:i/>
+          <w:color w:val="006600"/>
+          <w:sz w:val="16"/>
+        </w:rPr>
+        <w:t>Precision: 0.5456</w:t>
+      </w:r>
+    </w:p>
+    <w:p>
+      <w:pPr>
+        <w:ind w:left="709"/>
+      </w:pPr>
+      <w:r>
+        <w:rPr>
+          <w:rFonts w:ascii="Courier New" w:hAnsi="Courier New"/>
+          <w:i/>
+          <w:color w:val="006600"/>
+          <w:sz w:val="16"/>
+        </w:rPr>
+        <w:t>Recall:    0.4317</w:t>
+      </w:r>
+    </w:p>
+    <w:p>
+      <w:pPr>
+        <w:ind w:left="709"/>
+      </w:pPr>
+      <w:r>
+        <w:rPr>
+          <w:rFonts w:ascii="Courier New" w:hAnsi="Courier New"/>
+          <w:i/>
+          <w:color w:val="006600"/>
+          <w:sz w:val="16"/>
+        </w:rPr>
+        <w:t>F1-Score:  0.4820</w:t>
+      </w:r>
+    </w:p>
+    <w:p>
+      <w:pPr>
+        <w:ind w:left="709"/>
+      </w:pPr>
+      <w:r>
+        <w:rPr>
+          <w:rFonts w:ascii="Courier New" w:hAnsi="Courier New"/>
+          <w:i/>
+          <w:color w:val="006600"/>
+          <w:sz w:val="16"/>
+        </w:rPr>
+      </w:r>
+    </w:p>
+    <w:p>
+      <w:pPr>
+        <w:ind w:left="709"/>
+      </w:pPr>
+      <w:r>
+        <w:rPr>
+          <w:rFonts w:ascii="Courier New" w:hAnsi="Courier New"/>
+          <w:i/>
+          <w:color w:val="006600"/>
+          <w:sz w:val="16"/>
+        </w:rPr>
+        <w:t>Matriz de confusion:</w:t>
+      </w:r>
+    </w:p>
+    <w:p>
+      <w:pPr>
+        <w:ind w:left="709"/>
+      </w:pPr>
+      <w:r>
+        <w:rPr>
+          <w:rFonts w:ascii="Courier New" w:hAnsi="Courier New"/>
+          <w:i/>
+          <w:color w:val="006600"/>
+          <w:sz w:val="16"/>
+        </w:rPr>
+        <w:t xml:space="preserve">  VP=8,369  FP=6,971</w:t>
+      </w:r>
+    </w:p>
+    <w:p>
+      <w:pPr>
+        <w:ind w:left="709"/>
+      </w:pPr>
+      <w:r>
+        <w:rPr>
+          <w:rFonts w:ascii="Courier New" w:hAnsi="Courier New"/>
+          <w:i/>
+          <w:color w:val="006600"/>
+          <w:sz w:val="16"/>
+        </w:rPr>
+        <w:t xml:space="preserve">  FN=11,016  VN=13,315</w:t>
+      </w:r>
+    </w:p>
+    <w:p/>
     <w:p>
       <w:pPr>
         <w:ind w:firstLine="709"/>
       </w:pPr>
       <w:r>
-        <w:t xml:space="preserve">   - Accuracy: 0.5466 (54.7%)</w:t>
-      </w:r>
-    </w:p>
-    <w:p>
-      <w:pPr>
-        <w:ind w:firstLine="709"/>
-      </w:pPr>
-      <w:r>
-        <w:t xml:space="preserve">   - Precision: 0.5456</w:t>
-      </w:r>
-    </w:p>
-    <w:p>
-      <w:pPr>
-        <w:ind w:firstLine="709"/>
-      </w:pPr>
-      <w:r>
-        <w:t xml:space="preserve">   - Recall: 0.4317</w:t>
-      </w:r>
-    </w:p>
-    <w:p>
-      <w:pPr>
-        <w:ind w:firstLine="709"/>
-      </w:pPr>
-      <w:r>
-        <w:t xml:space="preserve">   - F1-Score: 0.4820</w:t>
-      </w:r>
-    </w:p>
-    <w:p/>
-    <w:p>
-      <w:pPr>
-        <w:ind w:firstLine="709"/>
-      </w:pPr>
-      <w:r>
-        <w:t>Interpretacion de las metricas de clasificacion:</w:t>
-      </w:r>
-    </w:p>
-    <w:p>
-      <w:pPr>
-        <w:ind w:firstLine="709"/>
-      </w:pPr>
-      <w:r>
-        <w:t>El accuracy de 54.7% indica que el modelo acierta en poco mas de la mitad de los casos. Si bien supera el 50% del azar, el margen es estrecho. Esto sugiere que las variables TIPO, PRODUCTO, FABRICANTE, FARMACIA y DEPARTAMENTO contienen cierta informacion util para distinguir precios altos de bajos, pero la senal es debil.</w:t>
-      </w:r>
-    </w:p>
-    <w:p>
-      <w:pPr>
-        <w:ind w:firstLine="709"/>
-      </w:pPr>
-      <w:r>
-        <w:t>La precision de 0.5456 indica que, cuando el modelo predice que un medicamento es caro, acierta aproximadamente el 55% de las veces. El recall de 0.4317, mas bajo, indica que el modelo deja de detectar una proporcion importante de los precios realmente altos, clasificandolos erroneamente como bajos. Esto describe un modelo conservador que prefiere equivocarse por omision antes que por exceso.</w:t>
-      </w:r>
-    </w:p>
-    <w:p/>
-    <w:p>
-      <w:pPr>
-        <w:ind w:firstLine="709"/>
-      </w:pPr>
-      <w:r>
-        <w:t>Matriz de confusion:</w:t>
-      </w:r>
-    </w:p>
-    <w:p>
-      <w:pPr>
-        <w:ind w:firstLine="709"/>
-      </w:pPr>
-      <w:r>
-        <w:t xml:space="preserve">   - Verdaderos Positivos (predijo alto, era alto):      8,369</w:t>
-      </w:r>
-    </w:p>
-    <w:p>
-      <w:pPr>
-        <w:ind w:firstLine="709"/>
-      </w:pPr>
-      <w:r>
-        <w:t xml:space="preserve">   - Falsos Positivos (predijo alto, era bajo):          6,971</w:t>
-      </w:r>
-    </w:p>
-    <w:p>
-      <w:pPr>
-        <w:ind w:firstLine="709"/>
-      </w:pPr>
-      <w:r>
-        <w:t xml:space="preserve">   - Falsos Negativos (predijo bajo, era alto):         11,016</w:t>
-      </w:r>
-    </w:p>
-    <w:p>
-      <w:pPr>
-        <w:ind w:firstLine="709"/>
-      </w:pPr>
-      <w:r>
-        <w:t xml:space="preserve">   - Verdaderos Negativos (predijo bajo, era bajo):     13,315</w:t>
-      </w:r>
-    </w:p>
-    <w:p>
-      <w:pPr>
-        <w:ind w:firstLine="709"/>
-      </w:pPr>
-      <w:r>
-        <w:t>La matriz de confusion confirma la tendencia conservadora del modelo: los verdaderos negativos (13,315) superan ampliamente a los verdaderos positivos (8,369), lo que indica que el modelo se inclina hacia la prediccion de 'precio bajo' en casos de incertidumbre. El F1-score de 0.4820 refleja el equilibrio entre precision y recall.</w:t>
+        <w:t>Accuracy de 54.7%: el modelo acierta en poco mas de la mitad de los casos, superando el 50% del azar. Precision de 0.5456: cuando dice 'caro', acierta el 55% de las veces. Recall de 0.4317: detecta el 43% de los precios realmente altos. El modelo es conservador: prefiere decir 'barato' cuando duda (13,315 VN vs 8,369 VP).</w:t>
       </w:r>
     </w:p>
     <w:p>
@@ -2752,7 +4216,7 @@
         <w:ind w:firstLine="709"/>
       </w:pPr>
       <w:r>
-        <w:t>1. Los objetivos planteados fueron alcanzados. Se construyeron, entrenaron y evaluaron exitosamente un modelo de regresion lineal multiple y un modelo de regresion logistica sobre datos reales de precios de medicamentos del mercado peruano, obtenidos del Observatorio de Precios de DIGEMID. Se completaron todas las etapas solicitadas en la actividad.</w:t>
+        <w:t>1. Los objetivos planteados fueron alcanzados. Se construyeron, entrenaron y evaluaron exitosamente un modelo de regresion lineal multiple y un modelo de regresion logistica sobre datos reales de precios de medicamentos del mercado peruano, obtenidos del Observatorio de Precios de DIGEMID y procesados en Google Colab. Se completaron todas las etapas solicitadas en la actividad.</w:t>
       </w:r>
     </w:p>
     <w:p>
@@ -2760,7 +4224,7 @@
         <w:ind w:firstLine="709"/>
       </w:pPr>
       <w:r>
-        <w:t>2. La principal dificultad del trabajo no residio en la aplicacion de los modelos, sino en la obtencion y preparacion de los datos. La Plataforma Nacional de Datos Abiertos no dispone del dataset de DIGEMID como un archivo descargable, por lo que fue necesario recurrir directamente al observatorio y recolectar los datos de forma manual. Esto constituye una experiencia real sobre los desafios que implica trabajar con datos abiertos del Estado peruano.</w:t>
+        <w:t>2. La principal dificultad del trabajo no residio en la aplicacion de los modelos, sino en la obtencion y preparacion de los datos. La Plataforma Nacional de Datos Abiertos no dispone del dataset de DIGEMID como un archivo descargable, por lo que fue necesario recurrir directamente al observatorio, recolectar los datos de forma manual y luego procesarlos en Colab. Esto constituye una experiencia real sobre los desafios de trabajar con datos abiertos del Estado peruano.</w:t>
       </w:r>
     </w:p>
     <w:p>
@@ -2768,7 +4232,7 @@
         <w:ind w:firstLine="709"/>
       </w:pPr>
       <w:r>
-        <w:t>3. El modelo de regresion lineal multiple presento limitaciones para predecir el precio exacto, obteniendo un R2 de 0.0016. Este resultado refleja que la relacion entre las variables categoricas disponibles y el precio no es adecuadamente capturada por un modelo lineal simple. No obstante, el ejercicio permitio comprender las limitaciones intrinsecas de este tipo de modelos frente a datos con alta dispersion y relaciones no lineales.</w:t>
+        <w:t>3. El modelo de regresion lineal multiple presento limitaciones para predecir el precio exacto (R2=0.0016). Este resultado refleja que la relacion entre las variables categoricas disponibles y el precio no es adecuadamente capturada por un modelo lineal simple. La variable mas influyente fue TIPO, lo cual es coherente con la realidad del mercado: los productos del sector publico tienen una estructura de precios muy diferente a la del sector privado.</w:t>
       </w:r>
     </w:p>
     <w:p>
@@ -2776,7 +4240,7 @@
         <w:ind w:firstLine="709"/>
       </w:pPr>
       <w:r>
-        <w:t>4. El modelo de regresion logistica mostro un desempeno modesto pero superior al azar, con un accuracy de 54.7%. Esto demuestra que las variables TIPO, DEPARTAMENTO y FABRICANTE contienen informacion util para clasificar precios, aunque la senal es limitada. El modelo resulto ser conservador, con tendencia a clasificar como 'precio bajo' en casos dudosos.</w:t>
+        <w:t>4. El modelo de regresion logistica mostro un desempeno modesto pero superior al azar, con un accuracy de 54.7%. Esto demuestra que las variables TIPO, DEPARTAMENTO y FABRICANTE contienen cierta informacion util para clasificar precios, aunque la senal es debida principalmente a la variable TIPO. El modelo resulto conservador, con tendencia a clasificar como 'precio bajo' en casos de incertidumbre.</w:t>
       </w:r>
     </w:p>
     <w:p>
@@ -2792,7 +4256,7 @@
         <w:ind w:firstLine="709"/>
       </w:pPr>
       <w:r>
-        <w:t xml:space="preserve">   - Comprension del flujo completo de un proyecto de machine learning supervisado: obtencion de datos, limpieza, transformacion, modelado y evaluacion.</w:t>
+        <w:t xml:space="preserve">   - Comprension del flujo completo de machine learning supervisado: datos -&gt; limpieza -&gt; encoding -&gt; split -&gt; modelo -&gt; metricas.</w:t>
       </w:r>
     </w:p>
     <w:p>
@@ -2800,7 +4264,7 @@
         <w:ind w:firstLine="709"/>
       </w:pPr>
       <w:r>
-        <w:t xml:space="preserve">   - Aplicacion practica de tecnicas de preprocesamiento en un contexto real: normalizacion de texto, encoding de variables categoricas, deteccion de outliers mediante IQR.</w:t>
+        <w:t xml:space="preserve">   - Aplicacion practica de tecnicas de preprocesamiento en un contexto real: normalizacion de texto, Label Encoding, deteccion de outliers mediante IQR, muestreo estratificado.</w:t>
       </w:r>
     </w:p>
     <w:p>
@@ -2808,7 +4272,7 @@
         <w:ind w:firstLine="709"/>
       </w:pPr>
       <w:r>
-        <w:t xml:space="preserve">   - Implementacion de dos tipos de regresion (lineal y logistica) y comprension de la diferencia entre predecir un valor numerico continuo y clasificar una categoria binaria.</w:t>
+        <w:t xml:space="preserve">   - Implementacion y comparacion de regresion lineal y logistica, entendiendo la diferencia entre predecir un valor continuo y clasificar una categoria binaria.</w:t>
       </w:r>
     </w:p>
     <w:p>
@@ -2816,7 +4280,7 @@
         <w:ind w:firstLine="709"/>
       </w:pPr>
       <w:r>
-        <w:t xml:space="preserve">   - Interpretacion de metricas de evaluacion (RMSE, MAE, R2, accuracy, precision, recall, F1-score y matriz de confusion) en el contexto especifico del problema.</w:t>
+        <w:t xml:space="preserve">   - Interpretacion de metricas (RMSE, MAE, R2, accuracy, precision, recall, F1, matriz de confusion) en el contexto del problema.</w:t>
       </w:r>
     </w:p>
     <w:p>
@@ -2824,7 +4288,7 @@
         <w:ind w:firstLine="709"/>
       </w:pPr>
       <w:r>
-        <w:t xml:space="preserve">   - Experiencia directa con las limitaciones de las plataformas de datos abiertos del gobierno: accesibilidad, formatos, ausencia de APIs y necesidad de recoleccion manual.</w:t>
+        <w:t xml:space="preserve">   - Experiencia directa con las limitaciones de las plataformas de datos abiertos del gobierno peruano.</w:t>
       </w:r>
     </w:p>
     <w:p>
@@ -2840,7 +4304,7 @@
         <w:ind w:firstLine="709"/>
       </w:pPr>
       <w:r>
-        <w:t xml:space="preserve">   - Incorporar variables adicionales como la concentracion exacta del principio activo (extraida del nombre del producto), la forma farmaceutica y la fecha de registro para capturar tendencias temporales.</w:t>
+        <w:t xml:space="preserve">   - Incorporar variables adicionales como la concentracion exacta y la forma farmaceutica, extraidas del nombre del producto.</w:t>
       </w:r>
     </w:p>
     <w:p>
@@ -2848,7 +4312,7 @@
         <w:ind w:firstLine="709"/>
       </w:pPr>
       <w:r>
-        <w:t xml:space="preserve">   - Aplicar One-Hot Encoding a las variables de baja cardinalidad (TIPO, DEPARTAMENTO) para eliminar el orden artificial introducido por Label Encoding.</w:t>
+        <w:t xml:space="preserve">   - Aplicar One-Hot Encoding a variables de baja cardinalidad (TIPO, DEPARTAMENTO).</w:t>
       </w:r>
     </w:p>
     <w:p>
@@ -2856,7 +4320,7 @@
         <w:ind w:firstLine="709"/>
       </w:pPr>
       <w:r>
-        <w:t xml:space="preserve">   - Explorar modelos no lineales como arboles de decision, Random Forest o Gradient Boosting, que suelen manejar mejor las relaciones complejas entre variables categoricas y el precio.</w:t>
+        <w:t xml:space="preserve">   - Explorar modelos no lineales como Random Forest o Gradient Boosting.</w:t>
       </w:r>
     </w:p>
     <w:p>
@@ -2864,7 +4328,7 @@
         <w:ind w:firstLine="709"/>
       </w:pPr>
       <w:r>
-        <w:t xml:space="preserve">   - Ampliar la muestra a un mayor numero de principios activos para aumentar la representatividad de los resultados.</w:t>
+        <w:t xml:space="preserve">   - Ampliar la muestra a un mayor numero de principios activos para aumentar la representatividad.</w:t>
       </w:r>
     </w:p>
     <w:p>
@@ -2896,7 +4360,7 @@
         <w:ind w:firstLine="709"/>
       </w:pPr>
       <w:r>
-        <w:t>[2] Direccion General de Medicamentos, Insumos y Drogas (DIGEMID), "Observatorio de Precios de Medicamentos", Ministerio de Salud del Peru. [En linea]. Disponible en: https://opm-digemid.minsa.gob.pe/</w:t>
+        <w:t>[2] DIGEMID - MINSA, "Observatorio de Precios de Medicamentos", [En linea]. Disponible en: https://opm-digemid.minsa.gob.pe/</w:t>
       </w:r>
     </w:p>
     <w:p/>
@@ -2905,7 +4369,7 @@
         <w:ind w:firstLine="709"/>
       </w:pPr>
       <w:r>
-        <w:t>[3] F. Pedregosa et al., "Scikit-learn: Machine Learning in Python", Journal of Machine Learning Research, vol. 12, pp. 2825-2830, 2011.</w:t>
+        <w:t>[3] F. Pedregosa et al., "Scikit-learn: Machine Learning in Python", JMLR, vol. 12, pp. 2825-2830, 2011.</w:t>
       </w:r>
     </w:p>
     <w:p/>
@@ -2914,7 +4378,7 @@
         <w:ind w:firstLine="709"/>
       </w:pPr>
       <w:r>
-        <w:t>[4] J. Brownlee, "Linear Regression for Machine Learning", Machine Learning Mastery, 2020. [En linea]. Disponible en: https://machinelearningmastery.com/linear-regression-for-machine-learning/</w:t>
+        <w:t>[4] J. Brownlee, "Linear Regression for Machine Learning", Machine Learning Mastery, 2020.</w:t>
       </w:r>
     </w:p>
     <w:p/>
@@ -2923,7 +4387,7 @@
         <w:ind w:firstLine="709"/>
       </w:pPr>
       <w:r>
-        <w:t>[5] J. Brownlee, "Logistic Regression for Machine Learning", Machine Learning Mastery, 2020. [En linea]. Disponible en: https://machinelearningmastery.com/logistic-regression-for-machine-learning/</w:t>
+        <w:t>[5] J. Brownlee, "Logistic Regression for Machine Learning", Machine Learning Mastery, 2020.</w:t>
       </w:r>
     </w:p>
     <w:p/>
@@ -2932,7 +4396,7 @@
         <w:ind w:firstLine="709"/>
       </w:pPr>
       <w:r>
-        <w:t>[6] W. McKinney, "Data Structures for Statistical Computing in Python", Proceedings of the 9th Python in Science Conference, pp. 51-56, 2010.</w:t>
+        <w:t>[6] W. McKinney, "Data Structures for Statistical Computing in Python", Proc. 9th Python in Science Conf., pp. 51-56, 2010.</w:t>
       </w:r>
     </w:p>
     <w:p/>
@@ -2941,7 +4405,7 @@
         <w:ind w:firstLine="709"/>
       </w:pPr>
       <w:r>
-        <w:t>[7] T. Hastie, R. Tibshirani y J. Friedman, The Elements of Statistical Learning: Data Mining, Inference, and Prediction, 2da ed. Nueva York: Springer, 2009.</w:t>
+        <w:t>[7] T. Hastie, R. Tibshirani, J. Friedman, "The Elements of Statistical Learning", 2da ed. Springer, 2009.</w:t>
       </w:r>
     </w:p>
     <w:p/>
@@ -2950,7 +4414,7 @@
         <w:ind w:firstLine="709"/>
       </w:pPr>
       <w:r>
-        <w:t>[8] D. C. Montgomery, E. A. Peck y G. G. Vining, Introduction to Linear Regression Analysis, 5ta ed. Nueva Jersey: Wiley, 2012.</w:t>
+        <w:t>[8] D. Montgomery, E. Peck, G. Vining, "Introduction to Linear Regression Analysis", 5ta ed. Wiley, 2012.</w:t>
       </w:r>
     </w:p>
     <w:p/>

</xml_diff>